<commit_message>
feat(mobile): initialize Flutter mobile application structure
</commit_message>
<xml_diff>
--- a/BaoCaoTienDoThucTapTotNghiep.docx
+++ b/BaoCaoTienDoThucTapTotNghiep.docx
@@ -39,6 +39,21 @@
     </w:p>
     <w:p>
       <w:pPr>
+        <w:keepNext w:val="0"/>
+        <w:keepLines w:val="0"/>
+        <w:pageBreakBefore w:val="0"/>
+        <w:widowControl/>
+        <w:kinsoku/>
+        <w:wordWrap/>
+        <w:overflowPunct/>
+        <w:topLinePunct w:val="0"/>
+        <w:autoSpaceDE/>
+        <w:autoSpaceDN/>
+        <w:bidi w:val="0"/>
+        <w:adjustRightInd/>
+        <w:snapToGrid/>
+        <w:spacing w:before="120" w:beforeAutospacing="0" w:after="120" w:afterAutospacing="0" w:line="360" w:lineRule="auto"/>
+        <w:textAlignment w:val="auto"/>
         <w:rPr>
           <w:rFonts w:hint="default"/>
         </w:rPr>
@@ -79,6 +94,21 @@
     </w:p>
     <w:p>
       <w:pPr>
+        <w:keepNext w:val="0"/>
+        <w:keepLines w:val="0"/>
+        <w:pageBreakBefore w:val="0"/>
+        <w:widowControl/>
+        <w:kinsoku/>
+        <w:wordWrap/>
+        <w:overflowPunct/>
+        <w:topLinePunct w:val="0"/>
+        <w:autoSpaceDE/>
+        <w:autoSpaceDN/>
+        <w:bidi w:val="0"/>
+        <w:adjustRightInd/>
+        <w:snapToGrid/>
+        <w:spacing w:before="120" w:beforeAutospacing="0" w:after="120" w:afterAutospacing="0" w:line="360" w:lineRule="auto"/>
+        <w:textAlignment w:val="auto"/>
         <w:rPr>
           <w:rFonts w:hint="default" w:ascii="Times New Roman" w:hAnsi="Times New Roman" w:cs="Times New Roman"/>
           <w:b/>
@@ -197,41 +227,8 @@
         </w:rPr>
         <w:t>Ngày 1 (04/03/2026)</w:t>
       </w:r>
-    </w:p>
-    <w:p>
-      <w:pPr>
-        <w:pStyle w:val="85"/>
-        <w:keepNext w:val="0"/>
-        <w:keepLines w:val="0"/>
-        <w:pageBreakBefore w:val="0"/>
-        <w:widowControl/>
-        <w:suppressLineNumbers w:val="0"/>
-        <w:kinsoku/>
-        <w:wordWrap/>
-        <w:overflowPunct/>
-        <w:topLinePunct w:val="0"/>
-        <w:autoSpaceDE/>
-        <w:autoSpaceDN/>
-        <w:bidi w:val="0"/>
-        <w:adjustRightInd/>
-        <w:snapToGrid/>
-        <w:spacing w:before="120" w:beforeAutospacing="0" w:after="120" w:afterAutospacing="0" w:line="360" w:lineRule="auto"/>
-        <w:ind w:left="0" w:right="0" w:firstLine="390" w:firstLineChars="150"/>
-        <w:textAlignment w:val="auto"/>
-        <w:rPr>
-          <w:rFonts w:hint="default" w:ascii="Times New Roman" w:hAnsi="Times New Roman" w:cs="Times New Roman"/>
-          <w:sz w:val="26"/>
-          <w:szCs w:val="26"/>
-        </w:rPr>
-      </w:pPr>
-      <w:r>
-        <w:rPr>
-          <w:rFonts w:hint="default" w:ascii="Times New Roman" w:hAnsi="Times New Roman" w:cs="Times New Roman"/>
-          <w:sz w:val="26"/>
-          <w:szCs w:val="26"/>
-        </w:rPr>
-        <w:t>Trong ngày đầu tiên, em đã thực hiện các công việc sau:</w:t>
-      </w:r>
+      <w:bookmarkStart w:id="0" w:name="_GoBack"/>
+      <w:bookmarkEnd w:id="0"/>
     </w:p>
     <w:p>
       <w:pPr>
@@ -550,19 +547,469 @@
         </w:rPr>
         <w:t>Khởi tạo Git repository và thiết lập file .gitignore chuẩn.</w:t>
       </w:r>
-      <w:bookmarkStart w:id="0" w:name="_GoBack"/>
-      <w:bookmarkEnd w:id="0"/>
+    </w:p>
+    <w:p>
+      <w:pPr>
+        <w:pStyle w:val="85"/>
+        <w:keepNext w:val="0"/>
+        <w:keepLines w:val="0"/>
+        <w:pageBreakBefore w:val="0"/>
+        <w:widowControl/>
+        <w:numPr>
+          <w:ilvl w:val="0"/>
+          <w:numId w:val="11"/>
+        </w:numPr>
+        <w:suppressLineNumbers w:val="0"/>
+        <w:tabs>
+          <w:tab w:val="left" w:pos="600"/>
+        </w:tabs>
+        <w:kinsoku/>
+        <w:wordWrap/>
+        <w:overflowPunct/>
+        <w:topLinePunct w:val="0"/>
+        <w:autoSpaceDE/>
+        <w:autoSpaceDN/>
+        <w:bidi w:val="0"/>
+        <w:adjustRightInd/>
+        <w:snapToGrid/>
+        <w:spacing w:before="120" w:beforeAutospacing="0" w:after="120" w:afterAutospacing="0" w:line="360" w:lineRule="auto"/>
+        <w:ind w:left="0" w:leftChars="0" w:right="0" w:rightChars="0" w:firstLine="0" w:firstLineChars="0"/>
+        <w:textAlignment w:val="auto"/>
+        <w:rPr>
+          <w:rFonts w:hint="default" w:ascii="Times New Roman" w:hAnsi="Times New Roman" w:cs="Times New Roman"/>
+          <w:b/>
+          <w:bCs/>
+          <w:sz w:val="26"/>
+          <w:szCs w:val="26"/>
+          <w:lang w:val="vi-VN"/>
+        </w:rPr>
+      </w:pPr>
+      <w:r>
+        <w:rPr>
+          <w:rFonts w:hint="default" w:cs="Times New Roman"/>
+          <w:b/>
+          <w:bCs/>
+          <w:sz w:val="26"/>
+          <w:szCs w:val="26"/>
+          <w:lang w:val="vi-VN"/>
+        </w:rPr>
+        <w:t>Ngày 2 (05/03/2026)</w:t>
+      </w:r>
+    </w:p>
+    <w:p>
+      <w:pPr>
+        <w:pStyle w:val="85"/>
+        <w:keepNext w:val="0"/>
+        <w:keepLines w:val="0"/>
+        <w:pageBreakBefore w:val="0"/>
+        <w:widowControl/>
+        <w:numPr>
+          <w:ilvl w:val="0"/>
+          <w:numId w:val="13"/>
+        </w:numPr>
+        <w:suppressLineNumbers w:val="0"/>
+        <w:tabs>
+          <w:tab w:val="clear" w:pos="840"/>
+        </w:tabs>
+        <w:kinsoku/>
+        <w:wordWrap/>
+        <w:overflowPunct/>
+        <w:topLinePunct w:val="0"/>
+        <w:autoSpaceDE/>
+        <w:autoSpaceDN/>
+        <w:bidi w:val="0"/>
+        <w:adjustRightInd/>
+        <w:snapToGrid/>
+        <w:spacing w:before="120" w:beforeAutospacing="0" w:after="120" w:afterAutospacing="0" w:line="360" w:lineRule="auto"/>
+        <w:ind w:left="600" w:leftChars="0" w:hanging="180" w:firstLineChars="0"/>
+        <w:textAlignment w:val="auto"/>
+        <w:rPr>
+          <w:b w:val="0"/>
+          <w:bCs w:val="0"/>
+        </w:rPr>
+      </w:pPr>
+      <w:r>
+        <w:rPr>
+          <w:b w:val="0"/>
+          <w:bCs w:val="0"/>
+        </w:rPr>
+        <w:t xml:space="preserve">Hoàn thiện hệ thống </w:t>
+      </w:r>
+      <w:r>
+        <w:rPr>
+          <w:rStyle w:val="92"/>
+          <w:b w:val="0"/>
+          <w:bCs w:val="0"/>
+        </w:rPr>
+        <w:t>Authentication (Register / Login)</w:t>
+      </w:r>
+    </w:p>
+    <w:p>
+      <w:pPr>
+        <w:pStyle w:val="85"/>
+        <w:keepNext w:val="0"/>
+        <w:keepLines w:val="0"/>
+        <w:pageBreakBefore w:val="0"/>
+        <w:widowControl/>
+        <w:numPr>
+          <w:ilvl w:val="0"/>
+          <w:numId w:val="13"/>
+        </w:numPr>
+        <w:suppressLineNumbers w:val="0"/>
+        <w:tabs>
+          <w:tab w:val="clear" w:pos="840"/>
+        </w:tabs>
+        <w:kinsoku/>
+        <w:wordWrap/>
+        <w:overflowPunct/>
+        <w:topLinePunct w:val="0"/>
+        <w:autoSpaceDE/>
+        <w:autoSpaceDN/>
+        <w:bidi w:val="0"/>
+        <w:adjustRightInd/>
+        <w:snapToGrid/>
+        <w:spacing w:before="120" w:beforeAutospacing="0" w:after="120" w:afterAutospacing="0" w:line="360" w:lineRule="auto"/>
+        <w:ind w:left="600" w:leftChars="0" w:hanging="180" w:firstLineChars="0"/>
+        <w:textAlignment w:val="auto"/>
+        <w:rPr>
+          <w:b w:val="0"/>
+          <w:bCs w:val="0"/>
+        </w:rPr>
+      </w:pPr>
+      <w:r>
+        <w:rPr>
+          <w:b w:val="0"/>
+          <w:bCs w:val="0"/>
+        </w:rPr>
+        <w:t xml:space="preserve">Xây dựng </w:t>
+      </w:r>
+      <w:r>
+        <w:rPr>
+          <w:rStyle w:val="92"/>
+          <w:b w:val="0"/>
+          <w:bCs w:val="0"/>
+        </w:rPr>
+        <w:t>REST API quản lý sự kiện (Create / Update / Delete / List Events)</w:t>
+      </w:r>
+    </w:p>
+    <w:p>
+      <w:pPr>
+        <w:pStyle w:val="85"/>
+        <w:keepNext w:val="0"/>
+        <w:keepLines w:val="0"/>
+        <w:pageBreakBefore w:val="0"/>
+        <w:widowControl/>
+        <w:numPr>
+          <w:ilvl w:val="0"/>
+          <w:numId w:val="13"/>
+        </w:numPr>
+        <w:suppressLineNumbers w:val="0"/>
+        <w:tabs>
+          <w:tab w:val="clear" w:pos="840"/>
+        </w:tabs>
+        <w:kinsoku/>
+        <w:wordWrap/>
+        <w:overflowPunct/>
+        <w:topLinePunct w:val="0"/>
+        <w:autoSpaceDE/>
+        <w:autoSpaceDN/>
+        <w:bidi w:val="0"/>
+        <w:adjustRightInd/>
+        <w:snapToGrid/>
+        <w:spacing w:before="120" w:beforeAutospacing="0" w:after="120" w:afterAutospacing="0" w:line="360" w:lineRule="auto"/>
+        <w:ind w:left="600" w:leftChars="0" w:hanging="180" w:firstLineChars="0"/>
+        <w:textAlignment w:val="auto"/>
+        <w:rPr>
+          <w:rFonts w:hint="default"/>
+          <w:b w:val="0"/>
+          <w:bCs w:val="0"/>
+          <w:lang w:val="vi-VN"/>
+        </w:rPr>
+      </w:pPr>
+      <w:r>
+        <w:rPr>
+          <w:b w:val="0"/>
+          <w:bCs w:val="0"/>
+        </w:rPr>
+        <w:t xml:space="preserve">Triển khai </w:t>
+      </w:r>
+      <w:r>
+        <w:rPr>
+          <w:rStyle w:val="92"/>
+          <w:b w:val="0"/>
+          <w:bCs w:val="0"/>
+        </w:rPr>
+        <w:t>chức năng sinh QR Code khi sinh viên đăng ký sự kiện</w:t>
+      </w:r>
+      <w:r>
+        <w:rPr>
+          <w:rStyle w:val="92"/>
+          <w:rFonts w:hint="default"/>
+          <w:b w:val="0"/>
+          <w:bCs w:val="0"/>
+          <w:lang w:val="vi-VN"/>
+        </w:rPr>
+        <w:t>.</w:t>
+      </w:r>
+    </w:p>
+    <w:p>
+      <w:pPr>
+        <w:pStyle w:val="85"/>
+        <w:keepNext w:val="0"/>
+        <w:keepLines w:val="0"/>
+        <w:pageBreakBefore w:val="0"/>
+        <w:widowControl/>
+        <w:numPr>
+          <w:ilvl w:val="0"/>
+          <w:numId w:val="13"/>
+        </w:numPr>
+        <w:suppressLineNumbers w:val="0"/>
+        <w:tabs>
+          <w:tab w:val="clear" w:pos="840"/>
+        </w:tabs>
+        <w:kinsoku/>
+        <w:wordWrap/>
+        <w:overflowPunct/>
+        <w:topLinePunct w:val="0"/>
+        <w:autoSpaceDE/>
+        <w:autoSpaceDN/>
+        <w:bidi w:val="0"/>
+        <w:adjustRightInd/>
+        <w:snapToGrid/>
+        <w:spacing w:before="120" w:beforeAutospacing="0" w:after="120" w:afterAutospacing="0" w:line="360" w:lineRule="auto"/>
+        <w:ind w:left="600" w:leftChars="0" w:hanging="180" w:firstLineChars="0"/>
+        <w:textAlignment w:val="auto"/>
+        <w:rPr>
+          <w:b w:val="0"/>
+          <w:bCs w:val="0"/>
+        </w:rPr>
+      </w:pPr>
+      <w:r>
+        <w:rPr>
+          <w:b w:val="0"/>
+          <w:bCs w:val="0"/>
+        </w:rPr>
+        <w:t xml:space="preserve">Xây dựng </w:t>
+      </w:r>
+      <w:r>
+        <w:rPr>
+          <w:rStyle w:val="92"/>
+          <w:b w:val="0"/>
+          <w:bCs w:val="0"/>
+        </w:rPr>
+        <w:t>API đăng ký tham gia sự kiện cho sinh viên</w:t>
+      </w:r>
+    </w:p>
+    <w:p>
+      <w:pPr>
+        <w:pStyle w:val="85"/>
+        <w:keepNext w:val="0"/>
+        <w:keepLines w:val="0"/>
+        <w:pageBreakBefore w:val="0"/>
+        <w:widowControl/>
+        <w:numPr>
+          <w:ilvl w:val="0"/>
+          <w:numId w:val="13"/>
+        </w:numPr>
+        <w:suppressLineNumbers w:val="0"/>
+        <w:tabs>
+          <w:tab w:val="clear" w:pos="840"/>
+        </w:tabs>
+        <w:kinsoku/>
+        <w:wordWrap/>
+        <w:overflowPunct/>
+        <w:topLinePunct w:val="0"/>
+        <w:autoSpaceDE/>
+        <w:autoSpaceDN/>
+        <w:bidi w:val="0"/>
+        <w:adjustRightInd/>
+        <w:snapToGrid/>
+        <w:spacing w:before="120" w:beforeAutospacing="0" w:after="120" w:afterAutospacing="0" w:line="360" w:lineRule="auto"/>
+        <w:ind w:left="600" w:leftChars="0" w:hanging="180" w:firstLineChars="0"/>
+        <w:textAlignment w:val="auto"/>
+        <w:rPr>
+          <w:b w:val="0"/>
+          <w:bCs w:val="0"/>
+        </w:rPr>
+      </w:pPr>
+      <w:r>
+        <w:rPr>
+          <w:b w:val="0"/>
+          <w:bCs w:val="0"/>
+        </w:rPr>
+        <w:t xml:space="preserve">Triển khai </w:t>
+      </w:r>
+      <w:r>
+        <w:rPr>
+          <w:rStyle w:val="92"/>
+          <w:b w:val="0"/>
+          <w:bCs w:val="0"/>
+        </w:rPr>
+        <w:t>QR Check-in để điểm danh tham dự sự kiện</w:t>
+      </w:r>
+    </w:p>
+    <w:p>
+      <w:pPr>
+        <w:pStyle w:val="85"/>
+        <w:keepNext w:val="0"/>
+        <w:keepLines w:val="0"/>
+        <w:pageBreakBefore w:val="0"/>
+        <w:widowControl/>
+        <w:numPr>
+          <w:ilvl w:val="0"/>
+          <w:numId w:val="13"/>
+        </w:numPr>
+        <w:suppressLineNumbers w:val="0"/>
+        <w:tabs>
+          <w:tab w:val="clear" w:pos="840"/>
+        </w:tabs>
+        <w:kinsoku/>
+        <w:wordWrap/>
+        <w:overflowPunct/>
+        <w:topLinePunct w:val="0"/>
+        <w:autoSpaceDE/>
+        <w:autoSpaceDN/>
+        <w:bidi w:val="0"/>
+        <w:adjustRightInd/>
+        <w:snapToGrid/>
+        <w:spacing w:before="120" w:beforeAutospacing="0" w:after="120" w:afterAutospacing="0" w:line="360" w:lineRule="auto"/>
+        <w:ind w:left="600" w:leftChars="0" w:hanging="180" w:firstLineChars="0"/>
+        <w:textAlignment w:val="auto"/>
+        <w:rPr>
+          <w:b w:val="0"/>
+          <w:bCs w:val="0"/>
+        </w:rPr>
+      </w:pPr>
+      <w:r>
+        <w:rPr>
+          <w:b w:val="0"/>
+          <w:bCs w:val="0"/>
+        </w:rPr>
+        <w:t xml:space="preserve">Tích hợp </w:t>
+      </w:r>
+      <w:r>
+        <w:rPr>
+          <w:rStyle w:val="92"/>
+          <w:b w:val="0"/>
+          <w:bCs w:val="0"/>
+        </w:rPr>
+        <w:t>Swagger API Documentation</w:t>
+      </w:r>
+    </w:p>
+    <w:p>
+      <w:pPr>
+        <w:pStyle w:val="85"/>
+        <w:keepNext w:val="0"/>
+        <w:keepLines w:val="0"/>
+        <w:pageBreakBefore w:val="0"/>
+        <w:widowControl/>
+        <w:numPr>
+          <w:ilvl w:val="0"/>
+          <w:numId w:val="13"/>
+        </w:numPr>
+        <w:suppressLineNumbers w:val="0"/>
+        <w:tabs>
+          <w:tab w:val="clear" w:pos="840"/>
+        </w:tabs>
+        <w:kinsoku/>
+        <w:wordWrap/>
+        <w:overflowPunct/>
+        <w:topLinePunct w:val="0"/>
+        <w:autoSpaceDE/>
+        <w:autoSpaceDN/>
+        <w:bidi w:val="0"/>
+        <w:adjustRightInd/>
+        <w:snapToGrid/>
+        <w:spacing w:before="120" w:beforeAutospacing="0" w:after="120" w:afterAutospacing="0" w:line="360" w:lineRule="auto"/>
+        <w:ind w:left="600" w:leftChars="0" w:hanging="180" w:firstLineChars="0"/>
+        <w:textAlignment w:val="auto"/>
+        <w:rPr>
+          <w:b w:val="0"/>
+          <w:bCs w:val="0"/>
+        </w:rPr>
+      </w:pPr>
+      <w:r>
+        <w:rPr>
+          <w:b w:val="0"/>
+          <w:bCs w:val="0"/>
+        </w:rPr>
+        <w:t xml:space="preserve">Thêm </w:t>
+      </w:r>
+      <w:r>
+        <w:rPr>
+          <w:rStyle w:val="92"/>
+          <w:b w:val="0"/>
+          <w:bCs w:val="0"/>
+        </w:rPr>
+        <w:t>validation, error handling và pagination cho API</w:t>
+      </w:r>
+    </w:p>
+    <w:p>
+      <w:pPr>
+        <w:pStyle w:val="85"/>
+        <w:keepNext w:val="0"/>
+        <w:keepLines w:val="0"/>
+        <w:pageBreakBefore w:val="0"/>
+        <w:widowControl/>
+        <w:numPr>
+          <w:ilvl w:val="0"/>
+          <w:numId w:val="13"/>
+        </w:numPr>
+        <w:suppressLineNumbers w:val="0"/>
+        <w:tabs>
+          <w:tab w:val="clear" w:pos="840"/>
+        </w:tabs>
+        <w:kinsoku/>
+        <w:wordWrap/>
+        <w:overflowPunct/>
+        <w:topLinePunct w:val="0"/>
+        <w:autoSpaceDE/>
+        <w:autoSpaceDN/>
+        <w:bidi w:val="0"/>
+        <w:adjustRightInd/>
+        <w:snapToGrid/>
+        <w:spacing w:before="120" w:beforeAutospacing="0" w:after="120" w:afterAutospacing="0" w:line="360" w:lineRule="auto"/>
+        <w:ind w:left="600" w:leftChars="0" w:hanging="180" w:firstLineChars="0"/>
+        <w:textAlignment w:val="auto"/>
+        <w:rPr>
+          <w:rFonts w:hint="default" w:ascii="Times New Roman" w:hAnsi="Times New Roman" w:cs="Times New Roman"/>
+          <w:b w:val="0"/>
+          <w:bCs w:val="0"/>
+          <w:sz w:val="26"/>
+          <w:szCs w:val="26"/>
+          <w:lang w:val="vi-VN"/>
+        </w:rPr>
+      </w:pPr>
+      <w:r>
+        <w:rPr>
+          <w:b w:val="0"/>
+          <w:bCs w:val="0"/>
+        </w:rPr>
+        <w:t>Kiểm tra và xác nhận hoạt động của toàn bộ API backend</w:t>
+      </w:r>
     </w:p>
     <w:p>
       <w:pPr>
         <w:keepNext w:val="0"/>
         <w:keepLines w:val="0"/>
+        <w:pageBreakBefore w:val="0"/>
         <w:widowControl/>
         <w:numPr>
+          <w:ilvl w:val="0"/>
           <w:numId w:val="0"/>
         </w:numPr>
         <w:suppressLineNumbers w:val="0"/>
-        <w:spacing w:before="0" w:beforeAutospacing="1" w:after="0" w:afterAutospacing="1"/>
+        <w:kinsoku/>
+        <w:wordWrap/>
+        <w:overflowPunct/>
+        <w:topLinePunct w:val="0"/>
+        <w:autoSpaceDE/>
+        <w:autoSpaceDN/>
+        <w:bidi w:val="0"/>
+        <w:adjustRightInd/>
+        <w:snapToGrid/>
+        <w:spacing w:before="120" w:beforeAutospacing="0" w:after="120" w:afterAutospacing="0" w:line="360" w:lineRule="auto"/>
+        <w:textAlignment w:val="auto"/>
         <w:rPr>
           <w:rFonts w:hint="default" w:ascii="Times New Roman" w:hAnsi="Times New Roman" w:cs="Times New Roman"/>
           <w:sz w:val="26"/>
@@ -572,6 +1019,21 @@
     </w:p>
     <w:p>
       <w:pPr>
+        <w:keepNext w:val="0"/>
+        <w:keepLines w:val="0"/>
+        <w:pageBreakBefore w:val="0"/>
+        <w:widowControl/>
+        <w:kinsoku/>
+        <w:wordWrap/>
+        <w:overflowPunct/>
+        <w:topLinePunct w:val="0"/>
+        <w:autoSpaceDE/>
+        <w:autoSpaceDN/>
+        <w:bidi w:val="0"/>
+        <w:adjustRightInd/>
+        <w:snapToGrid/>
+        <w:spacing w:before="120" w:beforeAutospacing="0" w:after="120" w:afterAutospacing="0" w:line="360" w:lineRule="auto"/>
+        <w:textAlignment w:val="auto"/>
         <w:rPr>
           <w:rFonts w:hint="default" w:ascii="Times New Roman" w:hAnsi="Times New Roman" w:cs="Times New Roman"/>
           <w:sz w:val="26"/>
@@ -820,6 +1282,28 @@
       </w:rPr>
     </w:lvl>
   </w:abstractNum>
+  <w:abstractNum w:abstractNumId="12">
+    <w:nsid w:val="6027A911"/>
+    <w:multiLevelType w:val="singleLevel"/>
+    <w:tmpl w:val="6027A911"/>
+    <w:lvl w:ilvl="0" w:tentative="0">
+      <w:start w:val="1"/>
+      <w:numFmt w:val="bullet"/>
+      <w:lvlText w:val=""/>
+      <w:lvlJc w:val="left"/>
+      <w:pPr>
+        <w:tabs>
+          <w:tab w:val="left" w:pos="840"/>
+        </w:tabs>
+        <w:ind w:left="840" w:leftChars="0" w:hanging="420" w:firstLineChars="0"/>
+      </w:pPr>
+      <w:rPr>
+        <w:rFonts w:hint="default" w:ascii="Wingdings" w:hAnsi="Wingdings"/>
+        <w:sz w:val="16"/>
+        <w:szCs w:val="16"/>
+      </w:rPr>
+    </w:lvl>
+  </w:abstractNum>
   <w:num w:numId="1">
     <w:abstractNumId w:val="10"/>
   </w:num>
@@ -856,6 +1340,9 @@
   <w:num w:numId="12">
     <w:abstractNumId w:val="11"/>
   </w:num>
+  <w:num w:numId="13">
+    <w:abstractNumId w:val="12"/>
+  </w:num>
 </w:numbering>
 </file>
 
@@ -891,21 +1378,21 @@
     <w:lsdException w:qFormat="1" w:unhideWhenUsed="0" w:uiPriority="0" w:semiHidden="0" w:name="index 9"/>
     <w:lsdException w:qFormat="1" w:unhideWhenUsed="0" w:uiPriority="0" w:semiHidden="0" w:name="toc 1"/>
     <w:lsdException w:unhideWhenUsed="0" w:uiPriority="0" w:semiHidden="0" w:name="toc 2"/>
-    <w:lsdException w:unhideWhenUsed="0" w:uiPriority="0" w:semiHidden="0" w:name="toc 3"/>
+    <w:lsdException w:qFormat="1" w:unhideWhenUsed="0" w:uiPriority="0" w:semiHidden="0" w:name="toc 3"/>
     <w:lsdException w:qFormat="1" w:unhideWhenUsed="0" w:uiPriority="0" w:semiHidden="0" w:name="toc 4"/>
     <w:lsdException w:qFormat="1" w:unhideWhenUsed="0" w:uiPriority="0" w:semiHidden="0" w:name="toc 5"/>
     <w:lsdException w:unhideWhenUsed="0" w:uiPriority="0" w:semiHidden="0" w:name="toc 6"/>
     <w:lsdException w:qFormat="1" w:unhideWhenUsed="0" w:uiPriority="0" w:semiHidden="0" w:name="toc 7"/>
     <w:lsdException w:unhideWhenUsed="0" w:uiPriority="0" w:semiHidden="0" w:name="toc 8"/>
     <w:lsdException w:qFormat="1" w:unhideWhenUsed="0" w:uiPriority="0" w:semiHidden="0" w:name="toc 9"/>
-    <w:lsdException w:unhideWhenUsed="0" w:uiPriority="0" w:semiHidden="0" w:name="Normal Indent"/>
+    <w:lsdException w:qFormat="1" w:unhideWhenUsed="0" w:uiPriority="0" w:semiHidden="0" w:name="Normal Indent"/>
     <w:lsdException w:qFormat="1" w:unhideWhenUsed="0" w:uiPriority="0" w:semiHidden="0" w:name="footnote text"/>
     <w:lsdException w:qFormat="1" w:unhideWhenUsed="0" w:uiPriority="0" w:semiHidden="0" w:name="annotation text"/>
     <w:lsdException w:unhideWhenUsed="0" w:uiPriority="0" w:semiHidden="0" w:name="header"/>
     <w:lsdException w:unhideWhenUsed="0" w:uiPriority="0" w:semiHidden="0" w:name="footer"/>
     <w:lsdException w:unhideWhenUsed="0" w:uiPriority="0" w:semiHidden="0" w:name="index heading"/>
     <w:lsdException w:qFormat="1" w:uiPriority="0" w:name="caption"/>
-    <w:lsdException w:unhideWhenUsed="0" w:uiPriority="0" w:semiHidden="0" w:name="table of figures"/>
+    <w:lsdException w:qFormat="1" w:unhideWhenUsed="0" w:uiPriority="0" w:semiHidden="0" w:name="table of figures"/>
     <w:lsdException w:unhideWhenUsed="0" w:uiPriority="0" w:semiHidden="0" w:name="envelope address"/>
     <w:lsdException w:unhideWhenUsed="0" w:uiPriority="0" w:semiHidden="0" w:name="envelope return"/>
     <w:lsdException w:qFormat="1" w:unhideWhenUsed="0" w:uiPriority="0" w:semiHidden="0" w:name="footnote reference"/>
@@ -914,12 +1401,12 @@
     <w:lsdException w:qFormat="1" w:unhideWhenUsed="0" w:uiPriority="0" w:semiHidden="0" w:name="page number"/>
     <w:lsdException w:unhideWhenUsed="0" w:uiPriority="0" w:semiHidden="0" w:name="endnote reference"/>
     <w:lsdException w:qFormat="1" w:unhideWhenUsed="0" w:uiPriority="0" w:semiHidden="0" w:name="endnote text"/>
-    <w:lsdException w:unhideWhenUsed="0" w:uiPriority="0" w:semiHidden="0" w:name="table of authorities"/>
+    <w:lsdException w:qFormat="1" w:unhideWhenUsed="0" w:uiPriority="0" w:semiHidden="0" w:name="table of authorities"/>
     <w:lsdException w:unhideWhenUsed="0" w:uiPriority="0" w:semiHidden="0" w:name="macro"/>
     <w:lsdException w:qFormat="1" w:unhideWhenUsed="0" w:uiPriority="0" w:semiHidden="0" w:name="toa heading"/>
     <w:lsdException w:qFormat="1" w:unhideWhenUsed="0" w:uiPriority="0" w:semiHidden="0" w:name="List"/>
     <w:lsdException w:qFormat="1" w:unhideWhenUsed="0" w:uiPriority="0" w:semiHidden="0" w:name="List Bullet"/>
-    <w:lsdException w:unhideWhenUsed="0" w:uiPriority="0" w:semiHidden="0" w:name="List Number"/>
+    <w:lsdException w:qFormat="1" w:unhideWhenUsed="0" w:uiPriority="0" w:semiHidden="0" w:name="List Number"/>
     <w:lsdException w:qFormat="1" w:unhideWhenUsed="0" w:uiPriority="0" w:semiHidden="0" w:name="List 2"/>
     <w:lsdException w:qFormat="1" w:unhideWhenUsed="0" w:uiPriority="0" w:semiHidden="0" w:name="List 3"/>
     <w:lsdException w:qFormat="1" w:unhideWhenUsed="0" w:uiPriority="0" w:semiHidden="0" w:name="List 4"/>
@@ -931,7 +1418,7 @@
     <w:lsdException w:unhideWhenUsed="0" w:uiPriority="0" w:semiHidden="0" w:name="List Number 2"/>
     <w:lsdException w:qFormat="1" w:unhideWhenUsed="0" w:uiPriority="0" w:semiHidden="0" w:name="List Number 3"/>
     <w:lsdException w:qFormat="1" w:unhideWhenUsed="0" w:uiPriority="0" w:semiHidden="0" w:name="List Number 4"/>
-    <w:lsdException w:unhideWhenUsed="0" w:uiPriority="0" w:semiHidden="0" w:name="List Number 5"/>
+    <w:lsdException w:qFormat="1" w:unhideWhenUsed="0" w:uiPriority="0" w:semiHidden="0" w:name="List Number 5"/>
     <w:lsdException w:qFormat="1" w:unhideWhenUsed="0" w:uiPriority="0" w:semiHidden="0" w:name="Title"/>
     <w:lsdException w:qFormat="1" w:unhideWhenUsed="0" w:uiPriority="0" w:semiHidden="0" w:name="Closing"/>
     <w:lsdException w:qFormat="1" w:unhideWhenUsed="0" w:uiPriority="0" w:semiHidden="0" w:name="Signature"/>
@@ -941,11 +1428,11 @@
     <w:lsdException w:unhideWhenUsed="0" w:uiPriority="0" w:semiHidden="0" w:name="List Continue"/>
     <w:lsdException w:qFormat="1" w:unhideWhenUsed="0" w:uiPriority="0" w:semiHidden="0" w:name="List Continue 2"/>
     <w:lsdException w:qFormat="1" w:unhideWhenUsed="0" w:uiPriority="0" w:semiHidden="0" w:name="List Continue 3"/>
-    <w:lsdException w:unhideWhenUsed="0" w:uiPriority="0" w:semiHidden="0" w:name="List Continue 4"/>
+    <w:lsdException w:qFormat="1" w:unhideWhenUsed="0" w:uiPriority="0" w:semiHidden="0" w:name="List Continue 4"/>
     <w:lsdException w:qFormat="1" w:unhideWhenUsed="0" w:uiPriority="0" w:semiHidden="0" w:name="List Continue 5"/>
     <w:lsdException w:qFormat="1" w:unhideWhenUsed="0" w:uiPriority="0" w:semiHidden="0" w:name="Message Header"/>
     <w:lsdException w:qFormat="1" w:unhideWhenUsed="0" w:uiPriority="0" w:semiHidden="0" w:name="Subtitle"/>
-    <w:lsdException w:unhideWhenUsed="0" w:uiPriority="0" w:semiHidden="0" w:name="Salutation"/>
+    <w:lsdException w:qFormat="1" w:unhideWhenUsed="0" w:uiPriority="0" w:semiHidden="0" w:name="Salutation"/>
     <w:lsdException w:unhideWhenUsed="0" w:uiPriority="0" w:semiHidden="0" w:name="Date"/>
     <w:lsdException w:qFormat="1" w:unhideWhenUsed="0" w:uiPriority="0" w:semiHidden="0" w:name="Body Text First Indent"/>
     <w:lsdException w:qFormat="1" w:unhideWhenUsed="0" w:uiPriority="0" w:semiHidden="0" w:name="Body Text First Indent 2"/>
@@ -959,10 +1446,10 @@
     <w:lsdException w:unhideWhenUsed="0" w:uiPriority="0" w:semiHidden="0" w:name="FollowedHyperlink"/>
     <w:lsdException w:qFormat="1" w:unhideWhenUsed="0" w:uiPriority="0" w:semiHidden="0" w:name="Strong"/>
     <w:lsdException w:qFormat="1" w:unhideWhenUsed="0" w:uiPriority="0" w:semiHidden="0" w:name="Emphasis"/>
-    <w:lsdException w:unhideWhenUsed="0" w:uiPriority="0" w:semiHidden="0" w:name="Document Map"/>
-    <w:lsdException w:unhideWhenUsed="0" w:uiPriority="0" w:semiHidden="0" w:name="Plain Text"/>
+    <w:lsdException w:qFormat="1" w:unhideWhenUsed="0" w:uiPriority="0" w:semiHidden="0" w:name="Document Map"/>
+    <w:lsdException w:qFormat="1" w:unhideWhenUsed="0" w:uiPriority="0" w:semiHidden="0" w:name="Plain Text"/>
     <w:lsdException w:unhideWhenUsed="0" w:uiPriority="0" w:semiHidden="0" w:name="E-mail Signature"/>
-    <w:lsdException w:unhideWhenUsed="0" w:uiPriority="0" w:semiHidden="0" w:name="Normal (Web)"/>
+    <w:lsdException w:qFormat="1" w:unhideWhenUsed="0" w:uiPriority="0" w:semiHidden="0" w:name="Normal (Web)"/>
     <w:lsdException w:unhideWhenUsed="0" w:uiPriority="0" w:semiHidden="0" w:name="HTML Acronym"/>
     <w:lsdException w:unhideWhenUsed="0" w:uiPriority="0" w:semiHidden="0" w:name="HTML Address"/>
     <w:lsdException w:unhideWhenUsed="0" w:uiPriority="0" w:semiHidden="0" w:name="HTML Cite"/>
@@ -974,7 +1461,7 @@
     <w:lsdException w:unhideWhenUsed="0" w:uiPriority="0" w:semiHidden="0" w:name="HTML Typewriter"/>
     <w:lsdException w:qFormat="1" w:unhideWhenUsed="0" w:uiPriority="0" w:semiHidden="0" w:name="HTML Variable"/>
     <w:lsdException w:qFormat="1" w:unhideWhenUsed="0" w:uiPriority="0" w:name="Normal Table"/>
-    <w:lsdException w:unhideWhenUsed="0" w:uiPriority="0" w:semiHidden="0" w:name="annotation subject"/>
+    <w:lsdException w:qFormat="1" w:unhideWhenUsed="0" w:uiPriority="0" w:semiHidden="0" w:name="annotation subject"/>
     <w:lsdException w:qFormat="1" w:unhideWhenUsed="0" w:uiPriority="0" w:semiHidden="0" w:name="Table Simple 1"/>
     <w:lsdException w:qFormat="1" w:unhideWhenUsed="0" w:uiPriority="0" w:semiHidden="0" w:name="Table Simple 2"/>
     <w:lsdException w:qFormat="1" w:unhideWhenUsed="0" w:uiPriority="0" w:semiHidden="0" w:name="Table Simple 3"/>
@@ -982,16 +1469,16 @@
     <w:lsdException w:qFormat="1" w:unhideWhenUsed="0" w:uiPriority="0" w:semiHidden="0" w:name="Table Classic 2"/>
     <w:lsdException w:qFormat="1" w:unhideWhenUsed="0" w:uiPriority="0" w:semiHidden="0" w:name="Table Classic 3"/>
     <w:lsdException w:qFormat="1" w:unhideWhenUsed="0" w:uiPriority="0" w:semiHidden="0" w:name="Table Classic 4"/>
-    <w:lsdException w:unhideWhenUsed="0" w:uiPriority="0" w:semiHidden="0" w:name="Table Colorful 1"/>
-    <w:lsdException w:unhideWhenUsed="0" w:uiPriority="0" w:semiHidden="0" w:name="Table Colorful 2"/>
+    <w:lsdException w:qFormat="1" w:unhideWhenUsed="0" w:uiPriority="0" w:semiHidden="0" w:name="Table Colorful 1"/>
+    <w:lsdException w:qFormat="1" w:unhideWhenUsed="0" w:uiPriority="0" w:semiHidden="0" w:name="Table Colorful 2"/>
     <w:lsdException w:qFormat="1" w:unhideWhenUsed="0" w:uiPriority="0" w:semiHidden="0" w:name="Table Colorful 3"/>
     <w:lsdException w:qFormat="1" w:unhideWhenUsed="0" w:uiPriority="0" w:semiHidden="0" w:name="Table Columns 1"/>
     <w:lsdException w:unhideWhenUsed="0" w:uiPriority="0" w:semiHidden="0" w:name="Table Columns 2"/>
     <w:lsdException w:qFormat="1" w:unhideWhenUsed="0" w:uiPriority="0" w:semiHidden="0" w:name="Table Columns 3"/>
-    <w:lsdException w:unhideWhenUsed="0" w:uiPriority="0" w:semiHidden="0" w:name="Table Columns 4"/>
+    <w:lsdException w:qFormat="1" w:unhideWhenUsed="0" w:uiPriority="0" w:semiHidden="0" w:name="Table Columns 4"/>
     <w:lsdException w:qFormat="1" w:unhideWhenUsed="0" w:uiPriority="0" w:semiHidden="0" w:name="Table Columns 5"/>
     <w:lsdException w:qFormat="1" w:unhideWhenUsed="0" w:uiPriority="0" w:semiHidden="0" w:name="Table Grid 1"/>
-    <w:lsdException w:unhideWhenUsed="0" w:uiPriority="0" w:semiHidden="0" w:name="Table Grid 2"/>
+    <w:lsdException w:qFormat="1" w:unhideWhenUsed="0" w:uiPriority="0" w:semiHidden="0" w:name="Table Grid 2"/>
     <w:lsdException w:qFormat="1" w:unhideWhenUsed="0" w:uiPriority="0" w:semiHidden="0" w:name="Table Grid 3"/>
     <w:lsdException w:qFormat="1" w:unhideWhenUsed="0" w:uiPriority="0" w:semiHidden="0" w:name="Table Grid 4"/>
     <w:lsdException w:unhideWhenUsed="0" w:uiPriority="0" w:semiHidden="0" w:name="Table Grid 5"/>
@@ -1006,24 +1493,24 @@
     <w:lsdException w:unhideWhenUsed="0" w:uiPriority="0" w:semiHidden="0" w:name="Table List 6"/>
     <w:lsdException w:qFormat="1" w:unhideWhenUsed="0" w:uiPriority="0" w:semiHidden="0" w:name="Table List 7"/>
     <w:lsdException w:qFormat="1" w:unhideWhenUsed="0" w:uiPriority="0" w:semiHidden="0" w:name="Table List 8"/>
-    <w:lsdException w:unhideWhenUsed="0" w:uiPriority="0" w:semiHidden="0" w:name="Table 3D effects 1"/>
-    <w:lsdException w:unhideWhenUsed="0" w:uiPriority="0" w:semiHidden="0" w:name="Table 3D effects 2"/>
+    <w:lsdException w:qFormat="1" w:unhideWhenUsed="0" w:uiPriority="0" w:semiHidden="0" w:name="Table 3D effects 1"/>
+    <w:lsdException w:qFormat="1" w:unhideWhenUsed="0" w:uiPriority="0" w:semiHidden="0" w:name="Table 3D effects 2"/>
     <w:lsdException w:qFormat="1" w:unhideWhenUsed="0" w:uiPriority="0" w:semiHidden="0" w:name="Table 3D effects 3"/>
-    <w:lsdException w:unhideWhenUsed="0" w:uiPriority="0" w:semiHidden="0" w:name="Table Contemporary"/>
+    <w:lsdException w:qFormat="1" w:unhideWhenUsed="0" w:uiPriority="0" w:semiHidden="0" w:name="Table Contemporary"/>
     <w:lsdException w:qFormat="1" w:unhideWhenUsed="0" w:uiPriority="0" w:semiHidden="0" w:name="Table Elegant"/>
     <w:lsdException w:qFormat="1" w:unhideWhenUsed="0" w:uiPriority="0" w:semiHidden="0" w:name="Table Professional"/>
     <w:lsdException w:unhideWhenUsed="0" w:uiPriority="0" w:semiHidden="0" w:name="Table Subtle 1"/>
-    <w:lsdException w:unhideWhenUsed="0" w:uiPriority="0" w:semiHidden="0" w:name="Table Subtle 2"/>
-    <w:lsdException w:unhideWhenUsed="0" w:uiPriority="0" w:semiHidden="0" w:name="Table Web 1"/>
+    <w:lsdException w:qFormat="1" w:unhideWhenUsed="0" w:uiPriority="0" w:semiHidden="0" w:name="Table Subtle 2"/>
+    <w:lsdException w:qFormat="1" w:unhideWhenUsed="0" w:uiPriority="0" w:semiHidden="0" w:name="Table Web 1"/>
     <w:lsdException w:qFormat="1" w:unhideWhenUsed="0" w:uiPriority="0" w:semiHidden="0" w:name="Table Web 2"/>
     <w:lsdException w:unhideWhenUsed="0" w:uiPriority="0" w:semiHidden="0" w:name="Table Web 3"/>
     <w:lsdException w:qFormat="1" w:unhideWhenUsed="0" w:uiPriority="0" w:semiHidden="0" w:name="Balloon Text"/>
     <w:lsdException w:qFormat="1" w:unhideWhenUsed="0" w:uiPriority="0" w:semiHidden="0" w:name="Table Grid"/>
     <w:lsdException w:qFormat="1" w:unhideWhenUsed="0" w:uiPriority="0" w:semiHidden="0" w:name="Table Theme"/>
-    <w:lsdException w:unhideWhenUsed="0" w:uiPriority="60" w:semiHidden="0" w:name="Light Shading"/>
+    <w:lsdException w:qFormat="1" w:unhideWhenUsed="0" w:uiPriority="60" w:semiHidden="0" w:name="Light Shading"/>
     <w:lsdException w:qFormat="1" w:unhideWhenUsed="0" w:uiPriority="61" w:semiHidden="0" w:name="Light List"/>
     <w:lsdException w:unhideWhenUsed="0" w:uiPriority="62" w:semiHidden="0" w:name="Light Grid"/>
-    <w:lsdException w:unhideWhenUsed="0" w:uiPriority="63" w:semiHidden="0" w:name="Medium Shading 1"/>
+    <w:lsdException w:qFormat="1" w:unhideWhenUsed="0" w:uiPriority="63" w:semiHidden="0" w:name="Medium Shading 1"/>
     <w:lsdException w:qFormat="1" w:unhideWhenUsed="0" w:uiPriority="64" w:semiHidden="0" w:name="Medium Shading 2"/>
     <w:lsdException w:qFormat="1" w:unhideWhenUsed="0" w:uiPriority="65" w:semiHidden="0" w:name="Medium List 1"/>
     <w:lsdException w:qFormat="1" w:unhideWhenUsed="0" w:uiPriority="66" w:semiHidden="0" w:name="Medium List 2"/>
@@ -1035,7 +1522,7 @@
     <w:lsdException w:qFormat="1" w:unhideWhenUsed="0" w:uiPriority="72" w:semiHidden="0" w:name="Colorful List"/>
     <w:lsdException w:qFormat="1" w:unhideWhenUsed="0" w:uiPriority="73" w:semiHidden="0" w:name="Colorful Grid"/>
     <w:lsdException w:qFormat="1" w:unhideWhenUsed="0" w:uiPriority="60" w:semiHidden="0" w:name="Light Shading Accent 1"/>
-    <w:lsdException w:unhideWhenUsed="0" w:uiPriority="61" w:semiHidden="0" w:name="Light List Accent 1"/>
+    <w:lsdException w:qFormat="1" w:unhideWhenUsed="0" w:uiPriority="61" w:semiHidden="0" w:name="Light List Accent 1"/>
     <w:lsdException w:qFormat="1" w:unhideWhenUsed="0" w:uiPriority="62" w:semiHidden="0" w:name="Light Grid Accent 1"/>
     <w:lsdException w:unhideWhenUsed="0" w:uiPriority="63" w:semiHidden="0" w:name="Medium Shading 1 Accent 1"/>
     <w:lsdException w:qFormat="1" w:unhideWhenUsed="0" w:uiPriority="64" w:semiHidden="0" w:name="Medium Shading 2 Accent 1"/>
@@ -1062,7 +1549,7 @@
     <w:lsdException w:qFormat="1" w:unhideWhenUsed="0" w:uiPriority="71" w:semiHidden="0" w:name="Colorful Shading Accent 2"/>
     <w:lsdException w:qFormat="1" w:unhideWhenUsed="0" w:uiPriority="72" w:semiHidden="0" w:name="Colorful List Accent 2"/>
     <w:lsdException w:qFormat="1" w:unhideWhenUsed="0" w:uiPriority="73" w:semiHidden="0" w:name="Colorful Grid Accent 2"/>
-    <w:lsdException w:unhideWhenUsed="0" w:uiPriority="60" w:semiHidden="0" w:name="Light Shading Accent 3"/>
+    <w:lsdException w:qFormat="1" w:unhideWhenUsed="0" w:uiPriority="60" w:semiHidden="0" w:name="Light Shading Accent 3"/>
     <w:lsdException w:qFormat="1" w:unhideWhenUsed="0" w:uiPriority="61" w:semiHidden="0" w:name="Light List Accent 3"/>
     <w:lsdException w:qFormat="1" w:unhideWhenUsed="0" w:uiPriority="62" w:semiHidden="0" w:name="Light Grid Accent 3"/>
     <w:lsdException w:qFormat="1" w:unhideWhenUsed="0" w:uiPriority="63" w:semiHidden="0" w:name="Medium Shading 1 Accent 3"/>
@@ -1090,7 +1577,7 @@
     <w:lsdException w:qFormat="1" w:unhideWhenUsed="0" w:uiPriority="71" w:semiHidden="0" w:name="Colorful Shading Accent 4"/>
     <w:lsdException w:qFormat="1" w:unhideWhenUsed="0" w:uiPriority="72" w:semiHidden="0" w:name="Colorful List Accent 4"/>
     <w:lsdException w:qFormat="1" w:unhideWhenUsed="0" w:uiPriority="73" w:semiHidden="0" w:name="Colorful Grid Accent 4"/>
-    <w:lsdException w:unhideWhenUsed="0" w:uiPriority="60" w:semiHidden="0" w:name="Light Shading Accent 5"/>
+    <w:lsdException w:qFormat="1" w:unhideWhenUsed="0" w:uiPriority="60" w:semiHidden="0" w:name="Light Shading Accent 5"/>
     <w:lsdException w:unhideWhenUsed="0" w:uiPriority="61" w:semiHidden="0" w:name="Light List Accent 5"/>
     <w:lsdException w:unhideWhenUsed="0" w:uiPriority="62" w:semiHidden="0" w:name="Light Grid Accent 5"/>
     <w:lsdException w:qFormat="1" w:unhideWhenUsed="0" w:uiPriority="63" w:semiHidden="0" w:name="Medium Shading 1 Accent 5"/>
@@ -1105,7 +1592,7 @@
     <w:lsdException w:qFormat="1" w:unhideWhenUsed="0" w:uiPriority="72" w:semiHidden="0" w:name="Colorful List Accent 5"/>
     <w:lsdException w:qFormat="1" w:unhideWhenUsed="0" w:uiPriority="73" w:semiHidden="0" w:name="Colorful Grid Accent 5"/>
     <w:lsdException w:unhideWhenUsed="0" w:uiPriority="60" w:semiHidden="0" w:name="Light Shading Accent 6"/>
-    <w:lsdException w:unhideWhenUsed="0" w:uiPriority="61" w:semiHidden="0" w:name="Light List Accent 6"/>
+    <w:lsdException w:qFormat="1" w:unhideWhenUsed="0" w:uiPriority="61" w:semiHidden="0" w:name="Light List Accent 6"/>
     <w:lsdException w:unhideWhenUsed="0" w:uiPriority="62" w:semiHidden="0" w:name="Light Grid Accent 6"/>
     <w:lsdException w:qFormat="1" w:unhideWhenUsed="0" w:uiPriority="63" w:semiHidden="0" w:name="Medium Shading 1 Accent 6"/>
     <w:lsdException w:qFormat="1" w:unhideWhenUsed="0" w:uiPriority="64" w:semiHidden="0" w:name="Medium Shading 2 Accent 6"/>
@@ -1478,6 +1965,7 @@
     <w:name w:val="annotation subject"/>
     <w:basedOn w:val="26"/>
     <w:next w:val="26"/>
+    <w:qFormat/>
     <w:uiPriority w:val="0"/>
     <w:rPr>
       <w:b/>
@@ -1496,6 +1984,7 @@
   <w:style w:type="paragraph" w:styleId="29">
     <w:name w:val="Document Map"/>
     <w:basedOn w:val="1"/>
+    <w:qFormat/>
     <w:uiPriority w:val="0"/>
     <w:pPr>
       <w:shd w:val="clear" w:color="auto" w:fill="000080"/>
@@ -1963,6 +2452,7 @@
   <w:style w:type="paragraph" w:styleId="76">
     <w:name w:val="List Continue 4"/>
     <w:basedOn w:val="1"/>
+    <w:qFormat/>
     <w:uiPriority w:val="0"/>
     <w:pPr>
       <w:spacing w:after="120"/>
@@ -1982,6 +2472,7 @@
   <w:style w:type="paragraph" w:styleId="78">
     <w:name w:val="List Number"/>
     <w:basedOn w:val="1"/>
+    <w:qFormat/>
     <w:uiPriority w:val="0"/>
     <w:pPr>
       <w:numPr>
@@ -2028,6 +2519,7 @@
   <w:style w:type="paragraph" w:styleId="82">
     <w:name w:val="List Number 5"/>
     <w:basedOn w:val="1"/>
+    <w:qFormat/>
     <w:uiPriority w:val="0"/>
     <w:pPr>
       <w:numPr>
@@ -2089,6 +2581,7 @@
   </w:style>
   <w:style w:type="paragraph" w:styleId="85">
     <w:name w:val="Normal (Web)"/>
+    <w:qFormat/>
     <w:uiPriority w:val="0"/>
     <w:pPr>
       <w:spacing w:before="0" w:beforeAutospacing="1" w:after="0" w:afterAutospacing="1"/>
@@ -2096,6 +2589,7 @@
       <w:jc w:val="left"/>
     </w:pPr>
     <w:rPr>
+      <w:rFonts w:ascii="Times New Roman" w:hAnsi="Times New Roman" w:eastAsia="SimSun" w:cs="Times New Roman"/>
       <w:kern w:val="0"/>
       <w:sz w:val="24"/>
       <w:szCs w:val="24"/>
@@ -2105,6 +2599,7 @@
   <w:style w:type="paragraph" w:styleId="86">
     <w:name w:val="Normal Indent"/>
     <w:basedOn w:val="1"/>
+    <w:qFormat/>
     <w:uiPriority w:val="0"/>
     <w:pPr>
       <w:ind w:firstLine="420" w:firstLineChars="200"/>
@@ -2128,6 +2623,7 @@
   <w:style w:type="paragraph" w:styleId="89">
     <w:name w:val="Plain Text"/>
     <w:basedOn w:val="1"/>
+    <w:qFormat/>
     <w:uiPriority w:val="0"/>
     <w:rPr>
       <w:rFonts w:ascii="SimSun" w:hAnsi="Courier New" w:cs="Courier New"/>
@@ -2138,6 +2634,7 @@
     <w:name w:val="Salutation"/>
     <w:basedOn w:val="1"/>
     <w:next w:val="1"/>
+    <w:qFormat/>
     <w:uiPriority w:val="0"/>
   </w:style>
   <w:style w:type="paragraph" w:styleId="91">
@@ -2181,6 +2678,7 @@
   <w:style w:type="table" w:styleId="94">
     <w:name w:val="Table 3D effects 1"/>
     <w:basedOn w:val="12"/>
+    <w:qFormat/>
     <w:uiPriority w:val="0"/>
     <w:pPr>
       <w:widowControl w:val="0"/>
@@ -2290,6 +2788,7 @@
   <w:style w:type="table" w:styleId="95">
     <w:name w:val="Table 3D effects 2"/>
     <w:basedOn w:val="12"/>
+    <w:qFormat/>
     <w:uiPriority w:val="0"/>
     <w:pPr>
       <w:widowControl w:val="0"/>
@@ -2792,6 +3291,7 @@
   <w:style w:type="table" w:styleId="101">
     <w:name w:val="Table Colorful 1"/>
     <w:basedOn w:val="12"/>
+    <w:qFormat/>
     <w:uiPriority w:val="0"/>
     <w:pPr>
       <w:widowControl w:val="0"/>
@@ -2873,6 +3373,7 @@
   <w:style w:type="table" w:styleId="102">
     <w:name w:val="Table Colorful 2"/>
     <w:basedOn w:val="12"/>
+    <w:qFormat/>
     <w:uiPriority w:val="0"/>
     <w:pPr>
       <w:widowControl w:val="0"/>
@@ -3347,6 +3848,7 @@
   <w:style w:type="table" w:styleId="107">
     <w:name w:val="Table Columns 4"/>
     <w:basedOn w:val="12"/>
+    <w:qFormat/>
     <w:uiPriority w:val="0"/>
     <w:pPr>
       <w:widowControl w:val="0"/>
@@ -3505,6 +4007,7 @@
   <w:style w:type="table" w:styleId="109">
     <w:name w:val="Table Contemporary"/>
     <w:basedOn w:val="12"/>
+    <w:qFormat/>
     <w:uiPriority w:val="0"/>
     <w:pPr>
       <w:widowControl w:val="0"/>
@@ -3675,6 +4178,7 @@
   <w:style w:type="table" w:styleId="113">
     <w:name w:val="Table Grid 2"/>
     <w:basedOn w:val="12"/>
+    <w:qFormat/>
     <w:uiPriority w:val="0"/>
     <w:pPr>
       <w:widowControl w:val="0"/>
@@ -4755,6 +5259,7 @@
     <w:name w:val="table of authorities"/>
     <w:basedOn w:val="1"/>
     <w:next w:val="1"/>
+    <w:qFormat/>
     <w:uiPriority w:val="0"/>
     <w:pPr>
       <w:ind w:left="420" w:leftChars="200"/>
@@ -4764,6 +5269,7 @@
     <w:name w:val="table of figures"/>
     <w:basedOn w:val="1"/>
     <w:next w:val="1"/>
+    <w:qFormat/>
     <w:uiPriority w:val="0"/>
     <w:pPr>
       <w:ind w:leftChars="200" w:hanging="200" w:hangingChars="200"/>
@@ -5072,6 +5578,7 @@
   <w:style w:type="table" w:styleId="135">
     <w:name w:val="Table Subtle 2"/>
     <w:basedOn w:val="12"/>
+    <w:qFormat/>
     <w:uiPriority w:val="0"/>
     <w:pPr>
       <w:widowControl w:val="0"/>
@@ -5175,6 +5682,7 @@
   <w:style w:type="table" w:styleId="137">
     <w:name w:val="Table Web 1"/>
     <w:basedOn w:val="12"/>
+    <w:qFormat/>
     <w:uiPriority w:val="0"/>
     <w:pPr>
       <w:widowControl w:val="0"/>
@@ -5340,6 +5848,7 @@
     <w:name w:val="toc 3"/>
     <w:basedOn w:val="1"/>
     <w:next w:val="1"/>
+    <w:qFormat/>
     <w:uiPriority w:val="0"/>
     <w:pPr>
       <w:ind w:left="840" w:leftChars="400"/>
@@ -5406,6 +5915,7 @@
   <w:style w:type="table" w:styleId="151">
     <w:name w:val="Light Shading"/>
     <w:basedOn w:val="12"/>
+    <w:qFormat/>
     <w:uiPriority w:val="60"/>
     <w:rPr>
       <w:color w:val="000000"/>
@@ -5677,6 +6187,7 @@
   <w:style w:type="table" w:styleId="154">
     <w:name w:val="Light Shading Accent 3"/>
     <w:basedOn w:val="12"/>
+    <w:qFormat/>
     <w:uiPriority w:val="60"/>
     <w:rPr>
       <w:color w:val="76923C"/>
@@ -5857,6 +6368,7 @@
   <w:style w:type="table" w:styleId="156">
     <w:name w:val="Light Shading Accent 5"/>
     <w:basedOn w:val="12"/>
+    <w:qFormat/>
     <w:uiPriority w:val="60"/>
     <w:rPr>
       <w:color w:val="31849B"/>
@@ -6117,6 +6629,7 @@
   <w:style w:type="table" w:styleId="159">
     <w:name w:val="Light List Accent 1"/>
     <w:basedOn w:val="12"/>
+    <w:qFormat/>
     <w:uiPriority w:val="61"/>
     <w:tblPr>
       <w:tblBorders>
@@ -6513,6 +7026,7 @@
   <w:style w:type="table" w:styleId="164">
     <w:name w:val="Light List Accent 6"/>
     <w:basedOn w:val="12"/>
+    <w:qFormat/>
     <w:uiPriority w:val="61"/>
     <w:tblPr>
       <w:tblBorders>
@@ -7414,6 +7928,7 @@
   <w:style w:type="table" w:styleId="172">
     <w:name w:val="Medium Shading 1"/>
     <w:basedOn w:val="12"/>
+    <w:qFormat/>
     <w:uiPriority w:val="63"/>
     <w:tblPr>
       <w:tblBorders>

</xml_diff>

<commit_message>
feat(mobile): add event registration, QR code display and cancel registration
</commit_message>
<xml_diff>
--- a/BaoCaoTienDoThucTapTotNghiep.docx
+++ b/BaoCaoTienDoThucTapTotNghiep.docx
@@ -55,7 +55,7 @@
         <w:spacing w:before="120" w:beforeAutospacing="0" w:after="120" w:afterAutospacing="0" w:line="360" w:lineRule="auto"/>
         <w:textAlignment w:val="auto"/>
         <w:rPr>
-          <w:rFonts w:hint="default"/>
+          <w:rFonts w:hint="default" w:ascii="Times New Roman" w:hAnsi="Times New Roman" w:cs="Times New Roman"/>
         </w:rPr>
       </w:pPr>
     </w:p>
@@ -80,7 +80,7 @@
         <w:jc w:val="both"/>
         <w:textAlignment w:val="auto"/>
         <w:rPr>
-          <w:rFonts w:hint="default"/>
+          <w:rFonts w:hint="default" w:ascii="Times New Roman" w:hAnsi="Times New Roman" w:cs="Times New Roman"/>
         </w:rPr>
       </w:pPr>
       <w:r>
@@ -227,8 +227,6 @@
         </w:rPr>
         <w:t>Ngày 1 (04/03/2026)</w:t>
       </w:r>
-      <w:bookmarkStart w:id="0" w:name="_GoBack"/>
-      <w:bookmarkEnd w:id="0"/>
     </w:p>
     <w:p>
       <w:pPr>
@@ -586,7 +584,7 @@
       </w:pPr>
       <w:r>
         <w:rPr>
-          <w:rFonts w:hint="default" w:cs="Times New Roman"/>
+          <w:rFonts w:hint="default" w:ascii="Times New Roman" w:hAnsi="Times New Roman" w:cs="Times New Roman"/>
           <w:b/>
           <w:bCs/>
           <w:sz w:val="26"/>
@@ -624,12 +622,14 @@
         <w:ind w:left="600" w:leftChars="0" w:hanging="180" w:firstLineChars="0"/>
         <w:textAlignment w:val="auto"/>
         <w:rPr>
+          <w:rFonts w:hint="default" w:ascii="Times New Roman" w:hAnsi="Times New Roman" w:cs="Times New Roman"/>
           <w:b w:val="0"/>
           <w:bCs w:val="0"/>
         </w:rPr>
       </w:pPr>
       <w:r>
         <w:rPr>
+          <w:rFonts w:hint="default" w:ascii="Times New Roman" w:hAnsi="Times New Roman" w:cs="Times New Roman"/>
           <w:b w:val="0"/>
           <w:bCs w:val="0"/>
         </w:rPr>
@@ -638,6 +638,7 @@
       <w:r>
         <w:rPr>
           <w:rStyle w:val="92"/>
+          <w:rFonts w:hint="default" w:ascii="Times New Roman" w:hAnsi="Times New Roman" w:cs="Times New Roman"/>
           <w:b w:val="0"/>
           <w:bCs w:val="0"/>
         </w:rPr>
@@ -672,12 +673,14 @@
         <w:ind w:left="600" w:leftChars="0" w:hanging="180" w:firstLineChars="0"/>
         <w:textAlignment w:val="auto"/>
         <w:rPr>
+          <w:rFonts w:hint="default" w:ascii="Times New Roman" w:hAnsi="Times New Roman" w:cs="Times New Roman"/>
           <w:b w:val="0"/>
           <w:bCs w:val="0"/>
         </w:rPr>
       </w:pPr>
       <w:r>
         <w:rPr>
+          <w:rFonts w:hint="default" w:ascii="Times New Roman" w:hAnsi="Times New Roman" w:cs="Times New Roman"/>
           <w:b w:val="0"/>
           <w:bCs w:val="0"/>
         </w:rPr>
@@ -686,6 +689,7 @@
       <w:r>
         <w:rPr>
           <w:rStyle w:val="92"/>
+          <w:rFonts w:hint="default" w:ascii="Times New Roman" w:hAnsi="Times New Roman" w:cs="Times New Roman"/>
           <w:b w:val="0"/>
           <w:bCs w:val="0"/>
         </w:rPr>
@@ -720,7 +724,7 @@
         <w:ind w:left="600" w:leftChars="0" w:hanging="180" w:firstLineChars="0"/>
         <w:textAlignment w:val="auto"/>
         <w:rPr>
-          <w:rFonts w:hint="default"/>
+          <w:rFonts w:hint="default" w:ascii="Times New Roman" w:hAnsi="Times New Roman" w:cs="Times New Roman"/>
           <w:b w:val="0"/>
           <w:bCs w:val="0"/>
           <w:lang w:val="vi-VN"/>
@@ -728,6 +732,7 @@
       </w:pPr>
       <w:r>
         <w:rPr>
+          <w:rFonts w:hint="default" w:ascii="Times New Roman" w:hAnsi="Times New Roman" w:cs="Times New Roman"/>
           <w:b w:val="0"/>
           <w:bCs w:val="0"/>
         </w:rPr>
@@ -736,6 +741,7 @@
       <w:r>
         <w:rPr>
           <w:rStyle w:val="92"/>
+          <w:rFonts w:hint="default" w:ascii="Times New Roman" w:hAnsi="Times New Roman" w:cs="Times New Roman"/>
           <w:b w:val="0"/>
           <w:bCs w:val="0"/>
         </w:rPr>
@@ -744,7 +750,7 @@
       <w:r>
         <w:rPr>
           <w:rStyle w:val="92"/>
-          <w:rFonts w:hint="default"/>
+          <w:rFonts w:hint="default" w:ascii="Times New Roman" w:hAnsi="Times New Roman" w:cs="Times New Roman"/>
           <w:b w:val="0"/>
           <w:bCs w:val="0"/>
           <w:lang w:val="vi-VN"/>
@@ -780,12 +786,14 @@
         <w:ind w:left="600" w:leftChars="0" w:hanging="180" w:firstLineChars="0"/>
         <w:textAlignment w:val="auto"/>
         <w:rPr>
+          <w:rFonts w:hint="default" w:ascii="Times New Roman" w:hAnsi="Times New Roman" w:cs="Times New Roman"/>
           <w:b w:val="0"/>
           <w:bCs w:val="0"/>
         </w:rPr>
       </w:pPr>
       <w:r>
         <w:rPr>
+          <w:rFonts w:hint="default" w:ascii="Times New Roman" w:hAnsi="Times New Roman" w:cs="Times New Roman"/>
           <w:b w:val="0"/>
           <w:bCs w:val="0"/>
         </w:rPr>
@@ -794,6 +802,7 @@
       <w:r>
         <w:rPr>
           <w:rStyle w:val="92"/>
+          <w:rFonts w:hint="default" w:ascii="Times New Roman" w:hAnsi="Times New Roman" w:cs="Times New Roman"/>
           <w:b w:val="0"/>
           <w:bCs w:val="0"/>
         </w:rPr>
@@ -828,12 +837,14 @@
         <w:ind w:left="600" w:leftChars="0" w:hanging="180" w:firstLineChars="0"/>
         <w:textAlignment w:val="auto"/>
         <w:rPr>
+          <w:rFonts w:hint="default" w:ascii="Times New Roman" w:hAnsi="Times New Roman" w:cs="Times New Roman"/>
           <w:b w:val="0"/>
           <w:bCs w:val="0"/>
         </w:rPr>
       </w:pPr>
       <w:r>
         <w:rPr>
+          <w:rFonts w:hint="default" w:ascii="Times New Roman" w:hAnsi="Times New Roman" w:cs="Times New Roman"/>
           <w:b w:val="0"/>
           <w:bCs w:val="0"/>
         </w:rPr>
@@ -842,6 +853,7 @@
       <w:r>
         <w:rPr>
           <w:rStyle w:val="92"/>
+          <w:rFonts w:hint="default" w:ascii="Times New Roman" w:hAnsi="Times New Roman" w:cs="Times New Roman"/>
           <w:b w:val="0"/>
           <w:bCs w:val="0"/>
         </w:rPr>
@@ -876,12 +888,14 @@
         <w:ind w:left="600" w:leftChars="0" w:hanging="180" w:firstLineChars="0"/>
         <w:textAlignment w:val="auto"/>
         <w:rPr>
+          <w:rFonts w:hint="default" w:ascii="Times New Roman" w:hAnsi="Times New Roman" w:cs="Times New Roman"/>
           <w:b w:val="0"/>
           <w:bCs w:val="0"/>
         </w:rPr>
       </w:pPr>
       <w:r>
         <w:rPr>
+          <w:rFonts w:hint="default" w:ascii="Times New Roman" w:hAnsi="Times New Roman" w:cs="Times New Roman"/>
           <w:b w:val="0"/>
           <w:bCs w:val="0"/>
         </w:rPr>
@@ -890,6 +904,7 @@
       <w:r>
         <w:rPr>
           <w:rStyle w:val="92"/>
+          <w:rFonts w:hint="default" w:ascii="Times New Roman" w:hAnsi="Times New Roman" w:cs="Times New Roman"/>
           <w:b w:val="0"/>
           <w:bCs w:val="0"/>
         </w:rPr>
@@ -924,12 +939,14 @@
         <w:ind w:left="600" w:leftChars="0" w:hanging="180" w:firstLineChars="0"/>
         <w:textAlignment w:val="auto"/>
         <w:rPr>
+          <w:rFonts w:hint="default" w:ascii="Times New Roman" w:hAnsi="Times New Roman" w:cs="Times New Roman"/>
           <w:b w:val="0"/>
           <w:bCs w:val="0"/>
         </w:rPr>
       </w:pPr>
       <w:r>
         <w:rPr>
+          <w:rFonts w:hint="default" w:ascii="Times New Roman" w:hAnsi="Times New Roman" w:cs="Times New Roman"/>
           <w:b w:val="0"/>
           <w:bCs w:val="0"/>
         </w:rPr>
@@ -938,6 +955,7 @@
       <w:r>
         <w:rPr>
           <w:rStyle w:val="92"/>
+          <w:rFonts w:hint="default" w:ascii="Times New Roman" w:hAnsi="Times New Roman" w:cs="Times New Roman"/>
           <w:b w:val="0"/>
           <w:bCs w:val="0"/>
         </w:rPr>
@@ -982,6 +1000,7 @@
       </w:pPr>
       <w:r>
         <w:rPr>
+          <w:rFonts w:hint="default" w:ascii="Times New Roman" w:hAnsi="Times New Roman" w:cs="Times New Roman"/>
           <w:b w:val="0"/>
           <w:bCs w:val="0"/>
         </w:rPr>
@@ -990,15 +1009,42 @@
     </w:p>
     <w:p>
       <w:pPr>
+        <w:rPr>
+          <w:rFonts w:hint="default" w:ascii="Times New Roman" w:hAnsi="Times New Roman" w:cs="Times New Roman"/>
+          <w:b/>
+          <w:bCs/>
+          <w:sz w:val="26"/>
+          <w:szCs w:val="26"/>
+          <w:lang w:val="vi-VN"/>
+        </w:rPr>
+      </w:pPr>
+      <w:r>
+        <w:rPr>
+          <w:rFonts w:hint="default" w:ascii="Times New Roman" w:hAnsi="Times New Roman" w:cs="Times New Roman"/>
+          <w:b/>
+          <w:bCs/>
+          <w:sz w:val="26"/>
+          <w:szCs w:val="26"/>
+          <w:lang w:val="vi-VN"/>
+        </w:rPr>
+        <w:br w:type="page"/>
+      </w:r>
+    </w:p>
+    <w:p>
+      <w:pPr>
+        <w:pStyle w:val="85"/>
         <w:keepNext w:val="0"/>
         <w:keepLines w:val="0"/>
         <w:pageBreakBefore w:val="0"/>
         <w:widowControl/>
         <w:numPr>
           <w:ilvl w:val="0"/>
-          <w:numId w:val="0"/>
+          <w:numId w:val="11"/>
         </w:numPr>
         <w:suppressLineNumbers w:val="0"/>
+        <w:tabs>
+          <w:tab w:val="left" w:pos="600"/>
+        </w:tabs>
         <w:kinsoku/>
         <w:wordWrap/>
         <w:overflowPunct/>
@@ -1009,13 +1055,646 @@
         <w:adjustRightInd/>
         <w:snapToGrid/>
         <w:spacing w:before="120" w:beforeAutospacing="0" w:after="120" w:afterAutospacing="0" w:line="360" w:lineRule="auto"/>
+        <w:ind w:left="0" w:leftChars="0" w:right="0" w:rightChars="0" w:firstLine="0" w:firstLineChars="0"/>
         <w:textAlignment w:val="auto"/>
         <w:rPr>
           <w:rFonts w:hint="default" w:ascii="Times New Roman" w:hAnsi="Times New Roman" w:cs="Times New Roman"/>
+          <w:b/>
+          <w:bCs/>
+          <w:sz w:val="26"/>
+          <w:szCs w:val="26"/>
+          <w:lang w:val="vi-VN"/>
+        </w:rPr>
+      </w:pPr>
+      <w:r>
+        <w:rPr>
+          <w:rFonts w:hint="default" w:ascii="Times New Roman" w:hAnsi="Times New Roman" w:cs="Times New Roman"/>
+          <w:b/>
+          <w:bCs/>
+          <w:sz w:val="26"/>
+          <w:szCs w:val="26"/>
+          <w:lang w:val="vi-VN"/>
+        </w:rPr>
+        <w:t>Ngày 3 (06/03/2026)</w:t>
+      </w:r>
+    </w:p>
+    <w:p>
+      <w:pPr>
+        <w:pStyle w:val="85"/>
+        <w:keepNext w:val="0"/>
+        <w:keepLines w:val="0"/>
+        <w:pageBreakBefore w:val="0"/>
+        <w:widowControl/>
+        <w:numPr>
+          <w:ilvl w:val="0"/>
+          <w:numId w:val="14"/>
+        </w:numPr>
+        <w:suppressLineNumbers w:val="0"/>
+        <w:tabs>
+          <w:tab w:val="clear" w:pos="420"/>
+        </w:tabs>
+        <w:kinsoku/>
+        <w:wordWrap/>
+        <w:overflowPunct/>
+        <w:topLinePunct w:val="0"/>
+        <w:autoSpaceDE/>
+        <w:autoSpaceDN/>
+        <w:bidi w:val="0"/>
+        <w:adjustRightInd/>
+        <w:snapToGrid/>
+        <w:spacing w:before="120" w:beforeAutospacing="0" w:after="120" w:afterAutospacing="0" w:line="360" w:lineRule="auto"/>
+        <w:ind w:left="600" w:leftChars="0" w:hanging="200" w:firstLineChars="0"/>
+        <w:textAlignment w:val="auto"/>
+        <w:rPr>
+          <w:rFonts w:hint="default" w:ascii="Times New Roman" w:hAnsi="Times New Roman" w:cs="Times New Roman"/>
+          <w:b w:val="0"/>
+          <w:bCs w:val="0"/>
           <w:sz w:val="26"/>
           <w:szCs w:val="26"/>
         </w:rPr>
       </w:pPr>
+      <w:r>
+        <w:rPr>
+          <w:rFonts w:hint="default" w:ascii="Times New Roman" w:hAnsi="Times New Roman" w:cs="Times New Roman"/>
+          <w:b w:val="0"/>
+          <w:bCs w:val="0"/>
+          <w:sz w:val="26"/>
+          <w:szCs w:val="26"/>
+        </w:rPr>
+        <w:t xml:space="preserve">Thiết lập và cấu hình project </w:t>
+      </w:r>
+      <w:r>
+        <w:rPr>
+          <w:rStyle w:val="92"/>
+          <w:rFonts w:hint="default" w:ascii="Times New Roman" w:hAnsi="Times New Roman" w:cs="Times New Roman"/>
+          <w:b w:val="0"/>
+          <w:bCs w:val="0"/>
+          <w:sz w:val="26"/>
+          <w:szCs w:val="26"/>
+        </w:rPr>
+        <w:t>Flutter Mobile App</w:t>
+      </w:r>
+      <w:r>
+        <w:rPr>
+          <w:rFonts w:hint="default" w:ascii="Times New Roman" w:hAnsi="Times New Roman" w:cs="Times New Roman"/>
+          <w:b w:val="0"/>
+          <w:bCs w:val="0"/>
+          <w:sz w:val="26"/>
+          <w:szCs w:val="26"/>
+        </w:rPr>
+        <w:t>.</w:t>
+      </w:r>
+      <w:bookmarkStart w:id="0" w:name="_GoBack"/>
+      <w:bookmarkEnd w:id="0"/>
+    </w:p>
+    <w:p>
+      <w:pPr>
+        <w:pStyle w:val="85"/>
+        <w:keepNext w:val="0"/>
+        <w:keepLines w:val="0"/>
+        <w:pageBreakBefore w:val="0"/>
+        <w:widowControl/>
+        <w:numPr>
+          <w:ilvl w:val="0"/>
+          <w:numId w:val="14"/>
+        </w:numPr>
+        <w:suppressLineNumbers w:val="0"/>
+        <w:tabs>
+          <w:tab w:val="clear" w:pos="420"/>
+        </w:tabs>
+        <w:kinsoku/>
+        <w:wordWrap/>
+        <w:overflowPunct/>
+        <w:topLinePunct w:val="0"/>
+        <w:autoSpaceDE/>
+        <w:autoSpaceDN/>
+        <w:bidi w:val="0"/>
+        <w:adjustRightInd/>
+        <w:snapToGrid/>
+        <w:spacing w:before="120" w:beforeAutospacing="0" w:after="120" w:afterAutospacing="0" w:line="360" w:lineRule="auto"/>
+        <w:ind w:left="600" w:leftChars="0" w:hanging="200" w:firstLineChars="0"/>
+        <w:textAlignment w:val="auto"/>
+        <w:rPr>
+          <w:rFonts w:hint="default" w:ascii="Times New Roman" w:hAnsi="Times New Roman" w:cs="Times New Roman"/>
+          <w:b w:val="0"/>
+          <w:bCs w:val="0"/>
+          <w:sz w:val="26"/>
+          <w:szCs w:val="26"/>
+        </w:rPr>
+      </w:pPr>
+      <w:r>
+        <w:rPr>
+          <w:rFonts w:hint="default" w:ascii="Times New Roman" w:hAnsi="Times New Roman" w:cs="Times New Roman"/>
+          <w:b w:val="0"/>
+          <w:bCs w:val="0"/>
+          <w:sz w:val="26"/>
+          <w:szCs w:val="26"/>
+        </w:rPr>
+        <w:t xml:space="preserve">Tổ chức cấu trúc thư mục: </w:t>
+      </w:r>
+      <w:r>
+        <w:rPr>
+          <w:rStyle w:val="44"/>
+          <w:rFonts w:hint="default" w:ascii="Times New Roman" w:hAnsi="Times New Roman" w:cs="Times New Roman"/>
+          <w:b w:val="0"/>
+          <w:bCs w:val="0"/>
+          <w:sz w:val="26"/>
+          <w:szCs w:val="26"/>
+        </w:rPr>
+        <w:t>models</w:t>
+      </w:r>
+      <w:r>
+        <w:rPr>
+          <w:rFonts w:hint="default" w:ascii="Times New Roman" w:hAnsi="Times New Roman" w:cs="Times New Roman"/>
+          <w:b w:val="0"/>
+          <w:bCs w:val="0"/>
+          <w:sz w:val="26"/>
+          <w:szCs w:val="26"/>
+        </w:rPr>
+        <w:t xml:space="preserve">, </w:t>
+      </w:r>
+      <w:r>
+        <w:rPr>
+          <w:rStyle w:val="44"/>
+          <w:rFonts w:hint="default" w:ascii="Times New Roman" w:hAnsi="Times New Roman" w:cs="Times New Roman"/>
+          <w:b w:val="0"/>
+          <w:bCs w:val="0"/>
+          <w:sz w:val="26"/>
+          <w:szCs w:val="26"/>
+        </w:rPr>
+        <w:t>services</w:t>
+      </w:r>
+      <w:r>
+        <w:rPr>
+          <w:rFonts w:hint="default" w:ascii="Times New Roman" w:hAnsi="Times New Roman" w:cs="Times New Roman"/>
+          <w:b w:val="0"/>
+          <w:bCs w:val="0"/>
+          <w:sz w:val="26"/>
+          <w:szCs w:val="26"/>
+        </w:rPr>
+        <w:t xml:space="preserve">, </w:t>
+      </w:r>
+      <w:r>
+        <w:rPr>
+          <w:rStyle w:val="44"/>
+          <w:rFonts w:hint="default" w:ascii="Times New Roman" w:hAnsi="Times New Roman" w:cs="Times New Roman"/>
+          <w:b w:val="0"/>
+          <w:bCs w:val="0"/>
+          <w:sz w:val="26"/>
+          <w:szCs w:val="26"/>
+        </w:rPr>
+        <w:t>config</w:t>
+      </w:r>
+      <w:r>
+        <w:rPr>
+          <w:rFonts w:hint="default" w:ascii="Times New Roman" w:hAnsi="Times New Roman" w:cs="Times New Roman"/>
+          <w:b w:val="0"/>
+          <w:bCs w:val="0"/>
+          <w:sz w:val="26"/>
+          <w:szCs w:val="26"/>
+        </w:rPr>
+        <w:t>.</w:t>
+      </w:r>
+    </w:p>
+    <w:p>
+      <w:pPr>
+        <w:pStyle w:val="85"/>
+        <w:keepNext w:val="0"/>
+        <w:keepLines w:val="0"/>
+        <w:pageBreakBefore w:val="0"/>
+        <w:widowControl/>
+        <w:numPr>
+          <w:ilvl w:val="0"/>
+          <w:numId w:val="14"/>
+        </w:numPr>
+        <w:suppressLineNumbers w:val="0"/>
+        <w:tabs>
+          <w:tab w:val="clear" w:pos="420"/>
+        </w:tabs>
+        <w:kinsoku/>
+        <w:wordWrap/>
+        <w:overflowPunct/>
+        <w:topLinePunct w:val="0"/>
+        <w:autoSpaceDE/>
+        <w:autoSpaceDN/>
+        <w:bidi w:val="0"/>
+        <w:adjustRightInd/>
+        <w:snapToGrid/>
+        <w:spacing w:before="120" w:beforeAutospacing="0" w:after="120" w:afterAutospacing="0" w:line="360" w:lineRule="auto"/>
+        <w:ind w:left="600" w:leftChars="0" w:hanging="200" w:firstLineChars="0"/>
+        <w:textAlignment w:val="auto"/>
+        <w:rPr>
+          <w:rFonts w:hint="default" w:ascii="Times New Roman" w:hAnsi="Times New Roman" w:cs="Times New Roman"/>
+          <w:b w:val="0"/>
+          <w:bCs w:val="0"/>
+          <w:sz w:val="26"/>
+          <w:szCs w:val="26"/>
+        </w:rPr>
+      </w:pPr>
+      <w:r>
+        <w:rPr>
+          <w:rFonts w:hint="default" w:ascii="Times New Roman" w:hAnsi="Times New Roman" w:cs="Times New Roman"/>
+          <w:b w:val="0"/>
+          <w:bCs w:val="0"/>
+          <w:sz w:val="26"/>
+          <w:szCs w:val="26"/>
+        </w:rPr>
+        <w:t xml:space="preserve">Tạo các </w:t>
+      </w:r>
+      <w:r>
+        <w:rPr>
+          <w:rStyle w:val="92"/>
+          <w:rFonts w:hint="default" w:ascii="Times New Roman" w:hAnsi="Times New Roman" w:cs="Times New Roman"/>
+          <w:b w:val="0"/>
+          <w:bCs w:val="0"/>
+          <w:sz w:val="26"/>
+          <w:szCs w:val="26"/>
+        </w:rPr>
+        <w:t>model dữ liệu</w:t>
+      </w:r>
+      <w:r>
+        <w:rPr>
+          <w:rFonts w:hint="default" w:ascii="Times New Roman" w:hAnsi="Times New Roman" w:cs="Times New Roman"/>
+          <w:b w:val="0"/>
+          <w:bCs w:val="0"/>
+          <w:sz w:val="26"/>
+          <w:szCs w:val="26"/>
+        </w:rPr>
+        <w:t xml:space="preserve">: </w:t>
+      </w:r>
+      <w:r>
+        <w:rPr>
+          <w:rStyle w:val="44"/>
+          <w:rFonts w:hint="default" w:ascii="Times New Roman" w:hAnsi="Times New Roman" w:cs="Times New Roman"/>
+          <w:b w:val="0"/>
+          <w:bCs w:val="0"/>
+          <w:sz w:val="26"/>
+          <w:szCs w:val="26"/>
+        </w:rPr>
+        <w:t>User</w:t>
+      </w:r>
+      <w:r>
+        <w:rPr>
+          <w:rFonts w:hint="default" w:ascii="Times New Roman" w:hAnsi="Times New Roman" w:cs="Times New Roman"/>
+          <w:b w:val="0"/>
+          <w:bCs w:val="0"/>
+          <w:sz w:val="26"/>
+          <w:szCs w:val="26"/>
+        </w:rPr>
+        <w:t xml:space="preserve">, </w:t>
+      </w:r>
+      <w:r>
+        <w:rPr>
+          <w:rStyle w:val="44"/>
+          <w:rFonts w:hint="default" w:ascii="Times New Roman" w:hAnsi="Times New Roman" w:cs="Times New Roman"/>
+          <w:b w:val="0"/>
+          <w:bCs w:val="0"/>
+          <w:sz w:val="26"/>
+          <w:szCs w:val="26"/>
+        </w:rPr>
+        <w:t>Event</w:t>
+      </w:r>
+      <w:r>
+        <w:rPr>
+          <w:rFonts w:hint="default" w:ascii="Times New Roman" w:hAnsi="Times New Roman" w:cs="Times New Roman"/>
+          <w:b w:val="0"/>
+          <w:bCs w:val="0"/>
+          <w:sz w:val="26"/>
+          <w:szCs w:val="26"/>
+        </w:rPr>
+        <w:t xml:space="preserve">, </w:t>
+      </w:r>
+      <w:r>
+        <w:rPr>
+          <w:rStyle w:val="44"/>
+          <w:rFonts w:hint="default" w:ascii="Times New Roman" w:hAnsi="Times New Roman" w:cs="Times New Roman"/>
+          <w:b w:val="0"/>
+          <w:bCs w:val="0"/>
+          <w:sz w:val="26"/>
+          <w:szCs w:val="26"/>
+        </w:rPr>
+        <w:t>Registration</w:t>
+      </w:r>
+      <w:r>
+        <w:rPr>
+          <w:rFonts w:hint="default" w:ascii="Times New Roman" w:hAnsi="Times New Roman" w:cs="Times New Roman"/>
+          <w:b w:val="0"/>
+          <w:bCs w:val="0"/>
+          <w:sz w:val="26"/>
+          <w:szCs w:val="26"/>
+        </w:rPr>
+        <w:t>.</w:t>
+      </w:r>
+    </w:p>
+    <w:p>
+      <w:pPr>
+        <w:pStyle w:val="85"/>
+        <w:keepNext w:val="0"/>
+        <w:keepLines w:val="0"/>
+        <w:pageBreakBefore w:val="0"/>
+        <w:widowControl/>
+        <w:numPr>
+          <w:ilvl w:val="0"/>
+          <w:numId w:val="14"/>
+        </w:numPr>
+        <w:suppressLineNumbers w:val="0"/>
+        <w:tabs>
+          <w:tab w:val="clear" w:pos="420"/>
+        </w:tabs>
+        <w:kinsoku/>
+        <w:wordWrap/>
+        <w:overflowPunct/>
+        <w:topLinePunct w:val="0"/>
+        <w:autoSpaceDE/>
+        <w:autoSpaceDN/>
+        <w:bidi w:val="0"/>
+        <w:adjustRightInd/>
+        <w:snapToGrid/>
+        <w:spacing w:before="120" w:beforeAutospacing="0" w:after="120" w:afterAutospacing="0" w:line="360" w:lineRule="auto"/>
+        <w:ind w:left="600" w:leftChars="0" w:hanging="200" w:firstLineChars="0"/>
+        <w:textAlignment w:val="auto"/>
+        <w:rPr>
+          <w:rFonts w:hint="default" w:ascii="Times New Roman" w:hAnsi="Times New Roman" w:cs="Times New Roman"/>
+          <w:b w:val="0"/>
+          <w:bCs w:val="0"/>
+          <w:sz w:val="26"/>
+          <w:szCs w:val="26"/>
+        </w:rPr>
+      </w:pPr>
+      <w:r>
+        <w:rPr>
+          <w:rFonts w:hint="default" w:ascii="Times New Roman" w:hAnsi="Times New Roman" w:cs="Times New Roman"/>
+          <w:b w:val="0"/>
+          <w:bCs w:val="0"/>
+          <w:sz w:val="26"/>
+          <w:szCs w:val="26"/>
+        </w:rPr>
+        <w:t xml:space="preserve">Cấu hình file </w:t>
+      </w:r>
+      <w:r>
+        <w:rPr>
+          <w:rStyle w:val="44"/>
+          <w:rFonts w:hint="default" w:ascii="Times New Roman" w:hAnsi="Times New Roman" w:cs="Times New Roman"/>
+          <w:b w:val="0"/>
+          <w:bCs w:val="0"/>
+          <w:sz w:val="26"/>
+          <w:szCs w:val="26"/>
+        </w:rPr>
+        <w:t>api_config.dart</w:t>
+      </w:r>
+      <w:r>
+        <w:rPr>
+          <w:rFonts w:hint="default" w:ascii="Times New Roman" w:hAnsi="Times New Roman" w:cs="Times New Roman"/>
+          <w:b w:val="0"/>
+          <w:bCs w:val="0"/>
+          <w:sz w:val="26"/>
+          <w:szCs w:val="26"/>
+        </w:rPr>
+        <w:t xml:space="preserve"> để quản lý địa chỉ </w:t>
+      </w:r>
+      <w:r>
+        <w:rPr>
+          <w:rStyle w:val="92"/>
+          <w:rFonts w:hint="default" w:ascii="Times New Roman" w:hAnsi="Times New Roman" w:cs="Times New Roman"/>
+          <w:b w:val="0"/>
+          <w:bCs w:val="0"/>
+          <w:sz w:val="26"/>
+          <w:szCs w:val="26"/>
+        </w:rPr>
+        <w:t>Backend API</w:t>
+      </w:r>
+      <w:r>
+        <w:rPr>
+          <w:rFonts w:hint="default" w:ascii="Times New Roman" w:hAnsi="Times New Roman" w:cs="Times New Roman"/>
+          <w:b w:val="0"/>
+          <w:bCs w:val="0"/>
+          <w:sz w:val="26"/>
+          <w:szCs w:val="26"/>
+        </w:rPr>
+        <w:t>.</w:t>
+      </w:r>
+    </w:p>
+    <w:p>
+      <w:pPr>
+        <w:pStyle w:val="85"/>
+        <w:keepNext w:val="0"/>
+        <w:keepLines w:val="0"/>
+        <w:pageBreakBefore w:val="0"/>
+        <w:widowControl/>
+        <w:numPr>
+          <w:ilvl w:val="0"/>
+          <w:numId w:val="14"/>
+        </w:numPr>
+        <w:suppressLineNumbers w:val="0"/>
+        <w:tabs>
+          <w:tab w:val="clear" w:pos="420"/>
+        </w:tabs>
+        <w:kinsoku/>
+        <w:wordWrap/>
+        <w:overflowPunct/>
+        <w:topLinePunct w:val="0"/>
+        <w:autoSpaceDE/>
+        <w:autoSpaceDN/>
+        <w:bidi w:val="0"/>
+        <w:adjustRightInd/>
+        <w:snapToGrid/>
+        <w:spacing w:before="120" w:beforeAutospacing="0" w:after="120" w:afterAutospacing="0" w:line="360" w:lineRule="auto"/>
+        <w:ind w:left="600" w:leftChars="0" w:hanging="200" w:firstLineChars="0"/>
+        <w:textAlignment w:val="auto"/>
+        <w:rPr>
+          <w:rFonts w:hint="default" w:ascii="Times New Roman" w:hAnsi="Times New Roman" w:cs="Times New Roman"/>
+          <w:b w:val="0"/>
+          <w:bCs w:val="0"/>
+          <w:sz w:val="26"/>
+          <w:szCs w:val="26"/>
+        </w:rPr>
+      </w:pPr>
+      <w:r>
+        <w:rPr>
+          <w:rFonts w:hint="default" w:ascii="Times New Roman" w:hAnsi="Times New Roman" w:cs="Times New Roman"/>
+          <w:b w:val="0"/>
+          <w:bCs w:val="0"/>
+          <w:sz w:val="26"/>
+          <w:szCs w:val="26"/>
+        </w:rPr>
+        <w:t xml:space="preserve">Xây dựng </w:t>
+      </w:r>
+      <w:r>
+        <w:rPr>
+          <w:rStyle w:val="44"/>
+          <w:rFonts w:hint="default" w:ascii="Times New Roman" w:hAnsi="Times New Roman" w:cs="Times New Roman"/>
+          <w:b w:val="0"/>
+          <w:bCs w:val="0"/>
+          <w:sz w:val="26"/>
+          <w:szCs w:val="26"/>
+        </w:rPr>
+        <w:t>ApiService</w:t>
+      </w:r>
+      <w:r>
+        <w:rPr>
+          <w:rFonts w:hint="default" w:ascii="Times New Roman" w:hAnsi="Times New Roman" w:cs="Times New Roman"/>
+          <w:b w:val="0"/>
+          <w:bCs w:val="0"/>
+          <w:sz w:val="26"/>
+          <w:szCs w:val="26"/>
+        </w:rPr>
+        <w:t xml:space="preserve"> để gửi request từ Flutter đến </w:t>
+      </w:r>
+      <w:r>
+        <w:rPr>
+          <w:rStyle w:val="92"/>
+          <w:rFonts w:hint="default" w:ascii="Times New Roman" w:hAnsi="Times New Roman" w:cs="Times New Roman"/>
+          <w:b w:val="0"/>
+          <w:bCs w:val="0"/>
+          <w:sz w:val="26"/>
+          <w:szCs w:val="26"/>
+        </w:rPr>
+        <w:t>NodeJS backend</w:t>
+      </w:r>
+      <w:r>
+        <w:rPr>
+          <w:rFonts w:hint="default" w:ascii="Times New Roman" w:hAnsi="Times New Roman" w:cs="Times New Roman"/>
+          <w:b w:val="0"/>
+          <w:bCs w:val="0"/>
+          <w:sz w:val="26"/>
+          <w:szCs w:val="26"/>
+        </w:rPr>
+        <w:t>.</w:t>
+      </w:r>
+    </w:p>
+    <w:p>
+      <w:pPr>
+        <w:pStyle w:val="85"/>
+        <w:keepNext w:val="0"/>
+        <w:keepLines w:val="0"/>
+        <w:pageBreakBefore w:val="0"/>
+        <w:widowControl/>
+        <w:numPr>
+          <w:ilvl w:val="0"/>
+          <w:numId w:val="14"/>
+        </w:numPr>
+        <w:suppressLineNumbers w:val="0"/>
+        <w:tabs>
+          <w:tab w:val="clear" w:pos="420"/>
+        </w:tabs>
+        <w:kinsoku/>
+        <w:wordWrap/>
+        <w:overflowPunct/>
+        <w:topLinePunct w:val="0"/>
+        <w:autoSpaceDE/>
+        <w:autoSpaceDN/>
+        <w:bidi w:val="0"/>
+        <w:adjustRightInd/>
+        <w:snapToGrid/>
+        <w:spacing w:before="120" w:beforeAutospacing="0" w:after="120" w:afterAutospacing="0" w:line="360" w:lineRule="auto"/>
+        <w:ind w:left="600" w:leftChars="0" w:hanging="200" w:firstLineChars="0"/>
+        <w:textAlignment w:val="auto"/>
+        <w:rPr>
+          <w:rFonts w:hint="default" w:ascii="Times New Roman" w:hAnsi="Times New Roman" w:cs="Times New Roman"/>
+          <w:b w:val="0"/>
+          <w:bCs w:val="0"/>
+          <w:sz w:val="26"/>
+          <w:szCs w:val="26"/>
+        </w:rPr>
+      </w:pPr>
+      <w:r>
+        <w:rPr>
+          <w:rFonts w:hint="default" w:ascii="Times New Roman" w:hAnsi="Times New Roman" w:cs="Times New Roman"/>
+          <w:b w:val="0"/>
+          <w:bCs w:val="0"/>
+          <w:sz w:val="26"/>
+          <w:szCs w:val="26"/>
+        </w:rPr>
+        <w:t xml:space="preserve">Kiểm tra kết nối giữa </w:t>
+      </w:r>
+      <w:r>
+        <w:rPr>
+          <w:rStyle w:val="92"/>
+          <w:rFonts w:hint="default" w:ascii="Times New Roman" w:hAnsi="Times New Roman" w:cs="Times New Roman"/>
+          <w:b w:val="0"/>
+          <w:bCs w:val="0"/>
+          <w:sz w:val="26"/>
+          <w:szCs w:val="26"/>
+        </w:rPr>
+        <w:t>mobile app và backend server</w:t>
+      </w:r>
+      <w:r>
+        <w:rPr>
+          <w:rFonts w:hint="default" w:ascii="Times New Roman" w:hAnsi="Times New Roman" w:cs="Times New Roman"/>
+          <w:b w:val="0"/>
+          <w:bCs w:val="0"/>
+          <w:sz w:val="26"/>
+          <w:szCs w:val="26"/>
+        </w:rPr>
+        <w:t>.</w:t>
+      </w:r>
+    </w:p>
+    <w:p>
+      <w:pPr>
+        <w:pStyle w:val="85"/>
+        <w:keepNext w:val="0"/>
+        <w:keepLines w:val="0"/>
+        <w:pageBreakBefore w:val="0"/>
+        <w:widowControl/>
+        <w:numPr>
+          <w:ilvl w:val="0"/>
+          <w:numId w:val="14"/>
+        </w:numPr>
+        <w:suppressLineNumbers w:val="0"/>
+        <w:tabs>
+          <w:tab w:val="clear" w:pos="420"/>
+        </w:tabs>
+        <w:kinsoku/>
+        <w:wordWrap/>
+        <w:overflowPunct/>
+        <w:topLinePunct w:val="0"/>
+        <w:autoSpaceDE/>
+        <w:autoSpaceDN/>
+        <w:bidi w:val="0"/>
+        <w:adjustRightInd/>
+        <w:snapToGrid/>
+        <w:spacing w:before="120" w:beforeAutospacing="0" w:after="120" w:afterAutospacing="0" w:line="360" w:lineRule="auto"/>
+        <w:ind w:left="600" w:leftChars="0" w:hanging="200" w:firstLineChars="0"/>
+        <w:textAlignment w:val="auto"/>
+        <w:rPr>
+          <w:rFonts w:hint="default" w:ascii="Times New Roman" w:hAnsi="Times New Roman" w:cs="Times New Roman"/>
+          <w:b w:val="0"/>
+          <w:bCs w:val="0"/>
+          <w:sz w:val="26"/>
+          <w:szCs w:val="26"/>
+        </w:rPr>
+      </w:pPr>
+      <w:r>
+        <w:rPr>
+          <w:rFonts w:hint="default" w:ascii="Times New Roman" w:hAnsi="Times New Roman" w:cs="Times New Roman"/>
+          <w:b w:val="0"/>
+          <w:bCs w:val="0"/>
+          <w:sz w:val="26"/>
+          <w:szCs w:val="26"/>
+        </w:rPr>
+        <w:t xml:space="preserve">Chuẩn bị nền tảng để phát triển các chức năng tiếp theo như </w:t>
+      </w:r>
+      <w:r>
+        <w:rPr>
+          <w:rStyle w:val="92"/>
+          <w:rFonts w:hint="default" w:ascii="Times New Roman" w:hAnsi="Times New Roman" w:cs="Times New Roman"/>
+          <w:b w:val="0"/>
+          <w:bCs w:val="0"/>
+          <w:sz w:val="26"/>
+          <w:szCs w:val="26"/>
+        </w:rPr>
+        <w:t>đăng nhập, danh sách sự kiện và QR code điểm danh</w:t>
+      </w:r>
+      <w:r>
+        <w:rPr>
+          <w:rFonts w:hint="default" w:ascii="Times New Roman" w:hAnsi="Times New Roman" w:cs="Times New Roman"/>
+          <w:b w:val="0"/>
+          <w:bCs w:val="0"/>
+          <w:sz w:val="26"/>
+          <w:szCs w:val="26"/>
+        </w:rPr>
+        <w:t>.</w:t>
+      </w:r>
     </w:p>
     <w:p>
       <w:pPr>
@@ -1261,6 +1940,28 @@
     </w:lvl>
   </w:abstractNum>
   <w:abstractNum w:abstractNumId="11">
+    <w:nsid w:val="36852227"/>
+    <w:multiLevelType w:val="singleLevel"/>
+    <w:tmpl w:val="36852227"/>
+    <w:lvl w:ilvl="0" w:tentative="0">
+      <w:start w:val="1"/>
+      <w:numFmt w:val="bullet"/>
+      <w:lvlText w:val=""/>
+      <w:lvlJc w:val="left"/>
+      <w:pPr>
+        <w:tabs>
+          <w:tab w:val="left" w:pos="420"/>
+        </w:tabs>
+        <w:ind w:left="820" w:leftChars="0" w:hanging="420" w:firstLineChars="0"/>
+      </w:pPr>
+      <w:rPr>
+        <w:rFonts w:hint="default" w:ascii="Wingdings" w:hAnsi="Wingdings"/>
+        <w:sz w:val="16"/>
+        <w:szCs w:val="16"/>
+      </w:rPr>
+    </w:lvl>
+  </w:abstractNum>
+  <w:abstractNum w:abstractNumId="12">
     <w:nsid w:val="4CD697B2"/>
     <w:multiLevelType w:val="singleLevel"/>
     <w:tmpl w:val="4CD697B2"/>
@@ -1282,7 +1983,7 @@
       </w:rPr>
     </w:lvl>
   </w:abstractNum>
-  <w:abstractNum w:abstractNumId="12">
+  <w:abstractNum w:abstractNumId="13">
     <w:nsid w:val="6027A911"/>
     <w:multiLevelType w:val="singleLevel"/>
     <w:tmpl w:val="6027A911"/>
@@ -1338,10 +2039,13 @@
     <w:abstractNumId w:val="0"/>
   </w:num>
   <w:num w:numId="12">
-    <w:abstractNumId w:val="11"/>
+    <w:abstractNumId w:val="12"/>
   </w:num>
   <w:num w:numId="13">
-    <w:abstractNumId w:val="12"/>
+    <w:abstractNumId w:val="13"/>
+  </w:num>
+  <w:num w:numId="14">
+    <w:abstractNumId w:val="11"/>
   </w:num>
 </w:numbering>
 </file>
@@ -1368,11 +2072,11 @@
     <w:lsdException w:qFormat="1" w:uiPriority="0" w:name="heading 8"/>
     <w:lsdException w:qFormat="1" w:uiPriority="0" w:name="heading 9"/>
     <w:lsdException w:qFormat="1" w:unhideWhenUsed="0" w:uiPriority="0" w:semiHidden="0" w:name="index 1"/>
-    <w:lsdException w:unhideWhenUsed="0" w:uiPriority="0" w:semiHidden="0" w:name="index 2"/>
-    <w:lsdException w:unhideWhenUsed="0" w:uiPriority="0" w:semiHidden="0" w:name="index 3"/>
+    <w:lsdException w:qFormat="1" w:unhideWhenUsed="0" w:uiPriority="0" w:semiHidden="0" w:name="index 2"/>
+    <w:lsdException w:qFormat="1" w:unhideWhenUsed="0" w:uiPriority="0" w:semiHidden="0" w:name="index 3"/>
     <w:lsdException w:qFormat="1" w:unhideWhenUsed="0" w:uiPriority="0" w:semiHidden="0" w:name="index 4"/>
     <w:lsdException w:qFormat="1" w:unhideWhenUsed="0" w:uiPriority="0" w:semiHidden="0" w:name="index 5"/>
-    <w:lsdException w:unhideWhenUsed="0" w:uiPriority="0" w:semiHidden="0" w:name="index 6"/>
+    <w:lsdException w:qFormat="1" w:unhideWhenUsed="0" w:uiPriority="0" w:semiHidden="0" w:name="index 6"/>
     <w:lsdException w:qFormat="1" w:unhideWhenUsed="0" w:uiPriority="0" w:semiHidden="0" w:name="index 7"/>
     <w:lsdException w:unhideWhenUsed="0" w:uiPriority="0" w:semiHidden="0" w:name="index 8"/>
     <w:lsdException w:qFormat="1" w:unhideWhenUsed="0" w:uiPriority="0" w:semiHidden="0" w:name="index 9"/>
@@ -1388,8 +2092,8 @@
     <w:lsdException w:qFormat="1" w:unhideWhenUsed="0" w:uiPriority="0" w:semiHidden="0" w:name="Normal Indent"/>
     <w:lsdException w:qFormat="1" w:unhideWhenUsed="0" w:uiPriority="0" w:semiHidden="0" w:name="footnote text"/>
     <w:lsdException w:qFormat="1" w:unhideWhenUsed="0" w:uiPriority="0" w:semiHidden="0" w:name="annotation text"/>
-    <w:lsdException w:unhideWhenUsed="0" w:uiPriority="0" w:semiHidden="0" w:name="header"/>
-    <w:lsdException w:unhideWhenUsed="0" w:uiPriority="0" w:semiHidden="0" w:name="footer"/>
+    <w:lsdException w:qFormat="1" w:unhideWhenUsed="0" w:uiPriority="0" w:semiHidden="0" w:name="header"/>
+    <w:lsdException w:qFormat="1" w:unhideWhenUsed="0" w:uiPriority="0" w:semiHidden="0" w:name="footer"/>
     <w:lsdException w:unhideWhenUsed="0" w:uiPriority="0" w:semiHidden="0" w:name="index heading"/>
     <w:lsdException w:qFormat="1" w:uiPriority="0" w:name="caption"/>
     <w:lsdException w:qFormat="1" w:unhideWhenUsed="0" w:uiPriority="0" w:semiHidden="0" w:name="table of figures"/>
@@ -1399,7 +2103,7 @@
     <w:lsdException w:qFormat="1" w:unhideWhenUsed="0" w:uiPriority="0" w:semiHidden="0" w:name="annotation reference"/>
     <w:lsdException w:qFormat="1" w:unhideWhenUsed="0" w:uiPriority="0" w:semiHidden="0" w:name="line number"/>
     <w:lsdException w:qFormat="1" w:unhideWhenUsed="0" w:uiPriority="0" w:semiHidden="0" w:name="page number"/>
-    <w:lsdException w:unhideWhenUsed="0" w:uiPriority="0" w:semiHidden="0" w:name="endnote reference"/>
+    <w:lsdException w:qFormat="1" w:unhideWhenUsed="0" w:uiPriority="0" w:semiHidden="0" w:name="endnote reference"/>
     <w:lsdException w:qFormat="1" w:unhideWhenUsed="0" w:uiPriority="0" w:semiHidden="0" w:name="endnote text"/>
     <w:lsdException w:qFormat="1" w:unhideWhenUsed="0" w:uiPriority="0" w:semiHidden="0" w:name="table of authorities"/>
     <w:lsdException w:unhideWhenUsed="0" w:uiPriority="0" w:semiHidden="0" w:name="macro"/>
@@ -1412,7 +2116,7 @@
     <w:lsdException w:qFormat="1" w:unhideWhenUsed="0" w:uiPriority="0" w:semiHidden="0" w:name="List 4"/>
     <w:lsdException w:unhideWhenUsed="0" w:uiPriority="0" w:semiHidden="0" w:name="List 5"/>
     <w:lsdException w:qFormat="1" w:unhideWhenUsed="0" w:uiPriority="0" w:semiHidden="0" w:name="List Bullet 2"/>
-    <w:lsdException w:unhideWhenUsed="0" w:uiPriority="0" w:semiHidden="0" w:name="List Bullet 3"/>
+    <w:lsdException w:qFormat="1" w:unhideWhenUsed="0" w:uiPriority="0" w:semiHidden="0" w:name="List Bullet 3"/>
     <w:lsdException w:qFormat="1" w:unhideWhenUsed="0" w:uiPriority="0" w:semiHidden="0" w:name="List Bullet 4"/>
     <w:lsdException w:qFormat="1" w:unhideWhenUsed="0" w:uiPriority="0" w:semiHidden="0" w:name="List Bullet 5"/>
     <w:lsdException w:unhideWhenUsed="0" w:uiPriority="0" w:semiHidden="0" w:name="List Number 2"/>
@@ -1443,22 +2147,22 @@
     <w:lsdException w:qFormat="1" w:unhideWhenUsed="0" w:uiPriority="0" w:semiHidden="0" w:name="Body Text Indent 3"/>
     <w:lsdException w:qFormat="1" w:unhideWhenUsed="0" w:uiPriority="0" w:semiHidden="0" w:name="Block Text"/>
     <w:lsdException w:qFormat="1" w:unhideWhenUsed="0" w:uiPriority="0" w:semiHidden="0" w:name="Hyperlink"/>
-    <w:lsdException w:unhideWhenUsed="0" w:uiPriority="0" w:semiHidden="0" w:name="FollowedHyperlink"/>
+    <w:lsdException w:qFormat="1" w:unhideWhenUsed="0" w:uiPriority="0" w:semiHidden="0" w:name="FollowedHyperlink"/>
     <w:lsdException w:qFormat="1" w:unhideWhenUsed="0" w:uiPriority="0" w:semiHidden="0" w:name="Strong"/>
     <w:lsdException w:qFormat="1" w:unhideWhenUsed="0" w:uiPriority="0" w:semiHidden="0" w:name="Emphasis"/>
     <w:lsdException w:qFormat="1" w:unhideWhenUsed="0" w:uiPriority="0" w:semiHidden="0" w:name="Document Map"/>
     <w:lsdException w:qFormat="1" w:unhideWhenUsed="0" w:uiPriority="0" w:semiHidden="0" w:name="Plain Text"/>
-    <w:lsdException w:unhideWhenUsed="0" w:uiPriority="0" w:semiHidden="0" w:name="E-mail Signature"/>
+    <w:lsdException w:qFormat="1" w:unhideWhenUsed="0" w:uiPriority="0" w:semiHidden="0" w:name="E-mail Signature"/>
     <w:lsdException w:qFormat="1" w:unhideWhenUsed="0" w:uiPriority="0" w:semiHidden="0" w:name="Normal (Web)"/>
     <w:lsdException w:unhideWhenUsed="0" w:uiPriority="0" w:semiHidden="0" w:name="HTML Acronym"/>
     <w:lsdException w:unhideWhenUsed="0" w:uiPriority="0" w:semiHidden="0" w:name="HTML Address"/>
-    <w:lsdException w:unhideWhenUsed="0" w:uiPriority="0" w:semiHidden="0" w:name="HTML Cite"/>
+    <w:lsdException w:qFormat="1" w:unhideWhenUsed="0" w:uiPriority="0" w:semiHidden="0" w:name="HTML Cite"/>
     <w:lsdException w:unhideWhenUsed="0" w:uiPriority="0" w:semiHidden="0" w:name="HTML Code"/>
     <w:lsdException w:qFormat="1" w:unhideWhenUsed="0" w:uiPriority="0" w:semiHidden="0" w:name="HTML Definition"/>
     <w:lsdException w:qFormat="1" w:unhideWhenUsed="0" w:uiPriority="0" w:semiHidden="0" w:name="HTML Keyboard"/>
     <w:lsdException w:qFormat="1" w:unhideWhenUsed="0" w:uiPriority="0" w:semiHidden="0" w:name="HTML Preformatted"/>
     <w:lsdException w:qFormat="1" w:unhideWhenUsed="0" w:uiPriority="0" w:semiHidden="0" w:name="HTML Sample"/>
-    <w:lsdException w:unhideWhenUsed="0" w:uiPriority="0" w:semiHidden="0" w:name="HTML Typewriter"/>
+    <w:lsdException w:qFormat="1" w:unhideWhenUsed="0" w:uiPriority="0" w:semiHidden="0" w:name="HTML Typewriter"/>
     <w:lsdException w:qFormat="1" w:unhideWhenUsed="0" w:uiPriority="0" w:semiHidden="0" w:name="HTML Variable"/>
     <w:lsdException w:qFormat="1" w:unhideWhenUsed="0" w:uiPriority="0" w:name="Normal Table"/>
     <w:lsdException w:qFormat="1" w:unhideWhenUsed="0" w:uiPriority="0" w:semiHidden="0" w:name="annotation subject"/>
@@ -1993,6 +2697,7 @@
   <w:style w:type="paragraph" w:styleId="30">
     <w:name w:val="E-mail Signature"/>
     <w:basedOn w:val="1"/>
+    <w:qFormat/>
     <w:uiPriority w:val="0"/>
   </w:style>
   <w:style w:type="character" w:styleId="31">
@@ -2008,6 +2713,7 @@
   <w:style w:type="character" w:styleId="32">
     <w:name w:val="endnote reference"/>
     <w:basedOn w:val="11"/>
+    <w:qFormat/>
     <w:uiPriority w:val="0"/>
     <w:rPr>
       <w:vertAlign w:val="superscript"/>
@@ -2052,6 +2758,7 @@
   <w:style w:type="character" w:styleId="36">
     <w:name w:val="FollowedHyperlink"/>
     <w:basedOn w:val="11"/>
+    <w:qFormat/>
     <w:uiPriority w:val="0"/>
     <w:rPr>
       <w:color w:val="800080"/>
@@ -2061,6 +2768,7 @@
   <w:style w:type="paragraph" w:styleId="37">
     <w:name w:val="footer"/>
     <w:basedOn w:val="1"/>
+    <w:qFormat/>
     <w:uiPriority w:val="0"/>
     <w:pPr>
       <w:tabs>
@@ -2101,6 +2809,7 @@
   <w:style w:type="paragraph" w:styleId="40">
     <w:name w:val="header"/>
     <w:basedOn w:val="1"/>
+    <w:qFormat/>
     <w:uiPriority w:val="0"/>
     <w:pPr>
       <w:tabs>
@@ -2131,6 +2840,7 @@
   <w:style w:type="character" w:styleId="43">
     <w:name w:val="HTML Cite"/>
     <w:basedOn w:val="11"/>
+    <w:qFormat/>
     <w:uiPriority w:val="0"/>
     <w:rPr>
       <w:i/>
@@ -2190,6 +2900,7 @@
   <w:style w:type="character" w:styleId="49">
     <w:name w:val="HTML Typewriter"/>
     <w:basedOn w:val="11"/>
+    <w:qFormat/>
     <w:uiPriority w:val="0"/>
     <w:rPr>
       <w:rFonts w:ascii="Courier New" w:hAnsi="Courier New" w:cs="Courier New"/>
@@ -2228,6 +2939,7 @@
     <w:name w:val="index 2"/>
     <w:basedOn w:val="1"/>
     <w:next w:val="1"/>
+    <w:qFormat/>
     <w:uiPriority w:val="0"/>
     <w:pPr>
       <w:ind w:left="200" w:leftChars="200"/>
@@ -2237,6 +2949,7 @@
     <w:name w:val="index 3"/>
     <w:basedOn w:val="1"/>
     <w:next w:val="1"/>
+    <w:qFormat/>
     <w:uiPriority w:val="0"/>
     <w:pPr>
       <w:ind w:left="400" w:leftChars="400"/>
@@ -2266,6 +2979,7 @@
     <w:name w:val="index 6"/>
     <w:basedOn w:val="1"/>
     <w:next w:val="1"/>
+    <w:qFormat/>
     <w:uiPriority w:val="0"/>
     <w:pPr>
       <w:ind w:left="1000" w:leftChars="1000"/>
@@ -2388,6 +3102,7 @@
   <w:style w:type="paragraph" w:styleId="70">
     <w:name w:val="List Bullet 3"/>
     <w:basedOn w:val="1"/>
+    <w:qFormat/>
     <w:uiPriority w:val="0"/>
     <w:pPr>
       <w:numPr>

</xml_diff>

<commit_message>
feat: refactor attendance system, fix database schema and implement QR scan workflow
</commit_message>
<xml_diff>
--- a/BaoCaoTienDoThucTapTotNghiep.docx
+++ b/BaoCaoTienDoThucTapTotNghiep.docx
@@ -28,6 +28,7 @@
           <w:szCs w:val="30"/>
         </w:rPr>
       </w:pPr>
+      <w:bookmarkStart w:id="0" w:name="_GoBack"/>
       <w:r>
         <w:rPr>
           <w:rFonts w:hint="default" w:ascii="Times New Roman" w:hAnsi="Times New Roman" w:cs="Times New Roman"/>
@@ -37,6 +38,7 @@
         <w:t>BÁO CÁO TIẾN ĐỘ</w:t>
       </w:r>
     </w:p>
+    <w:bookmarkEnd w:id="0"/>
     <w:p>
       <w:pPr>
         <w:keepNext w:val="0"/>
@@ -53,9 +55,12 @@
         <w:adjustRightInd/>
         <w:snapToGrid/>
         <w:spacing w:before="120" w:beforeAutospacing="0" w:after="120" w:afterAutospacing="0" w:line="360" w:lineRule="auto"/>
+        <w:jc w:val="both"/>
         <w:textAlignment w:val="auto"/>
         <w:rPr>
           <w:rFonts w:hint="default" w:ascii="Times New Roman" w:hAnsi="Times New Roman" w:cs="Times New Roman"/>
+          <w:sz w:val="26"/>
+          <w:szCs w:val="26"/>
         </w:rPr>
       </w:pPr>
     </w:p>
@@ -77,10 +82,12 @@
         <w:adjustRightInd/>
         <w:snapToGrid/>
         <w:spacing w:before="120" w:beforeAutospacing="0" w:after="120" w:afterAutospacing="0" w:line="360" w:lineRule="auto"/>
-        <w:jc w:val="both"/>
+        <w:jc w:val="left"/>
         <w:textAlignment w:val="auto"/>
         <w:rPr>
           <w:rFonts w:hint="default" w:ascii="Times New Roman" w:hAnsi="Times New Roman" w:cs="Times New Roman"/>
+          <w:sz w:val="26"/>
+          <w:szCs w:val="26"/>
         </w:rPr>
       </w:pPr>
       <w:r>
@@ -108,6 +115,7 @@
         <w:adjustRightInd/>
         <w:snapToGrid/>
         <w:spacing w:before="120" w:beforeAutospacing="0" w:after="120" w:afterAutospacing="0" w:line="360" w:lineRule="auto"/>
+        <w:jc w:val="left"/>
         <w:textAlignment w:val="auto"/>
         <w:rPr>
           <w:rFonts w:hint="default" w:ascii="Times New Roman" w:hAnsi="Times New Roman" w:cs="Times New Roman"/>
@@ -206,6 +214,7 @@
         <w:adjustRightInd/>
         <w:snapToGrid/>
         <w:spacing w:before="120" w:beforeAutospacing="0" w:after="120" w:afterAutospacing="0" w:line="360" w:lineRule="auto"/>
+        <w:jc w:val="both"/>
         <w:textAlignment w:val="auto"/>
         <w:rPr>
           <w:rFonts w:hint="default" w:ascii="Times New Roman" w:hAnsi="Times New Roman" w:cs="Times New Roman"/>
@@ -255,6 +264,7 @@
         <w:snapToGrid/>
         <w:spacing w:before="120" w:beforeAutospacing="0" w:after="120" w:afterAutospacing="0" w:line="360" w:lineRule="auto"/>
         <w:ind w:left="840" w:leftChars="0" w:right="0" w:hanging="420" w:firstLineChars="0"/>
+        <w:jc w:val="both"/>
         <w:textAlignment w:val="auto"/>
         <w:rPr>
           <w:rFonts w:hint="default" w:ascii="Times New Roman" w:hAnsi="Times New Roman" w:cs="Times New Roman"/>
@@ -298,6 +308,7 @@
         <w:snapToGrid/>
         <w:spacing w:before="120" w:beforeAutospacing="0" w:after="120" w:afterAutospacing="0" w:line="360" w:lineRule="auto"/>
         <w:ind w:left="840" w:leftChars="0" w:right="0" w:hanging="420" w:firstLineChars="0"/>
+        <w:jc w:val="both"/>
         <w:textAlignment w:val="auto"/>
         <w:rPr>
           <w:rFonts w:hint="default" w:ascii="Times New Roman" w:hAnsi="Times New Roman" w:cs="Times New Roman"/>
@@ -341,6 +352,7 @@
         <w:snapToGrid/>
         <w:spacing w:before="120" w:beforeAutospacing="0" w:after="120" w:afterAutospacing="0" w:line="360" w:lineRule="auto"/>
         <w:ind w:left="840" w:leftChars="0" w:right="0" w:hanging="420" w:firstLineChars="0"/>
+        <w:jc w:val="both"/>
         <w:textAlignment w:val="auto"/>
         <w:rPr>
           <w:rFonts w:hint="default" w:ascii="Times New Roman" w:hAnsi="Times New Roman" w:cs="Times New Roman"/>
@@ -401,6 +413,7 @@
         <w:snapToGrid/>
         <w:spacing w:before="120" w:beforeAutospacing="0" w:after="120" w:afterAutospacing="0" w:line="360" w:lineRule="auto"/>
         <w:ind w:left="840" w:leftChars="0" w:right="0" w:hanging="420" w:firstLineChars="0"/>
+        <w:jc w:val="both"/>
         <w:textAlignment w:val="auto"/>
         <w:rPr>
           <w:rFonts w:hint="default" w:ascii="Times New Roman" w:hAnsi="Times New Roman" w:cs="Times New Roman"/>
@@ -444,6 +457,7 @@
         <w:snapToGrid/>
         <w:spacing w:before="120" w:beforeAutospacing="0" w:after="120" w:afterAutospacing="0" w:line="360" w:lineRule="auto"/>
         <w:ind w:left="840" w:leftChars="0" w:right="0" w:hanging="420" w:firstLineChars="0"/>
+        <w:jc w:val="both"/>
         <w:textAlignment w:val="auto"/>
         <w:rPr>
           <w:rFonts w:hint="default" w:ascii="Times New Roman" w:hAnsi="Times New Roman" w:cs="Times New Roman"/>
@@ -487,6 +501,7 @@
         <w:snapToGrid/>
         <w:spacing w:before="120" w:beforeAutospacing="0" w:after="120" w:afterAutospacing="0" w:line="360" w:lineRule="auto"/>
         <w:ind w:left="840" w:leftChars="0" w:right="0" w:hanging="420" w:firstLineChars="0"/>
+        <w:jc w:val="both"/>
         <w:textAlignment w:val="auto"/>
         <w:rPr>
           <w:rFonts w:hint="default" w:ascii="Times New Roman" w:hAnsi="Times New Roman" w:cs="Times New Roman"/>
@@ -530,6 +545,7 @@
         <w:snapToGrid/>
         <w:spacing w:before="120" w:beforeAutospacing="0" w:after="120" w:afterAutospacing="0" w:line="360" w:lineRule="auto"/>
         <w:ind w:left="840" w:leftChars="0" w:hanging="420" w:firstLineChars="0"/>
+        <w:jc w:val="both"/>
         <w:textAlignment w:val="auto"/>
         <w:rPr>
           <w:rFonts w:hint="default" w:ascii="Times New Roman" w:hAnsi="Times New Roman" w:cs="Times New Roman"/>
@@ -572,6 +588,7 @@
         <w:snapToGrid/>
         <w:spacing w:before="120" w:beforeAutospacing="0" w:after="120" w:afterAutospacing="0" w:line="360" w:lineRule="auto"/>
         <w:ind w:left="0" w:leftChars="0" w:right="0" w:rightChars="0" w:firstLine="0" w:firstLineChars="0"/>
+        <w:jc w:val="both"/>
         <w:textAlignment w:val="auto"/>
         <w:rPr>
           <w:rFonts w:hint="default" w:ascii="Times New Roman" w:hAnsi="Times New Roman" w:cs="Times New Roman"/>
@@ -620,11 +637,14 @@
         <w:snapToGrid/>
         <w:spacing w:before="120" w:beforeAutospacing="0" w:after="120" w:afterAutospacing="0" w:line="360" w:lineRule="auto"/>
         <w:ind w:left="600" w:leftChars="0" w:hanging="180" w:firstLineChars="0"/>
+        <w:jc w:val="both"/>
         <w:textAlignment w:val="auto"/>
         <w:rPr>
           <w:rFonts w:hint="default" w:ascii="Times New Roman" w:hAnsi="Times New Roman" w:cs="Times New Roman"/>
           <w:b w:val="0"/>
           <w:bCs w:val="0"/>
+          <w:sz w:val="26"/>
+          <w:szCs w:val="26"/>
         </w:rPr>
       </w:pPr>
       <w:r>
@@ -632,6 +652,8 @@
           <w:rFonts w:hint="default" w:ascii="Times New Roman" w:hAnsi="Times New Roman" w:cs="Times New Roman"/>
           <w:b w:val="0"/>
           <w:bCs w:val="0"/>
+          <w:sz w:val="26"/>
+          <w:szCs w:val="26"/>
         </w:rPr>
         <w:t xml:space="preserve">Hoàn thiện hệ thống </w:t>
       </w:r>
@@ -641,6 +663,8 @@
           <w:rFonts w:hint="default" w:ascii="Times New Roman" w:hAnsi="Times New Roman" w:cs="Times New Roman"/>
           <w:b w:val="0"/>
           <w:bCs w:val="0"/>
+          <w:sz w:val="26"/>
+          <w:szCs w:val="26"/>
         </w:rPr>
         <w:t>Authentication (Register / Login)</w:t>
       </w:r>
@@ -671,11 +695,14 @@
         <w:snapToGrid/>
         <w:spacing w:before="120" w:beforeAutospacing="0" w:after="120" w:afterAutospacing="0" w:line="360" w:lineRule="auto"/>
         <w:ind w:left="600" w:leftChars="0" w:hanging="180" w:firstLineChars="0"/>
+        <w:jc w:val="both"/>
         <w:textAlignment w:val="auto"/>
         <w:rPr>
           <w:rFonts w:hint="default" w:ascii="Times New Roman" w:hAnsi="Times New Roman" w:cs="Times New Roman"/>
           <w:b w:val="0"/>
           <w:bCs w:val="0"/>
+          <w:sz w:val="26"/>
+          <w:szCs w:val="26"/>
         </w:rPr>
       </w:pPr>
       <w:r>
@@ -683,6 +710,8 @@
           <w:rFonts w:hint="default" w:ascii="Times New Roman" w:hAnsi="Times New Roman" w:cs="Times New Roman"/>
           <w:b w:val="0"/>
           <w:bCs w:val="0"/>
+          <w:sz w:val="26"/>
+          <w:szCs w:val="26"/>
         </w:rPr>
         <w:t xml:space="preserve">Xây dựng </w:t>
       </w:r>
@@ -692,6 +721,8 @@
           <w:rFonts w:hint="default" w:ascii="Times New Roman" w:hAnsi="Times New Roman" w:cs="Times New Roman"/>
           <w:b w:val="0"/>
           <w:bCs w:val="0"/>
+          <w:sz w:val="26"/>
+          <w:szCs w:val="26"/>
         </w:rPr>
         <w:t>REST API quản lý sự kiện (Create / Update / Delete / List Events)</w:t>
       </w:r>
@@ -722,11 +753,14 @@
         <w:snapToGrid/>
         <w:spacing w:before="120" w:beforeAutospacing="0" w:after="120" w:afterAutospacing="0" w:line="360" w:lineRule="auto"/>
         <w:ind w:left="600" w:leftChars="0" w:hanging="180" w:firstLineChars="0"/>
+        <w:jc w:val="both"/>
         <w:textAlignment w:val="auto"/>
         <w:rPr>
           <w:rFonts w:hint="default" w:ascii="Times New Roman" w:hAnsi="Times New Roman" w:cs="Times New Roman"/>
           <w:b w:val="0"/>
           <w:bCs w:val="0"/>
+          <w:sz w:val="26"/>
+          <w:szCs w:val="26"/>
           <w:lang w:val="vi-VN"/>
         </w:rPr>
       </w:pPr>
@@ -735,6 +769,8 @@
           <w:rFonts w:hint="default" w:ascii="Times New Roman" w:hAnsi="Times New Roman" w:cs="Times New Roman"/>
           <w:b w:val="0"/>
           <w:bCs w:val="0"/>
+          <w:sz w:val="26"/>
+          <w:szCs w:val="26"/>
         </w:rPr>
         <w:t xml:space="preserve">Triển khai </w:t>
       </w:r>
@@ -744,6 +780,8 @@
           <w:rFonts w:hint="default" w:ascii="Times New Roman" w:hAnsi="Times New Roman" w:cs="Times New Roman"/>
           <w:b w:val="0"/>
           <w:bCs w:val="0"/>
+          <w:sz w:val="26"/>
+          <w:szCs w:val="26"/>
         </w:rPr>
         <w:t>chức năng sinh QR Code khi sinh viên đăng ký sự kiện</w:t>
       </w:r>
@@ -753,6 +791,8 @@
           <w:rFonts w:hint="default" w:ascii="Times New Roman" w:hAnsi="Times New Roman" w:cs="Times New Roman"/>
           <w:b w:val="0"/>
           <w:bCs w:val="0"/>
+          <w:sz w:val="26"/>
+          <w:szCs w:val="26"/>
           <w:lang w:val="vi-VN"/>
         </w:rPr>
         <w:t>.</w:t>
@@ -784,11 +824,14 @@
         <w:snapToGrid/>
         <w:spacing w:before="120" w:beforeAutospacing="0" w:after="120" w:afterAutospacing="0" w:line="360" w:lineRule="auto"/>
         <w:ind w:left="600" w:leftChars="0" w:hanging="180" w:firstLineChars="0"/>
+        <w:jc w:val="both"/>
         <w:textAlignment w:val="auto"/>
         <w:rPr>
           <w:rFonts w:hint="default" w:ascii="Times New Roman" w:hAnsi="Times New Roman" w:cs="Times New Roman"/>
           <w:b w:val="0"/>
           <w:bCs w:val="0"/>
+          <w:sz w:val="26"/>
+          <w:szCs w:val="26"/>
         </w:rPr>
       </w:pPr>
       <w:r>
@@ -796,6 +839,8 @@
           <w:rFonts w:hint="default" w:ascii="Times New Roman" w:hAnsi="Times New Roman" w:cs="Times New Roman"/>
           <w:b w:val="0"/>
           <w:bCs w:val="0"/>
+          <w:sz w:val="26"/>
+          <w:szCs w:val="26"/>
         </w:rPr>
         <w:t xml:space="preserve">Xây dựng </w:t>
       </w:r>
@@ -805,6 +850,8 @@
           <w:rFonts w:hint="default" w:ascii="Times New Roman" w:hAnsi="Times New Roman" w:cs="Times New Roman"/>
           <w:b w:val="0"/>
           <w:bCs w:val="0"/>
+          <w:sz w:val="26"/>
+          <w:szCs w:val="26"/>
         </w:rPr>
         <w:t>API đăng ký tham gia sự kiện cho sinh viên</w:t>
       </w:r>
@@ -835,11 +882,14 @@
         <w:snapToGrid/>
         <w:spacing w:before="120" w:beforeAutospacing="0" w:after="120" w:afterAutospacing="0" w:line="360" w:lineRule="auto"/>
         <w:ind w:left="600" w:leftChars="0" w:hanging="180" w:firstLineChars="0"/>
+        <w:jc w:val="both"/>
         <w:textAlignment w:val="auto"/>
         <w:rPr>
           <w:rFonts w:hint="default" w:ascii="Times New Roman" w:hAnsi="Times New Roman" w:cs="Times New Roman"/>
           <w:b w:val="0"/>
           <w:bCs w:val="0"/>
+          <w:sz w:val="26"/>
+          <w:szCs w:val="26"/>
         </w:rPr>
       </w:pPr>
       <w:r>
@@ -847,6 +897,8 @@
           <w:rFonts w:hint="default" w:ascii="Times New Roman" w:hAnsi="Times New Roman" w:cs="Times New Roman"/>
           <w:b w:val="0"/>
           <w:bCs w:val="0"/>
+          <w:sz w:val="26"/>
+          <w:szCs w:val="26"/>
         </w:rPr>
         <w:t xml:space="preserve">Triển khai </w:t>
       </w:r>
@@ -856,6 +908,8 @@
           <w:rFonts w:hint="default" w:ascii="Times New Roman" w:hAnsi="Times New Roman" w:cs="Times New Roman"/>
           <w:b w:val="0"/>
           <w:bCs w:val="0"/>
+          <w:sz w:val="26"/>
+          <w:szCs w:val="26"/>
         </w:rPr>
         <w:t>QR Check-in để điểm danh tham dự sự kiện</w:t>
       </w:r>
@@ -886,11 +940,14 @@
         <w:snapToGrid/>
         <w:spacing w:before="120" w:beforeAutospacing="0" w:after="120" w:afterAutospacing="0" w:line="360" w:lineRule="auto"/>
         <w:ind w:left="600" w:leftChars="0" w:hanging="180" w:firstLineChars="0"/>
+        <w:jc w:val="both"/>
         <w:textAlignment w:val="auto"/>
         <w:rPr>
           <w:rFonts w:hint="default" w:ascii="Times New Roman" w:hAnsi="Times New Roman" w:cs="Times New Roman"/>
           <w:b w:val="0"/>
           <w:bCs w:val="0"/>
+          <w:sz w:val="26"/>
+          <w:szCs w:val="26"/>
         </w:rPr>
       </w:pPr>
       <w:r>
@@ -898,6 +955,8 @@
           <w:rFonts w:hint="default" w:ascii="Times New Roman" w:hAnsi="Times New Roman" w:cs="Times New Roman"/>
           <w:b w:val="0"/>
           <w:bCs w:val="0"/>
+          <w:sz w:val="26"/>
+          <w:szCs w:val="26"/>
         </w:rPr>
         <w:t xml:space="preserve">Tích hợp </w:t>
       </w:r>
@@ -907,6 +966,8 @@
           <w:rFonts w:hint="default" w:ascii="Times New Roman" w:hAnsi="Times New Roman" w:cs="Times New Roman"/>
           <w:b w:val="0"/>
           <w:bCs w:val="0"/>
+          <w:sz w:val="26"/>
+          <w:szCs w:val="26"/>
         </w:rPr>
         <w:t>Swagger API Documentation</w:t>
       </w:r>
@@ -937,11 +998,14 @@
         <w:snapToGrid/>
         <w:spacing w:before="120" w:beforeAutospacing="0" w:after="120" w:afterAutospacing="0" w:line="360" w:lineRule="auto"/>
         <w:ind w:left="600" w:leftChars="0" w:hanging="180" w:firstLineChars="0"/>
+        <w:jc w:val="both"/>
         <w:textAlignment w:val="auto"/>
         <w:rPr>
           <w:rFonts w:hint="default" w:ascii="Times New Roman" w:hAnsi="Times New Roman" w:cs="Times New Roman"/>
           <w:b w:val="0"/>
           <w:bCs w:val="0"/>
+          <w:sz w:val="26"/>
+          <w:szCs w:val="26"/>
         </w:rPr>
       </w:pPr>
       <w:r>
@@ -949,6 +1013,8 @@
           <w:rFonts w:hint="default" w:ascii="Times New Roman" w:hAnsi="Times New Roman" w:cs="Times New Roman"/>
           <w:b w:val="0"/>
           <w:bCs w:val="0"/>
+          <w:sz w:val="26"/>
+          <w:szCs w:val="26"/>
         </w:rPr>
         <w:t xml:space="preserve">Thêm </w:t>
       </w:r>
@@ -958,6 +1024,8 @@
           <w:rFonts w:hint="default" w:ascii="Times New Roman" w:hAnsi="Times New Roman" w:cs="Times New Roman"/>
           <w:b w:val="0"/>
           <w:bCs w:val="0"/>
+          <w:sz w:val="26"/>
+          <w:szCs w:val="26"/>
         </w:rPr>
         <w:t>validation, error handling và pagination cho API</w:t>
       </w:r>
@@ -988,6 +1056,7 @@
         <w:snapToGrid/>
         <w:spacing w:before="120" w:beforeAutospacing="0" w:after="120" w:afterAutospacing="0" w:line="360" w:lineRule="auto"/>
         <w:ind w:left="600" w:leftChars="0" w:hanging="180" w:firstLineChars="0"/>
+        <w:jc w:val="both"/>
         <w:textAlignment w:val="auto"/>
         <w:rPr>
           <w:rFonts w:hint="default" w:ascii="Times New Roman" w:hAnsi="Times New Roman" w:cs="Times New Roman"/>
@@ -1003,12 +1072,15 @@
           <w:rFonts w:hint="default" w:ascii="Times New Roman" w:hAnsi="Times New Roman" w:cs="Times New Roman"/>
           <w:b w:val="0"/>
           <w:bCs w:val="0"/>
+          <w:sz w:val="26"/>
+          <w:szCs w:val="26"/>
         </w:rPr>
         <w:t>Kiểm tra và xác nhận hoạt động của toàn bộ API backend</w:t>
       </w:r>
     </w:p>
     <w:p>
       <w:pPr>
+        <w:jc w:val="both"/>
         <w:rPr>
           <w:rFonts w:hint="default" w:ascii="Times New Roman" w:hAnsi="Times New Roman" w:cs="Times New Roman"/>
           <w:b/>
@@ -1056,6 +1128,7 @@
         <w:snapToGrid/>
         <w:spacing w:before="120" w:beforeAutospacing="0" w:after="120" w:afterAutospacing="0" w:line="360" w:lineRule="auto"/>
         <w:ind w:left="0" w:leftChars="0" w:right="0" w:rightChars="0" w:firstLine="0" w:firstLineChars="0"/>
+        <w:jc w:val="both"/>
         <w:textAlignment w:val="auto"/>
         <w:rPr>
           <w:rFonts w:hint="default" w:ascii="Times New Roman" w:hAnsi="Times New Roman" w:cs="Times New Roman"/>
@@ -1104,6 +1177,7 @@
         <w:snapToGrid/>
         <w:spacing w:before="120" w:beforeAutospacing="0" w:after="120" w:afterAutospacing="0" w:line="360" w:lineRule="auto"/>
         <w:ind w:left="600" w:leftChars="0" w:hanging="200" w:firstLineChars="0"/>
+        <w:jc w:val="both"/>
         <w:textAlignment w:val="auto"/>
         <w:rPr>
           <w:rFonts w:hint="default" w:ascii="Times New Roman" w:hAnsi="Times New Roman" w:cs="Times New Roman"/>
@@ -1144,8 +1218,6 @@
         </w:rPr>
         <w:t>.</w:t>
       </w:r>
-      <w:bookmarkStart w:id="0" w:name="_GoBack"/>
-      <w:bookmarkEnd w:id="0"/>
     </w:p>
     <w:p>
       <w:pPr>
@@ -1173,6 +1245,7 @@
         <w:snapToGrid/>
         <w:spacing w:before="120" w:beforeAutospacing="0" w:after="120" w:afterAutospacing="0" w:line="360" w:lineRule="auto"/>
         <w:ind w:left="600" w:leftChars="0" w:hanging="200" w:firstLineChars="0"/>
+        <w:jc w:val="both"/>
         <w:textAlignment w:val="auto"/>
         <w:rPr>
           <w:rFonts w:hint="default" w:ascii="Times New Roman" w:hAnsi="Times New Roman" w:cs="Times New Roman"/>
@@ -1282,6 +1355,7 @@
         <w:snapToGrid/>
         <w:spacing w:before="120" w:beforeAutospacing="0" w:after="120" w:afterAutospacing="0" w:line="360" w:lineRule="auto"/>
         <w:ind w:left="600" w:leftChars="0" w:hanging="200" w:firstLineChars="0"/>
+        <w:jc w:val="both"/>
         <w:textAlignment w:val="auto"/>
         <w:rPr>
           <w:rFonts w:hint="default" w:ascii="Times New Roman" w:hAnsi="Times New Roman" w:cs="Times New Roman"/>
@@ -1412,6 +1486,7 @@
         <w:snapToGrid/>
         <w:spacing w:before="120" w:beforeAutospacing="0" w:after="120" w:afterAutospacing="0" w:line="360" w:lineRule="auto"/>
         <w:ind w:left="600" w:leftChars="0" w:hanging="200" w:firstLineChars="0"/>
+        <w:jc w:val="both"/>
         <w:textAlignment w:val="auto"/>
         <w:rPr>
           <w:rFonts w:hint="default" w:ascii="Times New Roman" w:hAnsi="Times New Roman" w:cs="Times New Roman"/>
@@ -1500,6 +1575,7 @@
         <w:snapToGrid/>
         <w:spacing w:before="120" w:beforeAutospacing="0" w:after="120" w:afterAutospacing="0" w:line="360" w:lineRule="auto"/>
         <w:ind w:left="600" w:leftChars="0" w:hanging="200" w:firstLineChars="0"/>
+        <w:jc w:val="both"/>
         <w:textAlignment w:val="auto"/>
         <w:rPr>
           <w:rFonts w:hint="default" w:ascii="Times New Roman" w:hAnsi="Times New Roman" w:cs="Times New Roman"/>
@@ -1588,6 +1664,7 @@
         <w:snapToGrid/>
         <w:spacing w:before="120" w:beforeAutospacing="0" w:after="120" w:afterAutospacing="0" w:line="360" w:lineRule="auto"/>
         <w:ind w:left="600" w:leftChars="0" w:hanging="200" w:firstLineChars="0"/>
+        <w:jc w:val="both"/>
         <w:textAlignment w:val="auto"/>
         <w:rPr>
           <w:rFonts w:hint="default" w:ascii="Times New Roman" w:hAnsi="Times New Roman" w:cs="Times New Roman"/>
@@ -1655,6 +1732,7 @@
         <w:snapToGrid/>
         <w:spacing w:before="120" w:beforeAutospacing="0" w:after="120" w:afterAutospacing="0" w:line="360" w:lineRule="auto"/>
         <w:ind w:left="600" w:leftChars="0" w:hanging="200" w:firstLineChars="0"/>
+        <w:jc w:val="both"/>
         <w:textAlignment w:val="auto"/>
         <w:rPr>
           <w:rFonts w:hint="default" w:ascii="Times New Roman" w:hAnsi="Times New Roman" w:cs="Times New Roman"/>
@@ -1698,6 +1776,317 @@
     </w:p>
     <w:p>
       <w:pPr>
+        <w:pStyle w:val="85"/>
+        <w:keepNext w:val="0"/>
+        <w:keepLines w:val="0"/>
+        <w:pageBreakBefore w:val="0"/>
+        <w:widowControl/>
+        <w:numPr>
+          <w:ilvl w:val="0"/>
+          <w:numId w:val="11"/>
+        </w:numPr>
+        <w:suppressLineNumbers w:val="0"/>
+        <w:kinsoku/>
+        <w:wordWrap/>
+        <w:overflowPunct/>
+        <w:topLinePunct w:val="0"/>
+        <w:autoSpaceDE/>
+        <w:autoSpaceDN/>
+        <w:bidi w:val="0"/>
+        <w:adjustRightInd/>
+        <w:snapToGrid/>
+        <w:spacing w:before="120" w:beforeAutospacing="0" w:after="120" w:afterAutospacing="0" w:line="360" w:lineRule="auto"/>
+        <w:ind w:left="0" w:leftChars="0" w:right="0" w:rightChars="0" w:firstLine="0" w:firstLineChars="0"/>
+        <w:jc w:val="both"/>
+        <w:textAlignment w:val="auto"/>
+        <w:rPr>
+          <w:rFonts w:hint="default" w:ascii="Times New Roman" w:hAnsi="Times New Roman" w:cs="Times New Roman"/>
+          <w:b/>
+          <w:bCs/>
+          <w:sz w:val="26"/>
+          <w:szCs w:val="26"/>
+          <w:lang w:val="en-US"/>
+        </w:rPr>
+      </w:pPr>
+      <w:r>
+        <w:rPr>
+          <w:rFonts w:hint="default" w:cs="Times New Roman"/>
+          <w:b/>
+          <w:bCs/>
+          <w:sz w:val="26"/>
+          <w:szCs w:val="26"/>
+          <w:lang w:val="vi-VN"/>
+        </w:rPr>
+        <w:t>Ngày 4 (07/03/2026)</w:t>
+      </w:r>
+    </w:p>
+    <w:p>
+      <w:pPr>
+        <w:pStyle w:val="85"/>
+        <w:keepNext w:val="0"/>
+        <w:keepLines w:val="0"/>
+        <w:pageBreakBefore w:val="0"/>
+        <w:widowControl/>
+        <w:numPr>
+          <w:ilvl w:val="0"/>
+          <w:numId w:val="15"/>
+        </w:numPr>
+        <w:suppressLineNumbers w:val="0"/>
+        <w:tabs>
+          <w:tab w:val="left" w:pos="600"/>
+          <w:tab w:val="clear" w:pos="420"/>
+        </w:tabs>
+        <w:kinsoku/>
+        <w:wordWrap/>
+        <w:overflowPunct/>
+        <w:topLinePunct w:val="0"/>
+        <w:autoSpaceDE/>
+        <w:autoSpaceDN/>
+        <w:bidi w:val="0"/>
+        <w:adjustRightInd/>
+        <w:snapToGrid/>
+        <w:spacing w:before="120" w:beforeAutospacing="0" w:after="120" w:afterAutospacing="0" w:line="360" w:lineRule="auto"/>
+        <w:ind w:left="420" w:leftChars="0" w:hanging="20" w:firstLineChars="0"/>
+        <w:jc w:val="both"/>
+        <w:textAlignment w:val="auto"/>
+        <w:rPr>
+          <w:b w:val="0"/>
+          <w:bCs w:val="0"/>
+          <w:sz w:val="26"/>
+          <w:szCs w:val="26"/>
+        </w:rPr>
+      </w:pPr>
+      <w:r>
+        <w:rPr>
+          <w:b w:val="0"/>
+          <w:bCs w:val="0"/>
+          <w:sz w:val="26"/>
+          <w:szCs w:val="26"/>
+        </w:rPr>
+        <w:t xml:space="preserve">Phát triển mobile app: bổ sung chức năng đăng ký tham gia sự kiện cho sinh viên. </w:t>
+      </w:r>
+    </w:p>
+    <w:p>
+      <w:pPr>
+        <w:pStyle w:val="85"/>
+        <w:keepNext w:val="0"/>
+        <w:keepLines w:val="0"/>
+        <w:pageBreakBefore w:val="0"/>
+        <w:widowControl/>
+        <w:numPr>
+          <w:ilvl w:val="0"/>
+          <w:numId w:val="15"/>
+        </w:numPr>
+        <w:suppressLineNumbers w:val="0"/>
+        <w:tabs>
+          <w:tab w:val="left" w:pos="600"/>
+          <w:tab w:val="clear" w:pos="420"/>
+        </w:tabs>
+        <w:kinsoku/>
+        <w:wordWrap/>
+        <w:overflowPunct/>
+        <w:topLinePunct w:val="0"/>
+        <w:autoSpaceDE/>
+        <w:autoSpaceDN/>
+        <w:bidi w:val="0"/>
+        <w:adjustRightInd/>
+        <w:snapToGrid/>
+        <w:spacing w:before="120" w:beforeAutospacing="0" w:after="120" w:afterAutospacing="0" w:line="360" w:lineRule="auto"/>
+        <w:ind w:left="420" w:leftChars="0" w:hanging="20" w:firstLineChars="0"/>
+        <w:jc w:val="both"/>
+        <w:textAlignment w:val="auto"/>
+        <w:rPr>
+          <w:b w:val="0"/>
+          <w:bCs w:val="0"/>
+          <w:sz w:val="26"/>
+          <w:szCs w:val="26"/>
+        </w:rPr>
+      </w:pPr>
+      <w:r>
+        <w:rPr>
+          <w:b w:val="0"/>
+          <w:bCs w:val="0"/>
+          <w:sz w:val="26"/>
+          <w:szCs w:val="26"/>
+        </w:rPr>
+        <w:t xml:space="preserve">Sau khi đăng ký thành công, hệ thống sẽ hiển thị mã QR cá nhân để phục vụ cho việc điểm danh khi tham gia sự kiện. </w:t>
+      </w:r>
+    </w:p>
+    <w:p>
+      <w:pPr>
+        <w:pStyle w:val="85"/>
+        <w:keepNext w:val="0"/>
+        <w:keepLines w:val="0"/>
+        <w:pageBreakBefore w:val="0"/>
+        <w:widowControl/>
+        <w:numPr>
+          <w:ilvl w:val="0"/>
+          <w:numId w:val="15"/>
+        </w:numPr>
+        <w:suppressLineNumbers w:val="0"/>
+        <w:tabs>
+          <w:tab w:val="left" w:pos="600"/>
+          <w:tab w:val="clear" w:pos="420"/>
+        </w:tabs>
+        <w:kinsoku/>
+        <w:wordWrap/>
+        <w:overflowPunct/>
+        <w:topLinePunct w:val="0"/>
+        <w:autoSpaceDE/>
+        <w:autoSpaceDN/>
+        <w:bidi w:val="0"/>
+        <w:adjustRightInd/>
+        <w:snapToGrid/>
+        <w:spacing w:before="120" w:beforeAutospacing="0" w:after="120" w:afterAutospacing="0" w:line="360" w:lineRule="auto"/>
+        <w:ind w:left="420" w:leftChars="0" w:hanging="20" w:firstLineChars="0"/>
+        <w:jc w:val="both"/>
+        <w:textAlignment w:val="auto"/>
+        <w:rPr>
+          <w:b w:val="0"/>
+          <w:bCs w:val="0"/>
+          <w:sz w:val="26"/>
+          <w:szCs w:val="26"/>
+        </w:rPr>
+      </w:pPr>
+      <w:r>
+        <w:rPr>
+          <w:b w:val="0"/>
+          <w:bCs w:val="0"/>
+          <w:sz w:val="26"/>
+          <w:szCs w:val="26"/>
+        </w:rPr>
+        <w:t>Đồng thời triển khai thêm chức năng hủy đăng ký sự kiện trên ứng dụng mobile.</w:t>
+      </w:r>
+    </w:p>
+    <w:p>
+      <w:pPr>
+        <w:pStyle w:val="85"/>
+        <w:keepNext w:val="0"/>
+        <w:keepLines w:val="0"/>
+        <w:pageBreakBefore w:val="0"/>
+        <w:widowControl/>
+        <w:numPr>
+          <w:ilvl w:val="0"/>
+          <w:numId w:val="15"/>
+        </w:numPr>
+        <w:suppressLineNumbers w:val="0"/>
+        <w:tabs>
+          <w:tab w:val="left" w:pos="600"/>
+          <w:tab w:val="clear" w:pos="420"/>
+        </w:tabs>
+        <w:kinsoku/>
+        <w:wordWrap/>
+        <w:overflowPunct/>
+        <w:topLinePunct w:val="0"/>
+        <w:autoSpaceDE/>
+        <w:autoSpaceDN/>
+        <w:bidi w:val="0"/>
+        <w:adjustRightInd/>
+        <w:snapToGrid/>
+        <w:spacing w:before="120" w:beforeAutospacing="0" w:after="120" w:afterAutospacing="0" w:line="360" w:lineRule="auto"/>
+        <w:ind w:left="420" w:leftChars="0" w:hanging="20" w:firstLineChars="0"/>
+        <w:jc w:val="both"/>
+        <w:textAlignment w:val="auto"/>
+        <w:rPr>
+          <w:b w:val="0"/>
+          <w:bCs w:val="0"/>
+          <w:sz w:val="26"/>
+          <w:szCs w:val="26"/>
+        </w:rPr>
+      </w:pPr>
+      <w:r>
+        <w:rPr>
+          <w:b w:val="0"/>
+          <w:bCs w:val="0"/>
+          <w:sz w:val="26"/>
+          <w:szCs w:val="26"/>
+        </w:rPr>
+        <w:t xml:space="preserve">Triển khai bước đầu việc tích hợp Google Sheets vào backend. </w:t>
+      </w:r>
+    </w:p>
+    <w:p>
+      <w:pPr>
+        <w:pStyle w:val="85"/>
+        <w:keepNext w:val="0"/>
+        <w:keepLines w:val="0"/>
+        <w:pageBreakBefore w:val="0"/>
+        <w:widowControl/>
+        <w:numPr>
+          <w:ilvl w:val="0"/>
+          <w:numId w:val="15"/>
+        </w:numPr>
+        <w:suppressLineNumbers w:val="0"/>
+        <w:tabs>
+          <w:tab w:val="left" w:pos="600"/>
+          <w:tab w:val="clear" w:pos="420"/>
+        </w:tabs>
+        <w:kinsoku/>
+        <w:wordWrap/>
+        <w:overflowPunct/>
+        <w:topLinePunct w:val="0"/>
+        <w:autoSpaceDE/>
+        <w:autoSpaceDN/>
+        <w:bidi w:val="0"/>
+        <w:adjustRightInd/>
+        <w:snapToGrid/>
+        <w:spacing w:before="120" w:beforeAutospacing="0" w:after="120" w:afterAutospacing="0" w:line="360" w:lineRule="auto"/>
+        <w:ind w:left="420" w:leftChars="0" w:hanging="20" w:firstLineChars="0"/>
+        <w:jc w:val="both"/>
+        <w:textAlignment w:val="auto"/>
+        <w:rPr>
+          <w:b w:val="0"/>
+          <w:bCs w:val="0"/>
+          <w:sz w:val="26"/>
+          <w:szCs w:val="26"/>
+        </w:rPr>
+      </w:pPr>
+      <w:r>
+        <w:rPr>
+          <w:b w:val="0"/>
+          <w:bCs w:val="0"/>
+          <w:sz w:val="26"/>
+          <w:szCs w:val="26"/>
+        </w:rPr>
+        <w:t>Thực hiện nghiên cứu cách kết nối API và chuẩn bị cấu hình cần thiết để sau này có thể lưu trữ và theo dõi danh sách sinh viên tham gia sự kiện thông qua Google Sheets.</w:t>
+      </w:r>
+    </w:p>
+    <w:p>
+      <w:pPr>
+        <w:pStyle w:val="85"/>
+        <w:keepNext w:val="0"/>
+        <w:keepLines w:val="0"/>
+        <w:pageBreakBefore w:val="0"/>
+        <w:widowControl/>
+        <w:numPr>
+          <w:ilvl w:val="0"/>
+          <w:numId w:val="0"/>
+        </w:numPr>
+        <w:suppressLineNumbers w:val="0"/>
+        <w:kinsoku/>
+        <w:wordWrap/>
+        <w:overflowPunct/>
+        <w:topLinePunct w:val="0"/>
+        <w:autoSpaceDE/>
+        <w:autoSpaceDN/>
+        <w:bidi w:val="0"/>
+        <w:adjustRightInd/>
+        <w:snapToGrid/>
+        <w:spacing w:before="120" w:beforeAutospacing="0" w:after="120" w:afterAutospacing="0" w:line="360" w:lineRule="auto"/>
+        <w:ind w:leftChars="0" w:right="0" w:rightChars="0"/>
+        <w:jc w:val="both"/>
+        <w:textAlignment w:val="auto"/>
+        <w:rPr>
+          <w:rFonts w:hint="default" w:ascii="Times New Roman" w:hAnsi="Times New Roman" w:cs="Times New Roman"/>
+          <w:b w:val="0"/>
+          <w:bCs w:val="0"/>
+          <w:sz w:val="26"/>
+          <w:szCs w:val="26"/>
+          <w:lang w:val="en-US"/>
+        </w:rPr>
+      </w:pPr>
+    </w:p>
+    <w:p>
+      <w:pPr>
         <w:keepNext w:val="0"/>
         <w:keepLines w:val="0"/>
         <w:pageBreakBefore w:val="0"/>
@@ -1712,6 +2101,7 @@
         <w:adjustRightInd/>
         <w:snapToGrid/>
         <w:spacing w:before="120" w:beforeAutospacing="0" w:after="120" w:afterAutospacing="0" w:line="360" w:lineRule="auto"/>
+        <w:jc w:val="both"/>
         <w:textAlignment w:val="auto"/>
         <w:rPr>
           <w:rFonts w:hint="default" w:ascii="Times New Roman" w:hAnsi="Times New Roman" w:cs="Times New Roman"/>
@@ -2005,6 +2395,28 @@
       </w:rPr>
     </w:lvl>
   </w:abstractNum>
+  <w:abstractNum w:abstractNumId="14">
+    <w:nsid w:val="6D9679EE"/>
+    <w:multiLevelType w:val="singleLevel"/>
+    <w:tmpl w:val="6D9679EE"/>
+    <w:lvl w:ilvl="0" w:tentative="0">
+      <w:start w:val="1"/>
+      <w:numFmt w:val="bullet"/>
+      <w:lvlText w:val=""/>
+      <w:lvlJc w:val="left"/>
+      <w:pPr>
+        <w:tabs>
+          <w:tab w:val="left" w:pos="420"/>
+        </w:tabs>
+        <w:ind w:left="420" w:leftChars="0" w:hanging="420" w:firstLineChars="0"/>
+      </w:pPr>
+      <w:rPr>
+        <w:rFonts w:hint="default" w:ascii="Wingdings" w:hAnsi="Wingdings"/>
+        <w:sz w:val="18"/>
+        <w:szCs w:val="18"/>
+      </w:rPr>
+    </w:lvl>
+  </w:abstractNum>
   <w:num w:numId="1">
     <w:abstractNumId w:val="10"/>
   </w:num>
@@ -2047,6 +2459,9 @@
   <w:num w:numId="14">
     <w:abstractNumId w:val="11"/>
   </w:num>
+  <w:num w:numId="15">
+    <w:abstractNumId w:val="14"/>
+  </w:num>
 </w:numbering>
 </file>
 
@@ -2078,27 +2493,27 @@
     <w:lsdException w:qFormat="1" w:unhideWhenUsed="0" w:uiPriority="0" w:semiHidden="0" w:name="index 5"/>
     <w:lsdException w:qFormat="1" w:unhideWhenUsed="0" w:uiPriority="0" w:semiHidden="0" w:name="index 6"/>
     <w:lsdException w:qFormat="1" w:unhideWhenUsed="0" w:uiPriority="0" w:semiHidden="0" w:name="index 7"/>
-    <w:lsdException w:unhideWhenUsed="0" w:uiPriority="0" w:semiHidden="0" w:name="index 8"/>
+    <w:lsdException w:qFormat="1" w:unhideWhenUsed="0" w:uiPriority="0" w:semiHidden="0" w:name="index 8"/>
     <w:lsdException w:qFormat="1" w:unhideWhenUsed="0" w:uiPriority="0" w:semiHidden="0" w:name="index 9"/>
     <w:lsdException w:qFormat="1" w:unhideWhenUsed="0" w:uiPriority="0" w:semiHidden="0" w:name="toc 1"/>
     <w:lsdException w:unhideWhenUsed="0" w:uiPriority="0" w:semiHidden="0" w:name="toc 2"/>
     <w:lsdException w:qFormat="1" w:unhideWhenUsed="0" w:uiPriority="0" w:semiHidden="0" w:name="toc 3"/>
     <w:lsdException w:qFormat="1" w:unhideWhenUsed="0" w:uiPriority="0" w:semiHidden="0" w:name="toc 4"/>
     <w:lsdException w:qFormat="1" w:unhideWhenUsed="0" w:uiPriority="0" w:semiHidden="0" w:name="toc 5"/>
-    <w:lsdException w:unhideWhenUsed="0" w:uiPriority="0" w:semiHidden="0" w:name="toc 6"/>
+    <w:lsdException w:qFormat="1" w:unhideWhenUsed="0" w:uiPriority="0" w:semiHidden="0" w:name="toc 6"/>
     <w:lsdException w:qFormat="1" w:unhideWhenUsed="0" w:uiPriority="0" w:semiHidden="0" w:name="toc 7"/>
-    <w:lsdException w:unhideWhenUsed="0" w:uiPriority="0" w:semiHidden="0" w:name="toc 8"/>
+    <w:lsdException w:qFormat="1" w:unhideWhenUsed="0" w:uiPriority="0" w:semiHidden="0" w:name="toc 8"/>
     <w:lsdException w:qFormat="1" w:unhideWhenUsed="0" w:uiPriority="0" w:semiHidden="0" w:name="toc 9"/>
     <w:lsdException w:qFormat="1" w:unhideWhenUsed="0" w:uiPriority="0" w:semiHidden="0" w:name="Normal Indent"/>
     <w:lsdException w:qFormat="1" w:unhideWhenUsed="0" w:uiPriority="0" w:semiHidden="0" w:name="footnote text"/>
     <w:lsdException w:qFormat="1" w:unhideWhenUsed="0" w:uiPriority="0" w:semiHidden="0" w:name="annotation text"/>
     <w:lsdException w:qFormat="1" w:unhideWhenUsed="0" w:uiPriority="0" w:semiHidden="0" w:name="header"/>
     <w:lsdException w:qFormat="1" w:unhideWhenUsed="0" w:uiPriority="0" w:semiHidden="0" w:name="footer"/>
-    <w:lsdException w:unhideWhenUsed="0" w:uiPriority="0" w:semiHidden="0" w:name="index heading"/>
+    <w:lsdException w:qFormat="1" w:unhideWhenUsed="0" w:uiPriority="0" w:semiHidden="0" w:name="index heading"/>
     <w:lsdException w:qFormat="1" w:uiPriority="0" w:name="caption"/>
     <w:lsdException w:qFormat="1" w:unhideWhenUsed="0" w:uiPriority="0" w:semiHidden="0" w:name="table of figures"/>
-    <w:lsdException w:unhideWhenUsed="0" w:uiPriority="0" w:semiHidden="0" w:name="envelope address"/>
-    <w:lsdException w:unhideWhenUsed="0" w:uiPriority="0" w:semiHidden="0" w:name="envelope return"/>
+    <w:lsdException w:qFormat="1" w:unhideWhenUsed="0" w:uiPriority="0" w:semiHidden="0" w:name="envelope address"/>
+    <w:lsdException w:qFormat="1" w:unhideWhenUsed="0" w:uiPriority="0" w:semiHidden="0" w:name="envelope return"/>
     <w:lsdException w:qFormat="1" w:unhideWhenUsed="0" w:uiPriority="0" w:semiHidden="0" w:name="footnote reference"/>
     <w:lsdException w:qFormat="1" w:unhideWhenUsed="0" w:uiPriority="0" w:semiHidden="0" w:name="annotation reference"/>
     <w:lsdException w:qFormat="1" w:unhideWhenUsed="0" w:uiPriority="0" w:semiHidden="0" w:name="line number"/>
@@ -2106,7 +2521,7 @@
     <w:lsdException w:qFormat="1" w:unhideWhenUsed="0" w:uiPriority="0" w:semiHidden="0" w:name="endnote reference"/>
     <w:lsdException w:qFormat="1" w:unhideWhenUsed="0" w:uiPriority="0" w:semiHidden="0" w:name="endnote text"/>
     <w:lsdException w:qFormat="1" w:unhideWhenUsed="0" w:uiPriority="0" w:semiHidden="0" w:name="table of authorities"/>
-    <w:lsdException w:unhideWhenUsed="0" w:uiPriority="0" w:semiHidden="0" w:name="macro"/>
+    <w:lsdException w:qFormat="1" w:unhideWhenUsed="0" w:uiPriority="0" w:semiHidden="0" w:name="macro"/>
     <w:lsdException w:qFormat="1" w:unhideWhenUsed="0" w:uiPriority="0" w:semiHidden="0" w:name="toa heading"/>
     <w:lsdException w:qFormat="1" w:unhideWhenUsed="0" w:uiPriority="0" w:semiHidden="0" w:name="List"/>
     <w:lsdException w:qFormat="1" w:unhideWhenUsed="0" w:uiPriority="0" w:semiHidden="0" w:name="List Bullet"/>
@@ -2114,12 +2529,12 @@
     <w:lsdException w:qFormat="1" w:unhideWhenUsed="0" w:uiPriority="0" w:semiHidden="0" w:name="List 2"/>
     <w:lsdException w:qFormat="1" w:unhideWhenUsed="0" w:uiPriority="0" w:semiHidden="0" w:name="List 3"/>
     <w:lsdException w:qFormat="1" w:unhideWhenUsed="0" w:uiPriority="0" w:semiHidden="0" w:name="List 4"/>
-    <w:lsdException w:unhideWhenUsed="0" w:uiPriority="0" w:semiHidden="0" w:name="List 5"/>
+    <w:lsdException w:qFormat="1" w:unhideWhenUsed="0" w:uiPriority="0" w:semiHidden="0" w:name="List 5"/>
     <w:lsdException w:qFormat="1" w:unhideWhenUsed="0" w:uiPriority="0" w:semiHidden="0" w:name="List Bullet 2"/>
     <w:lsdException w:qFormat="1" w:unhideWhenUsed="0" w:uiPriority="0" w:semiHidden="0" w:name="List Bullet 3"/>
     <w:lsdException w:qFormat="1" w:unhideWhenUsed="0" w:uiPriority="0" w:semiHidden="0" w:name="List Bullet 4"/>
     <w:lsdException w:qFormat="1" w:unhideWhenUsed="0" w:uiPriority="0" w:semiHidden="0" w:name="List Bullet 5"/>
-    <w:lsdException w:unhideWhenUsed="0" w:uiPriority="0" w:semiHidden="0" w:name="List Number 2"/>
+    <w:lsdException w:qFormat="1" w:unhideWhenUsed="0" w:uiPriority="0" w:semiHidden="0" w:name="List Number 2"/>
     <w:lsdException w:qFormat="1" w:unhideWhenUsed="0" w:uiPriority="0" w:semiHidden="0" w:name="List Number 3"/>
     <w:lsdException w:qFormat="1" w:unhideWhenUsed="0" w:uiPriority="0" w:semiHidden="0" w:name="List Number 4"/>
     <w:lsdException w:qFormat="1" w:unhideWhenUsed="0" w:uiPriority="0" w:semiHidden="0" w:name="List Number 5"/>
@@ -2129,7 +2544,7 @@
     <w:lsdException w:qFormat="1" w:unhideWhenUsed="0" w:uiPriority="0" w:name="Default Paragraph Font"/>
     <w:lsdException w:qFormat="1" w:unhideWhenUsed="0" w:uiPriority="0" w:semiHidden="0" w:name="Body Text"/>
     <w:lsdException w:qFormat="1" w:unhideWhenUsed="0" w:uiPriority="0" w:semiHidden="0" w:name="Body Text Indent"/>
-    <w:lsdException w:unhideWhenUsed="0" w:uiPriority="0" w:semiHidden="0" w:name="List Continue"/>
+    <w:lsdException w:qFormat="1" w:unhideWhenUsed="0" w:uiPriority="0" w:semiHidden="0" w:name="List Continue"/>
     <w:lsdException w:qFormat="1" w:unhideWhenUsed="0" w:uiPriority="0" w:semiHidden="0" w:name="List Continue 2"/>
     <w:lsdException w:qFormat="1" w:unhideWhenUsed="0" w:uiPriority="0" w:semiHidden="0" w:name="List Continue 3"/>
     <w:lsdException w:qFormat="1" w:unhideWhenUsed="0" w:uiPriority="0" w:semiHidden="0" w:name="List Continue 4"/>
@@ -2137,7 +2552,7 @@
     <w:lsdException w:qFormat="1" w:unhideWhenUsed="0" w:uiPriority="0" w:semiHidden="0" w:name="Message Header"/>
     <w:lsdException w:qFormat="1" w:unhideWhenUsed="0" w:uiPriority="0" w:semiHidden="0" w:name="Subtitle"/>
     <w:lsdException w:qFormat="1" w:unhideWhenUsed="0" w:uiPriority="0" w:semiHidden="0" w:name="Salutation"/>
-    <w:lsdException w:unhideWhenUsed="0" w:uiPriority="0" w:semiHidden="0" w:name="Date"/>
+    <w:lsdException w:qFormat="1" w:unhideWhenUsed="0" w:uiPriority="0" w:semiHidden="0" w:name="Date"/>
     <w:lsdException w:qFormat="1" w:unhideWhenUsed="0" w:uiPriority="0" w:semiHidden="0" w:name="Body Text First Indent"/>
     <w:lsdException w:qFormat="1" w:unhideWhenUsed="0" w:uiPriority="0" w:semiHidden="0" w:name="Body Text First Indent 2"/>
     <w:lsdException w:unhideWhenUsed="0" w:uiPriority="0" w:semiHidden="0" w:name="Note Heading"/>
@@ -2154,10 +2569,10 @@
     <w:lsdException w:qFormat="1" w:unhideWhenUsed="0" w:uiPriority="0" w:semiHidden="0" w:name="Plain Text"/>
     <w:lsdException w:qFormat="1" w:unhideWhenUsed="0" w:uiPriority="0" w:semiHidden="0" w:name="E-mail Signature"/>
     <w:lsdException w:qFormat="1" w:unhideWhenUsed="0" w:uiPriority="0" w:semiHidden="0" w:name="Normal (Web)"/>
-    <w:lsdException w:unhideWhenUsed="0" w:uiPriority="0" w:semiHidden="0" w:name="HTML Acronym"/>
-    <w:lsdException w:unhideWhenUsed="0" w:uiPriority="0" w:semiHidden="0" w:name="HTML Address"/>
+    <w:lsdException w:qFormat="1" w:unhideWhenUsed="0" w:uiPriority="0" w:semiHidden="0" w:name="HTML Acronym"/>
+    <w:lsdException w:qFormat="1" w:unhideWhenUsed="0" w:uiPriority="0" w:semiHidden="0" w:name="HTML Address"/>
     <w:lsdException w:qFormat="1" w:unhideWhenUsed="0" w:uiPriority="0" w:semiHidden="0" w:name="HTML Cite"/>
-    <w:lsdException w:unhideWhenUsed="0" w:uiPriority="0" w:semiHidden="0" w:name="HTML Code"/>
+    <w:lsdException w:qFormat="1" w:unhideWhenUsed="0" w:uiPriority="0" w:semiHidden="0" w:name="HTML Code"/>
     <w:lsdException w:qFormat="1" w:unhideWhenUsed="0" w:uiPriority="0" w:semiHidden="0" w:name="HTML Definition"/>
     <w:lsdException w:qFormat="1" w:unhideWhenUsed="0" w:uiPriority="0" w:semiHidden="0" w:name="HTML Keyboard"/>
     <w:lsdException w:qFormat="1" w:unhideWhenUsed="0" w:uiPriority="0" w:semiHidden="0" w:name="HTML Preformatted"/>
@@ -2239,8 +2654,8 @@
     <w:lsdException w:qFormat="1" w:unhideWhenUsed="0" w:uiPriority="71" w:semiHidden="0" w:name="Colorful Shading Accent 1"/>
     <w:lsdException w:qFormat="1" w:unhideWhenUsed="0" w:uiPriority="72" w:semiHidden="0" w:name="Colorful List Accent 1"/>
     <w:lsdException w:qFormat="1" w:unhideWhenUsed="0" w:uiPriority="73" w:semiHidden="0" w:name="Colorful Grid Accent 1"/>
-    <w:lsdException w:unhideWhenUsed="0" w:uiPriority="60" w:semiHidden="0" w:name="Light Shading Accent 2"/>
-    <w:lsdException w:unhideWhenUsed="0" w:uiPriority="61" w:semiHidden="0" w:name="Light List Accent 2"/>
+    <w:lsdException w:qFormat="1" w:unhideWhenUsed="0" w:uiPriority="60" w:semiHidden="0" w:name="Light Shading Accent 2"/>
+    <w:lsdException w:qFormat="1" w:unhideWhenUsed="0" w:uiPriority="61" w:semiHidden="0" w:name="Light List Accent 2"/>
     <w:lsdException w:unhideWhenUsed="0" w:uiPriority="62" w:semiHidden="0" w:name="Light Grid Accent 2"/>
     <w:lsdException w:unhideWhenUsed="0" w:uiPriority="63" w:semiHidden="0" w:name="Medium Shading 1 Accent 2"/>
     <w:lsdException w:qFormat="1" w:unhideWhenUsed="0" w:uiPriority="64" w:semiHidden="0" w:name="Medium Shading 2 Accent 2"/>
@@ -2267,8 +2682,8 @@
     <w:lsdException w:qFormat="1" w:unhideWhenUsed="0" w:uiPriority="71" w:semiHidden="0" w:name="Colorful Shading Accent 3"/>
     <w:lsdException w:qFormat="1" w:unhideWhenUsed="0" w:uiPriority="72" w:semiHidden="0" w:name="Colorful List Accent 3"/>
     <w:lsdException w:qFormat="1" w:unhideWhenUsed="0" w:uiPriority="73" w:semiHidden="0" w:name="Colorful Grid Accent 3"/>
-    <w:lsdException w:unhideWhenUsed="0" w:uiPriority="60" w:semiHidden="0" w:name="Light Shading Accent 4"/>
-    <w:lsdException w:unhideWhenUsed="0" w:uiPriority="61" w:semiHidden="0" w:name="Light List Accent 4"/>
+    <w:lsdException w:qFormat="1" w:unhideWhenUsed="0" w:uiPriority="60" w:semiHidden="0" w:name="Light Shading Accent 4"/>
+    <w:lsdException w:qFormat="1" w:unhideWhenUsed="0" w:uiPriority="61" w:semiHidden="0" w:name="Light List Accent 4"/>
     <w:lsdException w:qFormat="1" w:unhideWhenUsed="0" w:uiPriority="62" w:semiHidden="0" w:name="Light Grid Accent 4"/>
     <w:lsdException w:qFormat="1" w:unhideWhenUsed="0" w:uiPriority="63" w:semiHidden="0" w:name="Medium Shading 1 Accent 4"/>
     <w:lsdException w:qFormat="1" w:unhideWhenUsed="0" w:uiPriority="64" w:semiHidden="0" w:name="Medium Shading 2 Accent 4"/>
@@ -2282,7 +2697,7 @@
     <w:lsdException w:qFormat="1" w:unhideWhenUsed="0" w:uiPriority="72" w:semiHidden="0" w:name="Colorful List Accent 4"/>
     <w:lsdException w:qFormat="1" w:unhideWhenUsed="0" w:uiPriority="73" w:semiHidden="0" w:name="Colorful Grid Accent 4"/>
     <w:lsdException w:qFormat="1" w:unhideWhenUsed="0" w:uiPriority="60" w:semiHidden="0" w:name="Light Shading Accent 5"/>
-    <w:lsdException w:unhideWhenUsed="0" w:uiPriority="61" w:semiHidden="0" w:name="Light List Accent 5"/>
+    <w:lsdException w:qFormat="1" w:unhideWhenUsed="0" w:uiPriority="61" w:semiHidden="0" w:name="Light List Accent 5"/>
     <w:lsdException w:unhideWhenUsed="0" w:uiPriority="62" w:semiHidden="0" w:name="Light Grid Accent 5"/>
     <w:lsdException w:qFormat="1" w:unhideWhenUsed="0" w:uiPriority="63" w:semiHidden="0" w:name="Medium Shading 1 Accent 5"/>
     <w:lsdException w:qFormat="1" w:unhideWhenUsed="0" w:uiPriority="64" w:semiHidden="0" w:name="Medium Shading 2 Accent 5"/>
@@ -2295,7 +2710,7 @@
     <w:lsdException w:qFormat="1" w:unhideWhenUsed="0" w:uiPriority="71" w:semiHidden="0" w:name="Colorful Shading Accent 5"/>
     <w:lsdException w:qFormat="1" w:unhideWhenUsed="0" w:uiPriority="72" w:semiHidden="0" w:name="Colorful List Accent 5"/>
     <w:lsdException w:qFormat="1" w:unhideWhenUsed="0" w:uiPriority="73" w:semiHidden="0" w:name="Colorful Grid Accent 5"/>
-    <w:lsdException w:unhideWhenUsed="0" w:uiPriority="60" w:semiHidden="0" w:name="Light Shading Accent 6"/>
+    <w:lsdException w:qFormat="1" w:unhideWhenUsed="0" w:uiPriority="60" w:semiHidden="0" w:name="Light Shading Accent 6"/>
     <w:lsdException w:qFormat="1" w:unhideWhenUsed="0" w:uiPriority="61" w:semiHidden="0" w:name="Light List Accent 6"/>
     <w:lsdException w:unhideWhenUsed="0" w:uiPriority="62" w:semiHidden="0" w:name="Light Grid Accent 6"/>
     <w:lsdException w:qFormat="1" w:unhideWhenUsed="0" w:uiPriority="63" w:semiHidden="0" w:name="Medium Shading 1 Accent 6"/>
@@ -2680,6 +3095,7 @@
     <w:name w:val="Date"/>
     <w:basedOn w:val="1"/>
     <w:next w:val="1"/>
+    <w:qFormat/>
     <w:uiPriority w:val="0"/>
     <w:pPr>
       <w:ind w:left="100" w:leftChars="2500"/>
@@ -2732,6 +3148,7 @@
   <w:style w:type="paragraph" w:styleId="34">
     <w:name w:val="envelope address"/>
     <w:basedOn w:val="1"/>
+    <w:qFormat/>
     <w:uiPriority w:val="0"/>
     <w:pPr>
       <w:framePr w:w="7920" w:h="1980" w:hRule="exact" w:hSpace="180" w:wrap="auto" w:vAnchor="margin" w:hAnchor="page" w:xAlign="center" w:yAlign="bottom"/>
@@ -2747,6 +3164,7 @@
   <w:style w:type="paragraph" w:styleId="35">
     <w:name w:val="envelope return"/>
     <w:basedOn w:val="1"/>
+    <w:qFormat/>
     <w:uiPriority w:val="0"/>
     <w:pPr>
       <w:snapToGrid w:val="0"/>
@@ -2826,11 +3244,13 @@
   <w:style w:type="character" w:styleId="41">
     <w:name w:val="HTML Acronym"/>
     <w:basedOn w:val="11"/>
+    <w:qFormat/>
     <w:uiPriority w:val="0"/>
   </w:style>
   <w:style w:type="paragraph" w:styleId="42">
     <w:name w:val="HTML Address"/>
     <w:basedOn w:val="1"/>
+    <w:qFormat/>
     <w:uiPriority w:val="0"/>
     <w:rPr>
       <w:i/>
@@ -2850,6 +3270,7 @@
   <w:style w:type="character" w:styleId="44">
     <w:name w:val="HTML Code"/>
     <w:basedOn w:val="11"/>
+    <w:qFormat/>
     <w:uiPriority w:val="0"/>
     <w:rPr>
       <w:rFonts w:ascii="Courier New" w:hAnsi="Courier New" w:cs="Courier New"/>
@@ -2999,6 +3420,7 @@
     <w:name w:val="index 8"/>
     <w:basedOn w:val="1"/>
     <w:next w:val="1"/>
+    <w:qFormat/>
     <w:uiPriority w:val="0"/>
     <w:pPr>
       <w:ind w:left="1400" w:leftChars="1400"/>
@@ -3018,6 +3440,7 @@
     <w:name w:val="index heading"/>
     <w:basedOn w:val="1"/>
     <w:next w:val="52"/>
+    <w:qFormat/>
     <w:uiPriority w:val="0"/>
     <w:rPr>
       <w:rFonts w:ascii="Arial" w:hAnsi="Arial" w:cs="Arial"/>
@@ -3070,6 +3493,7 @@
   <w:style w:type="paragraph" w:styleId="67">
     <w:name w:val="List 5"/>
     <w:basedOn w:val="1"/>
+    <w:qFormat/>
     <w:uiPriority w:val="0"/>
     <w:pPr>
       <w:ind w:left="100" w:leftChars="800" w:hanging="200" w:hangingChars="200"/>
@@ -3138,6 +3562,7 @@
   <w:style w:type="paragraph" w:styleId="73">
     <w:name w:val="List Continue"/>
     <w:basedOn w:val="1"/>
+    <w:qFormat/>
     <w:uiPriority w:val="0"/>
     <w:pPr>
       <w:spacing w:after="120"/>
@@ -3199,6 +3624,7 @@
   <w:style w:type="paragraph" w:styleId="79">
     <w:name w:val="List Number 2"/>
     <w:basedOn w:val="1"/>
+    <w:qFormat/>
     <w:uiPriority w:val="0"/>
     <w:pPr>
       <w:numPr>
@@ -3245,6 +3671,7 @@
   </w:style>
   <w:style w:type="paragraph" w:styleId="83">
     <w:name w:val="macro"/>
+    <w:qFormat/>
     <w:uiPriority w:val="0"/>
     <w:pPr>
       <w:widowControl w:val="0"/>
@@ -6593,6 +7020,7 @@
     <w:name w:val="toc 6"/>
     <w:basedOn w:val="1"/>
     <w:next w:val="1"/>
+    <w:qFormat/>
     <w:uiPriority w:val="0"/>
     <w:pPr>
       <w:ind w:left="2100" w:leftChars="1000"/>
@@ -6612,6 +7040,7 @@
     <w:name w:val="toc 8"/>
     <w:basedOn w:val="1"/>
     <w:next w:val="1"/>
+    <w:qFormat/>
     <w:uiPriority w:val="0"/>
     <w:pPr>
       <w:ind w:left="2940" w:leftChars="1400"/>
@@ -6812,6 +7241,7 @@
   <w:style w:type="table" w:styleId="153">
     <w:name w:val="Light Shading Accent 2"/>
     <w:basedOn w:val="12"/>
+    <w:qFormat/>
     <w:uiPriority w:val="60"/>
     <w:rPr>
       <w:color w:val="943634"/>
@@ -6993,6 +7423,7 @@
   <w:style w:type="table" w:styleId="155">
     <w:name w:val="Light Shading Accent 4"/>
     <w:basedOn w:val="12"/>
+    <w:qFormat/>
     <w:uiPriority w:val="60"/>
     <w:rPr>
       <w:color w:val="5F497A"/>
@@ -7174,6 +7605,7 @@
   <w:style w:type="table" w:styleId="157">
     <w:name w:val="Light Shading Accent 6"/>
     <w:basedOn w:val="12"/>
+    <w:qFormat/>
     <w:uiPriority w:val="60"/>
     <w:rPr>
       <w:color w:val="E36C0A"/>
@@ -7424,6 +7856,7 @@
   <w:style w:type="table" w:styleId="160">
     <w:name w:val="Light List Accent 2"/>
     <w:basedOn w:val="12"/>
+    <w:qFormat/>
     <w:uiPriority w:val="61"/>
     <w:tblPr>
       <w:tblBorders>
@@ -7583,6 +8016,7 @@
   <w:style w:type="table" w:styleId="162">
     <w:name w:val="Light List Accent 4"/>
     <w:basedOn w:val="12"/>
+    <w:qFormat/>
     <w:uiPriority w:val="61"/>
     <w:tblPr>
       <w:tblBorders>
@@ -7662,6 +8096,7 @@
   <w:style w:type="table" w:styleId="163">
     <w:name w:val="Light List Accent 5"/>
     <w:basedOn w:val="12"/>
+    <w:qFormat/>
     <w:uiPriority w:val="61"/>
     <w:tblPr>
       <w:tblBorders>

</xml_diff>

<commit_message>
feat: integrate Google Sheets for event registration and attendance tracking
</commit_message>
<xml_diff>
--- a/BaoCaoTienDoThucTapTotNghiep.docx
+++ b/BaoCaoTienDoThucTapTotNghiep.docx
@@ -28,7 +28,6 @@
           <w:szCs w:val="30"/>
         </w:rPr>
       </w:pPr>
-      <w:bookmarkStart w:id="0" w:name="_GoBack"/>
       <w:r>
         <w:rPr>
           <w:rFonts w:hint="default" w:ascii="Times New Roman" w:hAnsi="Times New Roman" w:cs="Times New Roman"/>
@@ -38,7 +37,6 @@
         <w:t>BÁO CÁO TIẾN ĐỘ</w:t>
       </w:r>
     </w:p>
-    <w:bookmarkEnd w:id="0"/>
     <w:p>
       <w:pPr>
         <w:keepNext w:val="0"/>
@@ -2052,6 +2050,29 @@
     </w:p>
     <w:p>
       <w:pPr>
+        <w:rPr>
+          <w:rFonts w:hint="default" w:ascii="Times New Roman" w:hAnsi="Times New Roman" w:cs="Times New Roman"/>
+          <w:b w:val="0"/>
+          <w:bCs w:val="0"/>
+          <w:sz w:val="26"/>
+          <w:szCs w:val="26"/>
+          <w:lang w:val="en-US"/>
+        </w:rPr>
+      </w:pPr>
+      <w:r>
+        <w:rPr>
+          <w:rFonts w:hint="default" w:ascii="Times New Roman" w:hAnsi="Times New Roman" w:cs="Times New Roman"/>
+          <w:b w:val="0"/>
+          <w:bCs w:val="0"/>
+          <w:sz w:val="26"/>
+          <w:szCs w:val="26"/>
+          <w:lang w:val="en-US"/>
+        </w:rPr>
+        <w:br w:type="page"/>
+      </w:r>
+    </w:p>
+    <w:p>
+      <w:pPr>
         <w:pStyle w:val="85"/>
         <w:keepNext w:val="0"/>
         <w:keepLines w:val="0"/>
@@ -2059,6 +2080,197 @@
         <w:widowControl/>
         <w:numPr>
           <w:ilvl w:val="0"/>
+          <w:numId w:val="11"/>
+        </w:numPr>
+        <w:suppressLineNumbers w:val="0"/>
+        <w:kinsoku/>
+        <w:wordWrap/>
+        <w:overflowPunct/>
+        <w:topLinePunct w:val="0"/>
+        <w:autoSpaceDE/>
+        <w:autoSpaceDN/>
+        <w:bidi w:val="0"/>
+        <w:adjustRightInd/>
+        <w:snapToGrid/>
+        <w:spacing w:before="120" w:beforeAutospacing="0" w:after="120" w:afterAutospacing="0" w:line="360" w:lineRule="auto"/>
+        <w:ind w:left="0" w:leftChars="0" w:right="0" w:rightChars="0" w:firstLine="0" w:firstLineChars="0"/>
+        <w:jc w:val="both"/>
+        <w:textAlignment w:val="auto"/>
+        <w:rPr>
+          <w:rFonts w:hint="default" w:ascii="Times New Roman" w:hAnsi="Times New Roman" w:cs="Times New Roman"/>
+          <w:b w:val="0"/>
+          <w:bCs w:val="0"/>
+          <w:sz w:val="26"/>
+          <w:szCs w:val="26"/>
+          <w:lang w:val="en-US"/>
+        </w:rPr>
+      </w:pPr>
+      <w:r>
+        <w:rPr>
+          <w:rFonts w:hint="default" w:cs="Times New Roman"/>
+          <w:b w:val="0"/>
+          <w:bCs w:val="0"/>
+          <w:sz w:val="26"/>
+          <w:szCs w:val="26"/>
+          <w:lang w:val="vi-VN"/>
+        </w:rPr>
+        <w:t>Ngày 5</w:t>
+      </w:r>
+    </w:p>
+    <w:p>
+      <w:pPr>
+        <w:pStyle w:val="85"/>
+        <w:keepNext w:val="0"/>
+        <w:keepLines w:val="0"/>
+        <w:widowControl/>
+        <w:suppressLineNumbers w:val="0"/>
+      </w:pPr>
+      <w:r>
+        <w:rPr>
+          <w:rFonts w:ascii="Symbol" w:hAnsi="Symbol" w:eastAsia="Symbol" w:cs="Symbol"/>
+          <w:sz w:val="24"/>
+        </w:rPr>
+        <w:t>·</w:t>
+      </w:r>
+      <w:r>
+        <w:rPr>
+          <w:rFonts w:hint="eastAsia" w:ascii="SimSun" w:hAnsi="SimSun" w:eastAsia="SimSun" w:cs="SimSun"/>
+          <w:sz w:val="24"/>
+        </w:rPr>
+        <w:t xml:space="preserve">  </w:t>
+      </w:r>
+      <w:r>
+        <w:t>Sửa lỗi database và cập nhật schema.</w:t>
+      </w:r>
+    </w:p>
+    <w:p>
+      <w:pPr>
+        <w:pStyle w:val="85"/>
+        <w:keepNext w:val="0"/>
+        <w:keepLines w:val="0"/>
+        <w:widowControl/>
+        <w:suppressLineNumbers w:val="0"/>
+      </w:pPr>
+      <w:r>
+        <w:rPr>
+          <w:rFonts w:hint="default" w:ascii="Symbol" w:hAnsi="Symbol" w:eastAsia="Symbol" w:cs="Symbol"/>
+          <w:sz w:val="24"/>
+        </w:rPr>
+        <w:t>·</w:t>
+      </w:r>
+      <w:r>
+        <w:rPr>
+          <w:rFonts w:hint="eastAsia" w:ascii="SimSun" w:hAnsi="SimSun" w:eastAsia="SimSun" w:cs="SimSun"/>
+          <w:sz w:val="24"/>
+        </w:rPr>
+        <w:t xml:space="preserve">  </w:t>
+      </w:r>
+      <w:r>
+        <w:rPr>
+          <w:rFonts w:hint="default" w:ascii="Symbol" w:hAnsi="Symbol" w:eastAsia="Symbol" w:cs="Symbol"/>
+          <w:sz w:val="24"/>
+        </w:rPr>
+        <w:t>·</w:t>
+      </w:r>
+      <w:r>
+        <w:rPr>
+          <w:rFonts w:hint="eastAsia" w:ascii="SimSun" w:hAnsi="SimSun" w:eastAsia="SimSun" w:cs="SimSun"/>
+          <w:sz w:val="24"/>
+        </w:rPr>
+        <w:t xml:space="preserve">  </w:t>
+      </w:r>
+      <w:r>
+        <w:t>Refactor API điểm danh bằng QR.</w:t>
+      </w:r>
+    </w:p>
+    <w:p>
+      <w:pPr>
+        <w:pStyle w:val="85"/>
+        <w:keepNext w:val="0"/>
+        <w:keepLines w:val="0"/>
+        <w:widowControl/>
+        <w:suppressLineNumbers w:val="0"/>
+      </w:pPr>
+      <w:r>
+        <w:rPr>
+          <w:rFonts w:hint="default" w:ascii="Symbol" w:hAnsi="Symbol" w:eastAsia="Symbol" w:cs="Symbol"/>
+          <w:sz w:val="24"/>
+        </w:rPr>
+        <w:t>·</w:t>
+      </w:r>
+      <w:r>
+        <w:rPr>
+          <w:rFonts w:hint="eastAsia" w:ascii="SimSun" w:hAnsi="SimSun" w:eastAsia="SimSun" w:cs="SimSun"/>
+          <w:sz w:val="24"/>
+        </w:rPr>
+        <w:t xml:space="preserve">  </w:t>
+      </w:r>
+      <w:r>
+        <w:rPr>
+          <w:rFonts w:hint="default" w:ascii="Symbol" w:hAnsi="Symbol" w:eastAsia="Symbol" w:cs="Symbol"/>
+          <w:sz w:val="24"/>
+        </w:rPr>
+        <w:t>·</w:t>
+      </w:r>
+      <w:r>
+        <w:rPr>
+          <w:rFonts w:hint="eastAsia" w:ascii="SimSun" w:hAnsi="SimSun" w:eastAsia="SimSun" w:cs="SimSun"/>
+          <w:sz w:val="24"/>
+        </w:rPr>
+        <w:t xml:space="preserve">  </w:t>
+      </w:r>
+      <w:r>
+        <w:t>Tích hợp Google Sheets để lưu danh sách và trạng thái điểm danh.</w:t>
+      </w:r>
+    </w:p>
+    <w:p>
+      <w:pPr>
+        <w:pStyle w:val="85"/>
+        <w:keepNext w:val="0"/>
+        <w:keepLines w:val="0"/>
+        <w:widowControl/>
+        <w:suppressLineNumbers w:val="0"/>
+      </w:pPr>
+      <w:r>
+        <w:rPr>
+          <w:rFonts w:hint="default" w:ascii="Symbol" w:hAnsi="Symbol" w:eastAsia="Symbol" w:cs="Symbol"/>
+          <w:sz w:val="24"/>
+        </w:rPr>
+        <w:t>·</w:t>
+      </w:r>
+      <w:r>
+        <w:rPr>
+          <w:rFonts w:hint="eastAsia" w:ascii="SimSun" w:hAnsi="SimSun" w:eastAsia="SimSun" w:cs="SimSun"/>
+          <w:sz w:val="24"/>
+        </w:rPr>
+        <w:t xml:space="preserve">  </w:t>
+      </w:r>
+      <w:r>
+        <w:rPr>
+          <w:rFonts w:hint="default" w:ascii="Symbol" w:hAnsi="Symbol" w:eastAsia="Symbol" w:cs="Symbol"/>
+          <w:sz w:val="24"/>
+        </w:rPr>
+        <w:t>·</w:t>
+      </w:r>
+      <w:r>
+        <w:rPr>
+          <w:rFonts w:hint="eastAsia" w:ascii="SimSun" w:hAnsi="SimSun" w:eastAsia="SimSun" w:cs="SimSun"/>
+          <w:sz w:val="24"/>
+        </w:rPr>
+        <w:t xml:space="preserve">  </w:t>
+      </w:r>
+      <w:r>
+        <w:t>Cập nhật controllers, routes và services.</w:t>
+      </w:r>
+    </w:p>
+    <w:p>
+      <w:pPr>
+        <w:pStyle w:val="85"/>
+        <w:keepNext w:val="0"/>
+        <w:keepLines w:val="0"/>
+        <w:pageBreakBefore w:val="0"/>
+        <w:widowControl/>
+        <w:numPr>
           <w:numId w:val="0"/>
         </w:numPr>
         <w:suppressLineNumbers w:val="0"/>
@@ -2084,6 +2296,22 @@
           <w:lang w:val="en-US"/>
         </w:rPr>
       </w:pPr>
+      <w:r>
+        <w:rPr>
+          <w:rFonts w:hint="default" w:ascii="Symbol" w:hAnsi="Symbol" w:eastAsia="Symbol" w:cs="Symbol"/>
+          <w:sz w:val="24"/>
+        </w:rPr>
+        <w:t>·</w:t>
+      </w:r>
+      <w:r>
+        <w:rPr>
+          <w:rFonts w:hint="eastAsia" w:ascii="SimSun" w:hAnsi="SimSun" w:eastAsia="SimSun" w:cs="SimSun"/>
+          <w:sz w:val="24"/>
+        </w:rPr>
+        <w:t xml:space="preserve">  </w:t>
+      </w:r>
+      <w:bookmarkStart w:id="0" w:name="_GoBack"/>
+      <w:bookmarkEnd w:id="0"/>
     </w:p>
     <w:p>
       <w:pPr>
@@ -2555,7 +2783,7 @@
     <w:lsdException w:qFormat="1" w:unhideWhenUsed="0" w:uiPriority="0" w:semiHidden="0" w:name="Date"/>
     <w:lsdException w:qFormat="1" w:unhideWhenUsed="0" w:uiPriority="0" w:semiHidden="0" w:name="Body Text First Indent"/>
     <w:lsdException w:qFormat="1" w:unhideWhenUsed="0" w:uiPriority="0" w:semiHidden="0" w:name="Body Text First Indent 2"/>
-    <w:lsdException w:unhideWhenUsed="0" w:uiPriority="0" w:semiHidden="0" w:name="Note Heading"/>
+    <w:lsdException w:qFormat="1" w:unhideWhenUsed="0" w:uiPriority="0" w:semiHidden="0" w:name="Note Heading"/>
     <w:lsdException w:qFormat="1" w:unhideWhenUsed="0" w:uiPriority="0" w:semiHidden="0" w:name="Body Text 2"/>
     <w:lsdException w:qFormat="1" w:unhideWhenUsed="0" w:uiPriority="0" w:semiHidden="0" w:name="Body Text 3"/>
     <w:lsdException w:qFormat="1" w:unhideWhenUsed="0" w:uiPriority="0" w:semiHidden="0" w:name="Body Text Indent 2"/>
@@ -2592,7 +2820,7 @@
     <w:lsdException w:qFormat="1" w:unhideWhenUsed="0" w:uiPriority="0" w:semiHidden="0" w:name="Table Colorful 2"/>
     <w:lsdException w:qFormat="1" w:unhideWhenUsed="0" w:uiPriority="0" w:semiHidden="0" w:name="Table Colorful 3"/>
     <w:lsdException w:qFormat="1" w:unhideWhenUsed="0" w:uiPriority="0" w:semiHidden="0" w:name="Table Columns 1"/>
-    <w:lsdException w:unhideWhenUsed="0" w:uiPriority="0" w:semiHidden="0" w:name="Table Columns 2"/>
+    <w:lsdException w:qFormat="1" w:unhideWhenUsed="0" w:uiPriority="0" w:semiHidden="0" w:name="Table Columns 2"/>
     <w:lsdException w:qFormat="1" w:unhideWhenUsed="0" w:uiPriority="0" w:semiHidden="0" w:name="Table Columns 3"/>
     <w:lsdException w:qFormat="1" w:unhideWhenUsed="0" w:uiPriority="0" w:semiHidden="0" w:name="Table Columns 4"/>
     <w:lsdException w:qFormat="1" w:unhideWhenUsed="0" w:uiPriority="0" w:semiHidden="0" w:name="Table Columns 5"/>
@@ -2600,7 +2828,7 @@
     <w:lsdException w:qFormat="1" w:unhideWhenUsed="0" w:uiPriority="0" w:semiHidden="0" w:name="Table Grid 2"/>
     <w:lsdException w:qFormat="1" w:unhideWhenUsed="0" w:uiPriority="0" w:semiHidden="0" w:name="Table Grid 3"/>
     <w:lsdException w:qFormat="1" w:unhideWhenUsed="0" w:uiPriority="0" w:semiHidden="0" w:name="Table Grid 4"/>
-    <w:lsdException w:unhideWhenUsed="0" w:uiPriority="0" w:semiHidden="0" w:name="Table Grid 5"/>
+    <w:lsdException w:qFormat="1" w:unhideWhenUsed="0" w:uiPriority="0" w:semiHidden="0" w:name="Table Grid 5"/>
     <w:lsdException w:qFormat="1" w:unhideWhenUsed="0" w:uiPriority="0" w:semiHidden="0" w:name="Table Grid 6"/>
     <w:lsdException w:qFormat="1" w:unhideWhenUsed="0" w:uiPriority="0" w:semiHidden="0" w:name="Table Grid 7"/>
     <w:lsdException w:qFormat="1" w:unhideWhenUsed="0" w:uiPriority="0" w:semiHidden="0" w:name="Table Grid 8"/>
@@ -2609,7 +2837,7 @@
     <w:lsdException w:qFormat="1" w:unhideWhenUsed="0" w:uiPriority="0" w:semiHidden="0" w:name="Table List 3"/>
     <w:lsdException w:qFormat="1" w:unhideWhenUsed="0" w:uiPriority="0" w:semiHidden="0" w:name="Table List 4"/>
     <w:lsdException w:qFormat="1" w:unhideWhenUsed="0" w:uiPriority="0" w:semiHidden="0" w:name="Table List 5"/>
-    <w:lsdException w:unhideWhenUsed="0" w:uiPriority="0" w:semiHidden="0" w:name="Table List 6"/>
+    <w:lsdException w:qFormat="1" w:unhideWhenUsed="0" w:uiPriority="0" w:semiHidden="0" w:name="Table List 6"/>
     <w:lsdException w:qFormat="1" w:unhideWhenUsed="0" w:uiPriority="0" w:semiHidden="0" w:name="Table List 7"/>
     <w:lsdException w:qFormat="1" w:unhideWhenUsed="0" w:uiPriority="0" w:semiHidden="0" w:name="Table List 8"/>
     <w:lsdException w:qFormat="1" w:unhideWhenUsed="0" w:uiPriority="0" w:semiHidden="0" w:name="Table 3D effects 1"/>
@@ -2618,7 +2846,7 @@
     <w:lsdException w:qFormat="1" w:unhideWhenUsed="0" w:uiPriority="0" w:semiHidden="0" w:name="Table Contemporary"/>
     <w:lsdException w:qFormat="1" w:unhideWhenUsed="0" w:uiPriority="0" w:semiHidden="0" w:name="Table Elegant"/>
     <w:lsdException w:qFormat="1" w:unhideWhenUsed="0" w:uiPriority="0" w:semiHidden="0" w:name="Table Professional"/>
-    <w:lsdException w:unhideWhenUsed="0" w:uiPriority="0" w:semiHidden="0" w:name="Table Subtle 1"/>
+    <w:lsdException w:qFormat="1" w:unhideWhenUsed="0" w:uiPriority="0" w:semiHidden="0" w:name="Table Subtle 1"/>
     <w:lsdException w:qFormat="1" w:unhideWhenUsed="0" w:uiPriority="0" w:semiHidden="0" w:name="Table Subtle 2"/>
     <w:lsdException w:qFormat="1" w:unhideWhenUsed="0" w:uiPriority="0" w:semiHidden="0" w:name="Table Web 1"/>
     <w:lsdException w:qFormat="1" w:unhideWhenUsed="0" w:uiPriority="0" w:semiHidden="0" w:name="Table Web 2"/>
@@ -3751,6 +3979,7 @@
     <w:name w:val="Note Heading"/>
     <w:basedOn w:val="1"/>
     <w:next w:val="1"/>
+    <w:qFormat/>
     <w:uiPriority w:val="0"/>
     <w:pPr>
       <w:jc w:val="center"/>
@@ -4770,6 +4999,7 @@
   <w:style w:type="table" w:styleId="105">
     <w:name w:val="Table Columns 2"/>
     <w:basedOn w:val="12"/>
+    <w:qFormat/>
     <w:uiPriority w:val="0"/>
     <w:pPr>
       <w:widowControl w:val="0"/>
@@ -5525,6 +5755,7 @@
   <w:style w:type="table" w:styleId="116">
     <w:name w:val="Table Grid 5"/>
     <w:basedOn w:val="12"/>
+    <w:qFormat/>
     <w:uiPriority w:val="0"/>
     <w:pPr>
       <w:widowControl w:val="0"/>
@@ -6128,6 +6359,7 @@
   <w:style w:type="table" w:styleId="125">
     <w:name w:val="Table List 6"/>
     <w:basedOn w:val="12"/>
+    <w:qFormat/>
     <w:uiPriority w:val="0"/>
     <w:pPr>
       <w:widowControl w:val="0"/>
@@ -6629,6 +6861,7 @@
   <w:style w:type="table" w:styleId="134">
     <w:name w:val="Table Subtle 1"/>
     <w:basedOn w:val="12"/>
+    <w:qFormat/>
     <w:uiPriority w:val="0"/>
     <w:pPr>
       <w:widowControl w:val="0"/>

</xml_diff>

<commit_message>
feat(mobile): convert app to student-only version
</commit_message>
<xml_diff>
--- a/BaoCaoTienDoThucTapTotNghiep.docx
+++ b/BaoCaoTienDoThucTapTotNghiep.docx
@@ -2098,8 +2098,8 @@
         <w:textAlignment w:val="auto"/>
         <w:rPr>
           <w:rFonts w:hint="default" w:ascii="Times New Roman" w:hAnsi="Times New Roman" w:cs="Times New Roman"/>
-          <w:b w:val="0"/>
-          <w:bCs w:val="0"/>
+          <w:b/>
+          <w:bCs/>
           <w:sz w:val="26"/>
           <w:szCs w:val="26"/>
           <w:lang w:val="en-US"/>
@@ -2108,13 +2108,46 @@
       <w:r>
         <w:rPr>
           <w:rFonts w:hint="default" w:cs="Times New Roman"/>
-          <w:b w:val="0"/>
-          <w:bCs w:val="0"/>
+          <w:b/>
+          <w:bCs/>
           <w:sz w:val="26"/>
           <w:szCs w:val="26"/>
           <w:lang w:val="vi-VN"/>
         </w:rPr>
         <w:t>Ngày 5</w:t>
+      </w:r>
+      <w:r>
+        <w:rPr>
+          <w:rFonts w:hint="default" w:cs="Times New Roman"/>
+          <w:b/>
+          <w:bCs/>
+          <w:sz w:val="26"/>
+          <w:szCs w:val="26"/>
+          <w:lang w:val="en-US"/>
+        </w:rPr>
+        <w:t xml:space="preserve"> (10/</w:t>
+      </w:r>
+      <w:r>
+        <w:rPr>
+          <w:rFonts w:hint="default" w:cs="Times New Roman"/>
+          <w:b/>
+          <w:bCs/>
+          <w:sz w:val="26"/>
+          <w:szCs w:val="26"/>
+          <w:lang w:val="vi-VN"/>
+        </w:rPr>
+        <w:t>0</w:t>
+      </w:r>
+      <w:r>
+        <w:rPr>
+          <w:rFonts w:hint="default" w:cs="Times New Roman"/>
+          <w:b/>
+          <w:bCs/>
+          <w:sz w:val="26"/>
+          <w:szCs w:val="26"/>
+          <w:lang w:val="en-US"/>
+        </w:rPr>
+        <w:t>3/2026)</w:t>
       </w:r>
     </w:p>
     <w:p>
@@ -2125,20 +2158,6 @@
         <w:widowControl/>
         <w:suppressLineNumbers w:val="0"/>
       </w:pPr>
-      <w:r>
-        <w:rPr>
-          <w:rFonts w:ascii="Symbol" w:hAnsi="Symbol" w:eastAsia="Symbol" w:cs="Symbol"/>
-          <w:sz w:val="24"/>
-        </w:rPr>
-        <w:t>·</w:t>
-      </w:r>
-      <w:r>
-        <w:rPr>
-          <w:rFonts w:hint="eastAsia" w:ascii="SimSun" w:hAnsi="SimSun" w:eastAsia="SimSun" w:cs="SimSun"/>
-          <w:sz w:val="24"/>
-        </w:rPr>
-        <w:t xml:space="preserve">  </w:t>
-      </w:r>
       <w:r>
         <w:t>Sửa lỗi database và cập nhật schema.</w:t>
       </w:r>
@@ -2152,34 +2171,6 @@
         <w:suppressLineNumbers w:val="0"/>
       </w:pPr>
       <w:r>
-        <w:rPr>
-          <w:rFonts w:hint="default" w:ascii="Symbol" w:hAnsi="Symbol" w:eastAsia="Symbol" w:cs="Symbol"/>
-          <w:sz w:val="24"/>
-        </w:rPr>
-        <w:t>·</w:t>
-      </w:r>
-      <w:r>
-        <w:rPr>
-          <w:rFonts w:hint="eastAsia" w:ascii="SimSun" w:hAnsi="SimSun" w:eastAsia="SimSun" w:cs="SimSun"/>
-          <w:sz w:val="24"/>
-        </w:rPr>
-        <w:t xml:space="preserve">  </w:t>
-      </w:r>
-      <w:r>
-        <w:rPr>
-          <w:rFonts w:hint="default" w:ascii="Symbol" w:hAnsi="Symbol" w:eastAsia="Symbol" w:cs="Symbol"/>
-          <w:sz w:val="24"/>
-        </w:rPr>
-        <w:t>·</w:t>
-      </w:r>
-      <w:r>
-        <w:rPr>
-          <w:rFonts w:hint="eastAsia" w:ascii="SimSun" w:hAnsi="SimSun" w:eastAsia="SimSun" w:cs="SimSun"/>
-          <w:sz w:val="24"/>
-        </w:rPr>
-        <w:t xml:space="preserve">  </w:t>
-      </w:r>
-      <w:r>
         <w:t>Refactor API điểm danh bằng QR.</w:t>
       </w:r>
     </w:p>
@@ -2191,34 +2182,6 @@
         <w:widowControl/>
         <w:suppressLineNumbers w:val="0"/>
       </w:pPr>
-      <w:r>
-        <w:rPr>
-          <w:rFonts w:hint="default" w:ascii="Symbol" w:hAnsi="Symbol" w:eastAsia="Symbol" w:cs="Symbol"/>
-          <w:sz w:val="24"/>
-        </w:rPr>
-        <w:t>·</w:t>
-      </w:r>
-      <w:r>
-        <w:rPr>
-          <w:rFonts w:hint="eastAsia" w:ascii="SimSun" w:hAnsi="SimSun" w:eastAsia="SimSun" w:cs="SimSun"/>
-          <w:sz w:val="24"/>
-        </w:rPr>
-        <w:t xml:space="preserve">  </w:t>
-      </w:r>
-      <w:r>
-        <w:rPr>
-          <w:rFonts w:hint="default" w:ascii="Symbol" w:hAnsi="Symbol" w:eastAsia="Symbol" w:cs="Symbol"/>
-          <w:sz w:val="24"/>
-        </w:rPr>
-        <w:t>·</w:t>
-      </w:r>
-      <w:r>
-        <w:rPr>
-          <w:rFonts w:hint="eastAsia" w:ascii="SimSun" w:hAnsi="SimSun" w:eastAsia="SimSun" w:cs="SimSun"/>
-          <w:sz w:val="24"/>
-        </w:rPr>
-        <w:t xml:space="preserve">  </w:t>
-      </w:r>
       <w:r>
         <w:t>Tích hợp Google Sheets để lưu danh sách và trạng thái điểm danh.</w:t>
       </w:r>
@@ -2232,34 +2195,6 @@
         <w:suppressLineNumbers w:val="0"/>
       </w:pPr>
       <w:r>
-        <w:rPr>
-          <w:rFonts w:hint="default" w:ascii="Symbol" w:hAnsi="Symbol" w:eastAsia="Symbol" w:cs="Symbol"/>
-          <w:sz w:val="24"/>
-        </w:rPr>
-        <w:t>·</w:t>
-      </w:r>
-      <w:r>
-        <w:rPr>
-          <w:rFonts w:hint="eastAsia" w:ascii="SimSun" w:hAnsi="SimSun" w:eastAsia="SimSun" w:cs="SimSun"/>
-          <w:sz w:val="24"/>
-        </w:rPr>
-        <w:t xml:space="preserve">  </w:t>
-      </w:r>
-      <w:r>
-        <w:rPr>
-          <w:rFonts w:hint="default" w:ascii="Symbol" w:hAnsi="Symbol" w:eastAsia="Symbol" w:cs="Symbol"/>
-          <w:sz w:val="24"/>
-        </w:rPr>
-        <w:t>·</w:t>
-      </w:r>
-      <w:r>
-        <w:rPr>
-          <w:rFonts w:hint="eastAsia" w:ascii="SimSun" w:hAnsi="SimSun" w:eastAsia="SimSun" w:cs="SimSun"/>
-          <w:sz w:val="24"/>
-        </w:rPr>
-        <w:t xml:space="preserve">  </w:t>
-      </w:r>
-      <w:r>
         <w:t>Cập nhật controllers, routes và services.</w:t>
       </w:r>
     </w:p>
@@ -2271,7 +2206,8 @@
         <w:pageBreakBefore w:val="0"/>
         <w:widowControl/>
         <w:numPr>
-          <w:numId w:val="0"/>
+          <w:ilvl w:val="0"/>
+          <w:numId w:val="11"/>
         </w:numPr>
         <w:suppressLineNumbers w:val="0"/>
         <w:kinsoku/>
@@ -2284,13 +2220,13 @@
         <w:adjustRightInd/>
         <w:snapToGrid/>
         <w:spacing w:before="120" w:beforeAutospacing="0" w:after="120" w:afterAutospacing="0" w:line="360" w:lineRule="auto"/>
-        <w:ind w:leftChars="0" w:right="0" w:rightChars="0"/>
+        <w:ind w:left="0" w:leftChars="0" w:right="0" w:rightChars="0" w:firstLine="0" w:firstLineChars="0"/>
         <w:jc w:val="both"/>
         <w:textAlignment w:val="auto"/>
         <w:rPr>
           <w:rFonts w:hint="default" w:ascii="Times New Roman" w:hAnsi="Times New Roman" w:cs="Times New Roman"/>
-          <w:b w:val="0"/>
-          <w:bCs w:val="0"/>
+          <w:b/>
+          <w:bCs/>
           <w:sz w:val="26"/>
           <w:szCs w:val="26"/>
           <w:lang w:val="en-US"/>
@@ -2298,20 +2234,15 @@
       </w:pPr>
       <w:r>
         <w:rPr>
-          <w:rFonts w:hint="default" w:ascii="Symbol" w:hAnsi="Symbol" w:eastAsia="Symbol" w:cs="Symbol"/>
-          <w:sz w:val="24"/>
+          <w:rFonts w:hint="default" w:cs="Times New Roman"/>
+          <w:b/>
+          <w:bCs/>
+          <w:sz w:val="26"/>
+          <w:szCs w:val="26"/>
+          <w:lang w:val="vi-VN"/>
         </w:rPr>
-        <w:t>·</w:t>
+        <w:t>Ngày 6 (11/03/2026)</w:t>
       </w:r>
-      <w:r>
-        <w:rPr>
-          <w:rFonts w:hint="eastAsia" w:ascii="SimSun" w:hAnsi="SimSun" w:eastAsia="SimSun" w:cs="SimSun"/>
-          <w:sz w:val="24"/>
-        </w:rPr>
-        <w:t xml:space="preserve">  </w:t>
-      </w:r>
-      <w:bookmarkStart w:id="0" w:name="_GoBack"/>
-      <w:bookmarkEnd w:id="0"/>
     </w:p>
     <w:p>
       <w:pPr>
@@ -2337,6 +2268,8 @@
           <w:szCs w:val="26"/>
         </w:rPr>
       </w:pPr>
+      <w:bookmarkStart w:id="0" w:name="_GoBack"/>
+      <w:bookmarkEnd w:id="0"/>
     </w:p>
     <w:sectPr>
       <w:pgSz w:w="11906" w:h="16838"/>
@@ -2850,7 +2783,7 @@
     <w:lsdException w:qFormat="1" w:unhideWhenUsed="0" w:uiPriority="0" w:semiHidden="0" w:name="Table Subtle 2"/>
     <w:lsdException w:qFormat="1" w:unhideWhenUsed="0" w:uiPriority="0" w:semiHidden="0" w:name="Table Web 1"/>
     <w:lsdException w:qFormat="1" w:unhideWhenUsed="0" w:uiPriority="0" w:semiHidden="0" w:name="Table Web 2"/>
-    <w:lsdException w:unhideWhenUsed="0" w:uiPriority="0" w:semiHidden="0" w:name="Table Web 3"/>
+    <w:lsdException w:qFormat="1" w:unhideWhenUsed="0" w:uiPriority="0" w:semiHidden="0" w:name="Table Web 3"/>
     <w:lsdException w:qFormat="1" w:unhideWhenUsed="0" w:uiPriority="0" w:semiHidden="0" w:name="Balloon Text"/>
     <w:lsdException w:qFormat="1" w:unhideWhenUsed="0" w:uiPriority="0" w:semiHidden="0" w:name="Table Grid"/>
     <w:lsdException w:qFormat="1" w:unhideWhenUsed="0" w:uiPriority="0" w:semiHidden="0" w:name="Table Theme"/>
@@ -2885,7 +2818,7 @@
     <w:lsdException w:qFormat="1" w:unhideWhenUsed="0" w:uiPriority="60" w:semiHidden="0" w:name="Light Shading Accent 2"/>
     <w:lsdException w:qFormat="1" w:unhideWhenUsed="0" w:uiPriority="61" w:semiHidden="0" w:name="Light List Accent 2"/>
     <w:lsdException w:unhideWhenUsed="0" w:uiPriority="62" w:semiHidden="0" w:name="Light Grid Accent 2"/>
-    <w:lsdException w:unhideWhenUsed="0" w:uiPriority="63" w:semiHidden="0" w:name="Medium Shading 1 Accent 2"/>
+    <w:lsdException w:qFormat="1" w:unhideWhenUsed="0" w:uiPriority="63" w:semiHidden="0" w:name="Medium Shading 1 Accent 2"/>
     <w:lsdException w:qFormat="1" w:unhideWhenUsed="0" w:uiPriority="64" w:semiHidden="0" w:name="Medium Shading 2 Accent 2"/>
     <w:lsdException w:qFormat="1" w:unhideWhenUsed="0" w:uiPriority="65" w:semiHidden="0" w:name="Medium List 1 Accent 2"/>
     <w:lsdException w:qFormat="1" w:unhideWhenUsed="0" w:uiPriority="66" w:semiHidden="0" w:name="Medium List 2 Accent 2"/>
@@ -7135,6 +7068,7 @@
   <w:style w:type="table" w:styleId="139">
     <w:name w:val="Table Web 3"/>
     <w:basedOn w:val="12"/>
+    <w:qFormat/>
     <w:uiPriority w:val="0"/>
     <w:pPr>
       <w:widowControl w:val="0"/>
@@ -9498,6 +9432,7 @@
   <w:style w:type="table" w:styleId="174">
     <w:name w:val="Medium Shading 1 Accent 2"/>
     <w:basedOn w:val="12"/>
+    <w:qFormat/>
     <w:uiPriority w:val="63"/>
     <w:tblPr>
       <w:tblBorders>

</xml_diff>

<commit_message>
feat(web-admin): Implement event management system including event CRUD, registration, and attendance tracking.
</commit_message>
<xml_diff>
--- a/BaoCaoTienDoThucTapTotNghiep.docx
+++ b/BaoCaoTienDoThucTapTotNghiep.docx
@@ -2558,8 +2558,285 @@
         </w:rPr>
         <w:t>h.</w:t>
       </w:r>
+    </w:p>
+    <w:p>
+      <w:pPr>
+        <w:pStyle w:val="85"/>
+        <w:keepNext w:val="0"/>
+        <w:keepLines w:val="0"/>
+        <w:pageBreakBefore w:val="0"/>
+        <w:widowControl/>
+        <w:numPr>
+          <w:ilvl w:val="0"/>
+          <w:numId w:val="11"/>
+        </w:numPr>
+        <w:suppressLineNumbers w:val="0"/>
+        <w:kinsoku/>
+        <w:wordWrap/>
+        <w:overflowPunct/>
+        <w:topLinePunct w:val="0"/>
+        <w:autoSpaceDE/>
+        <w:autoSpaceDN/>
+        <w:bidi w:val="0"/>
+        <w:adjustRightInd/>
+        <w:snapToGrid/>
+        <w:spacing w:before="120" w:beforeAutospacing="0" w:after="120" w:afterAutospacing="0" w:line="360" w:lineRule="auto"/>
+        <w:ind w:left="0" w:leftChars="0" w:right="0" w:rightChars="0" w:firstLine="0" w:firstLineChars="0"/>
+        <w:textAlignment w:val="auto"/>
+        <w:rPr>
+          <w:rFonts w:hint="default" w:ascii="Times New Roman" w:hAnsi="Times New Roman" w:cs="Times New Roman"/>
+          <w:b/>
+          <w:bCs/>
+          <w:sz w:val="26"/>
+          <w:szCs w:val="26"/>
+          <w:lang w:val="en-US"/>
+        </w:rPr>
+      </w:pPr>
+      <w:r>
+        <w:rPr>
+          <w:rFonts w:hint="default" w:cs="Times New Roman"/>
+          <w:b/>
+          <w:bCs/>
+          <w:sz w:val="26"/>
+          <w:szCs w:val="26"/>
+          <w:lang w:val="vi-VN"/>
+        </w:rPr>
+        <w:t>Ngày 7 (12/03/2026)</w:t>
+      </w:r>
+    </w:p>
+    <w:p>
+      <w:pPr>
+        <w:pStyle w:val="85"/>
+        <w:keepNext w:val="0"/>
+        <w:keepLines w:val="0"/>
+        <w:pageBreakBefore w:val="0"/>
+        <w:widowControl/>
+        <w:numPr>
+          <w:ilvl w:val="0"/>
+          <w:numId w:val="17"/>
+        </w:numPr>
+        <w:suppressLineNumbers w:val="0"/>
+        <w:tabs>
+          <w:tab w:val="clear" w:pos="420"/>
+        </w:tabs>
+        <w:kinsoku/>
+        <w:wordWrap/>
+        <w:overflowPunct/>
+        <w:topLinePunct w:val="0"/>
+        <w:autoSpaceDE/>
+        <w:autoSpaceDN/>
+        <w:bidi w:val="0"/>
+        <w:adjustRightInd/>
+        <w:snapToGrid/>
+        <w:spacing w:before="120" w:beforeAutospacing="0" w:after="120" w:afterAutospacing="0" w:line="360" w:lineRule="auto"/>
+        <w:ind w:left="600" w:leftChars="0" w:hanging="200" w:firstLineChars="0"/>
+        <w:textAlignment w:val="auto"/>
+        <w:rPr>
+          <w:b w:val="0"/>
+          <w:bCs w:val="0"/>
+          <w:sz w:val="26"/>
+          <w:szCs w:val="26"/>
+        </w:rPr>
+      </w:pPr>
+      <w:r>
+        <w:rPr>
+          <w:b w:val="0"/>
+          <w:bCs w:val="0"/>
+          <w:sz w:val="26"/>
+          <w:szCs w:val="26"/>
+        </w:rPr>
+        <w:t xml:space="preserve">Thiết kế lại </w:t>
+      </w:r>
+      <w:r>
+        <w:rPr>
+          <w:rStyle w:val="92"/>
+          <w:b w:val="0"/>
+          <w:bCs w:val="0"/>
+          <w:sz w:val="26"/>
+          <w:szCs w:val="26"/>
+        </w:rPr>
+        <w:t>giao diện Dashboard</w:t>
+      </w:r>
+      <w:r>
+        <w:rPr>
+          <w:b w:val="0"/>
+          <w:bCs w:val="0"/>
+          <w:sz w:val="26"/>
+          <w:szCs w:val="26"/>
+        </w:rPr>
+        <w:t xml:space="preserve"> của hệ thống quản lý sự kiện.</w:t>
+      </w:r>
+    </w:p>
+    <w:p>
+      <w:pPr>
+        <w:pStyle w:val="85"/>
+        <w:keepNext w:val="0"/>
+        <w:keepLines w:val="0"/>
+        <w:pageBreakBefore w:val="0"/>
+        <w:widowControl/>
+        <w:numPr>
+          <w:ilvl w:val="0"/>
+          <w:numId w:val="17"/>
+        </w:numPr>
+        <w:suppressLineNumbers w:val="0"/>
+        <w:tabs>
+          <w:tab w:val="clear" w:pos="420"/>
+        </w:tabs>
+        <w:kinsoku/>
+        <w:wordWrap/>
+        <w:overflowPunct/>
+        <w:topLinePunct w:val="0"/>
+        <w:autoSpaceDE/>
+        <w:autoSpaceDN/>
+        <w:bidi w:val="0"/>
+        <w:adjustRightInd/>
+        <w:snapToGrid/>
+        <w:spacing w:before="120" w:beforeAutospacing="0" w:after="120" w:afterAutospacing="0" w:line="360" w:lineRule="auto"/>
+        <w:ind w:left="600" w:leftChars="0" w:hanging="200" w:firstLineChars="0"/>
+        <w:textAlignment w:val="auto"/>
+        <w:rPr>
+          <w:b w:val="0"/>
+          <w:bCs w:val="0"/>
+          <w:sz w:val="26"/>
+          <w:szCs w:val="26"/>
+        </w:rPr>
+      </w:pPr>
+      <w:r>
+        <w:rPr>
+          <w:b w:val="0"/>
+          <w:bCs w:val="0"/>
+          <w:sz w:val="26"/>
+          <w:szCs w:val="26"/>
+        </w:rPr>
+        <w:t xml:space="preserve">Sửa các lỗi </w:t>
+      </w:r>
+      <w:r>
+        <w:rPr>
+          <w:rStyle w:val="92"/>
+          <w:b w:val="0"/>
+          <w:bCs w:val="0"/>
+          <w:sz w:val="26"/>
+          <w:szCs w:val="26"/>
+        </w:rPr>
+        <w:t>la</w:t>
+      </w:r>
       <w:bookmarkStart w:id="0" w:name="_GoBack"/>
       <w:bookmarkEnd w:id="0"/>
+      <w:r>
+        <w:rPr>
+          <w:rStyle w:val="92"/>
+          <w:b w:val="0"/>
+          <w:bCs w:val="0"/>
+          <w:sz w:val="26"/>
+          <w:szCs w:val="26"/>
+        </w:rPr>
+        <w:t>yout và bố cục hiển thị</w:t>
+      </w:r>
+      <w:r>
+        <w:rPr>
+          <w:b w:val="0"/>
+          <w:bCs w:val="0"/>
+          <w:sz w:val="26"/>
+          <w:szCs w:val="26"/>
+        </w:rPr>
+        <w:t xml:space="preserve"> để giao diện rõ ràng và dễ sử dụng hơn.</w:t>
+      </w:r>
+    </w:p>
+    <w:p>
+      <w:pPr>
+        <w:pStyle w:val="85"/>
+        <w:keepNext w:val="0"/>
+        <w:keepLines w:val="0"/>
+        <w:pageBreakBefore w:val="0"/>
+        <w:widowControl/>
+        <w:numPr>
+          <w:ilvl w:val="0"/>
+          <w:numId w:val="17"/>
+        </w:numPr>
+        <w:suppressLineNumbers w:val="0"/>
+        <w:tabs>
+          <w:tab w:val="clear" w:pos="420"/>
+        </w:tabs>
+        <w:kinsoku/>
+        <w:wordWrap/>
+        <w:overflowPunct/>
+        <w:topLinePunct w:val="0"/>
+        <w:autoSpaceDE/>
+        <w:autoSpaceDN/>
+        <w:bidi w:val="0"/>
+        <w:adjustRightInd/>
+        <w:snapToGrid/>
+        <w:spacing w:before="120" w:beforeAutospacing="0" w:after="120" w:afterAutospacing="0" w:line="360" w:lineRule="auto"/>
+        <w:ind w:left="600" w:leftChars="0" w:hanging="200" w:firstLineChars="0"/>
+        <w:textAlignment w:val="auto"/>
+        <w:rPr>
+          <w:b w:val="0"/>
+          <w:bCs w:val="0"/>
+          <w:sz w:val="26"/>
+          <w:szCs w:val="26"/>
+        </w:rPr>
+      </w:pPr>
+      <w:r>
+        <w:rPr>
+          <w:b w:val="0"/>
+          <w:bCs w:val="0"/>
+          <w:sz w:val="26"/>
+          <w:szCs w:val="26"/>
+        </w:rPr>
+        <w:t xml:space="preserve">Cập nhật cấu trúc giao diện để phù hợp với </w:t>
+      </w:r>
+      <w:r>
+        <w:rPr>
+          <w:rStyle w:val="92"/>
+          <w:b w:val="0"/>
+          <w:bCs w:val="0"/>
+          <w:sz w:val="26"/>
+          <w:szCs w:val="26"/>
+        </w:rPr>
+        <w:t>hệ thống quản trị sự kiện</w:t>
+      </w:r>
+      <w:r>
+        <w:rPr>
+          <w:b w:val="0"/>
+          <w:bCs w:val="0"/>
+          <w:sz w:val="26"/>
+          <w:szCs w:val="26"/>
+        </w:rPr>
+        <w:t>.</w:t>
+      </w:r>
+    </w:p>
+    <w:p>
+      <w:pPr>
+        <w:pStyle w:val="85"/>
+        <w:keepNext w:val="0"/>
+        <w:keepLines w:val="0"/>
+        <w:pageBreakBefore w:val="0"/>
+        <w:widowControl/>
+        <w:numPr>
+          <w:numId w:val="0"/>
+        </w:numPr>
+        <w:suppressLineNumbers w:val="0"/>
+        <w:kinsoku/>
+        <w:wordWrap/>
+        <w:overflowPunct/>
+        <w:topLinePunct w:val="0"/>
+        <w:autoSpaceDE/>
+        <w:autoSpaceDN/>
+        <w:bidi w:val="0"/>
+        <w:adjustRightInd/>
+        <w:snapToGrid/>
+        <w:spacing w:before="120" w:beforeAutospacing="0" w:after="120" w:afterAutospacing="0" w:line="360" w:lineRule="auto"/>
+        <w:ind w:leftChars="0" w:right="0" w:rightChars="0"/>
+        <w:textAlignment w:val="auto"/>
+        <w:rPr>
+          <w:rFonts w:hint="default" w:ascii="Times New Roman" w:hAnsi="Times New Roman" w:cs="Times New Roman"/>
+          <w:b w:val="0"/>
+          <w:bCs w:val="0"/>
+          <w:sz w:val="26"/>
+          <w:szCs w:val="26"/>
+          <w:lang w:val="en-US"/>
+        </w:rPr>
+      </w:pPr>
     </w:p>
     <w:sectPr>
       <w:pgSz w:w="11906" w:h="16838"/>
@@ -2586,6 +2863,28 @@
     </w:lvl>
   </w:abstractNum>
   <w:abstractNum w:abstractNumId="1">
+    <w:nsid w:val="BC50E352"/>
+    <w:multiLevelType w:val="singleLevel"/>
+    <w:tmpl w:val="BC50E352"/>
+    <w:lvl w:ilvl="0" w:tentative="0">
+      <w:start w:val="1"/>
+      <w:numFmt w:val="bullet"/>
+      <w:lvlText w:val=""/>
+      <w:lvlJc w:val="left"/>
+      <w:pPr>
+        <w:tabs>
+          <w:tab w:val="left" w:pos="420"/>
+        </w:tabs>
+        <w:ind w:left="420" w:leftChars="0" w:hanging="420" w:firstLineChars="0"/>
+      </w:pPr>
+      <w:rPr>
+        <w:rFonts w:hint="default" w:ascii="Wingdings" w:hAnsi="Wingdings"/>
+        <w:sz w:val="16"/>
+        <w:szCs w:val="16"/>
+      </w:rPr>
+    </w:lvl>
+  </w:abstractNum>
+  <w:abstractNum w:abstractNumId="2">
     <w:nsid w:val="FFFFFF7C"/>
     <w:multiLevelType w:val="singleLevel"/>
     <w:tmpl w:val="FFFFFF7C"/>
@@ -2603,7 +2902,7 @@
       </w:pPr>
     </w:lvl>
   </w:abstractNum>
-  <w:abstractNum w:abstractNumId="2">
+  <w:abstractNum w:abstractNumId="3">
     <w:nsid w:val="FFFFFF7D"/>
     <w:multiLevelType w:val="singleLevel"/>
     <w:tmpl w:val="FFFFFF7D"/>
@@ -2621,7 +2920,7 @@
       </w:pPr>
     </w:lvl>
   </w:abstractNum>
-  <w:abstractNum w:abstractNumId="3">
+  <w:abstractNum w:abstractNumId="4">
     <w:nsid w:val="FFFFFF7E"/>
     <w:multiLevelType w:val="singleLevel"/>
     <w:tmpl w:val="FFFFFF7E"/>
@@ -2639,7 +2938,7 @@
       </w:pPr>
     </w:lvl>
   </w:abstractNum>
-  <w:abstractNum w:abstractNumId="4">
+  <w:abstractNum w:abstractNumId="5">
     <w:nsid w:val="FFFFFF7F"/>
     <w:multiLevelType w:val="singleLevel"/>
     <w:tmpl w:val="FFFFFF7F"/>
@@ -2657,7 +2956,7 @@
       </w:pPr>
     </w:lvl>
   </w:abstractNum>
-  <w:abstractNum w:abstractNumId="5">
+  <w:abstractNum w:abstractNumId="6">
     <w:nsid w:val="FFFFFF80"/>
     <w:multiLevelType w:val="singleLevel"/>
     <w:tmpl w:val="FFFFFF80"/>
@@ -2678,7 +2977,7 @@
       </w:rPr>
     </w:lvl>
   </w:abstractNum>
-  <w:abstractNum w:abstractNumId="6">
+  <w:abstractNum w:abstractNumId="7">
     <w:nsid w:val="FFFFFF81"/>
     <w:multiLevelType w:val="singleLevel"/>
     <w:tmpl w:val="FFFFFF81"/>
@@ -2699,7 +2998,7 @@
       </w:rPr>
     </w:lvl>
   </w:abstractNum>
-  <w:abstractNum w:abstractNumId="7">
+  <w:abstractNum w:abstractNumId="8">
     <w:nsid w:val="FFFFFF82"/>
     <w:multiLevelType w:val="singleLevel"/>
     <w:tmpl w:val="FFFFFF82"/>
@@ -2720,7 +3019,7 @@
       </w:rPr>
     </w:lvl>
   </w:abstractNum>
-  <w:abstractNum w:abstractNumId="8">
+  <w:abstractNum w:abstractNumId="9">
     <w:nsid w:val="FFFFFF83"/>
     <w:multiLevelType w:val="singleLevel"/>
     <w:tmpl w:val="FFFFFF83"/>
@@ -2741,7 +3040,7 @@
       </w:rPr>
     </w:lvl>
   </w:abstractNum>
-  <w:abstractNum w:abstractNumId="9">
+  <w:abstractNum w:abstractNumId="10">
     <w:nsid w:val="FFFFFF88"/>
     <w:multiLevelType w:val="singleLevel"/>
     <w:tmpl w:val="FFFFFF88"/>
@@ -2759,7 +3058,7 @@
       </w:pPr>
     </w:lvl>
   </w:abstractNum>
-  <w:abstractNum w:abstractNumId="10">
+  <w:abstractNum w:abstractNumId="11">
     <w:nsid w:val="FFFFFF89"/>
     <w:multiLevelType w:val="singleLevel"/>
     <w:tmpl w:val="FFFFFF89"/>
@@ -2780,7 +3079,7 @@
       </w:rPr>
     </w:lvl>
   </w:abstractNum>
-  <w:abstractNum w:abstractNumId="11">
+  <w:abstractNum w:abstractNumId="12">
     <w:nsid w:val="0BD6F2A8"/>
     <w:multiLevelType w:val="singleLevel"/>
     <w:tmpl w:val="0BD6F2A8"/>
@@ -2802,7 +3101,7 @@
       </w:rPr>
     </w:lvl>
   </w:abstractNum>
-  <w:abstractNum w:abstractNumId="12">
+  <w:abstractNum w:abstractNumId="13">
     <w:nsid w:val="36852227"/>
     <w:multiLevelType w:val="singleLevel"/>
     <w:tmpl w:val="36852227"/>
@@ -2824,7 +3123,7 @@
       </w:rPr>
     </w:lvl>
   </w:abstractNum>
-  <w:abstractNum w:abstractNumId="13">
+  <w:abstractNum w:abstractNumId="14">
     <w:nsid w:val="4CD697B2"/>
     <w:multiLevelType w:val="singleLevel"/>
     <w:tmpl w:val="4CD697B2"/>
@@ -2846,7 +3145,7 @@
       </w:rPr>
     </w:lvl>
   </w:abstractNum>
-  <w:abstractNum w:abstractNumId="14">
+  <w:abstractNum w:abstractNumId="15">
     <w:nsid w:val="6027A911"/>
     <w:multiLevelType w:val="singleLevel"/>
     <w:tmpl w:val="6027A911"/>
@@ -2868,7 +3167,7 @@
       </w:rPr>
     </w:lvl>
   </w:abstractNum>
-  <w:abstractNum w:abstractNumId="15">
+  <w:abstractNum w:abstractNumId="16">
     <w:nsid w:val="6D9679EE"/>
     <w:multiLevelType w:val="singleLevel"/>
     <w:tmpl w:val="6D9679EE"/>
@@ -2891,52 +3190,55 @@
     </w:lvl>
   </w:abstractNum>
   <w:num w:numId="1">
+    <w:abstractNumId w:val="11"/>
+  </w:num>
+  <w:num w:numId="2">
+    <w:abstractNumId w:val="9"/>
+  </w:num>
+  <w:num w:numId="3">
+    <w:abstractNumId w:val="8"/>
+  </w:num>
+  <w:num w:numId="4">
+    <w:abstractNumId w:val="7"/>
+  </w:num>
+  <w:num w:numId="5">
+    <w:abstractNumId w:val="6"/>
+  </w:num>
+  <w:num w:numId="6">
     <w:abstractNumId w:val="10"/>
   </w:num>
-  <w:num w:numId="2">
-    <w:abstractNumId w:val="8"/>
-  </w:num>
-  <w:num w:numId="3">
-    <w:abstractNumId w:val="7"/>
-  </w:num>
-  <w:num w:numId="4">
-    <w:abstractNumId w:val="6"/>
-  </w:num>
-  <w:num w:numId="5">
+  <w:num w:numId="7">
     <w:abstractNumId w:val="5"/>
   </w:num>
-  <w:num w:numId="6">
-    <w:abstractNumId w:val="9"/>
-  </w:num>
-  <w:num w:numId="7">
+  <w:num w:numId="8">
     <w:abstractNumId w:val="4"/>
   </w:num>
-  <w:num w:numId="8">
+  <w:num w:numId="9">
     <w:abstractNumId w:val="3"/>
   </w:num>
-  <w:num w:numId="9">
+  <w:num w:numId="10">
     <w:abstractNumId w:val="2"/>
-  </w:num>
-  <w:num w:numId="10">
-    <w:abstractNumId w:val="1"/>
   </w:num>
   <w:num w:numId="11">
     <w:abstractNumId w:val="0"/>
   </w:num>
   <w:num w:numId="12">
+    <w:abstractNumId w:val="14"/>
+  </w:num>
+  <w:num w:numId="13">
+    <w:abstractNumId w:val="15"/>
+  </w:num>
+  <w:num w:numId="14">
     <w:abstractNumId w:val="13"/>
   </w:num>
-  <w:num w:numId="13">
-    <w:abstractNumId w:val="14"/>
+  <w:num w:numId="15">
+    <w:abstractNumId w:val="16"/>
   </w:num>
-  <w:num w:numId="14">
+  <w:num w:numId="16">
     <w:abstractNumId w:val="12"/>
   </w:num>
-  <w:num w:numId="15">
-    <w:abstractNumId w:val="15"/>
-  </w:num>
-  <w:num w:numId="16">
-    <w:abstractNumId w:val="11"/>
+  <w:num w:numId="17">
+    <w:abstractNumId w:val="1"/>
   </w:num>
 </w:numbering>
 </file>

</xml_diff>

<commit_message>
feat: Establish foundational backend, web admin, and mobile app for QR-based event attendance.
</commit_message>
<xml_diff>
--- a/BaoCaoTienDoThucTapTotNghiep.docx
+++ b/BaoCaoTienDoThucTapTotNghiep.docx
@@ -1078,7 +1078,22 @@
     </w:p>
     <w:p>
       <w:pPr>
+        <w:keepNext w:val="0"/>
+        <w:keepLines w:val="0"/>
+        <w:pageBreakBefore w:val="0"/>
+        <w:widowControl/>
+        <w:kinsoku/>
+        <w:wordWrap/>
+        <w:overflowPunct/>
+        <w:topLinePunct w:val="0"/>
+        <w:autoSpaceDE/>
+        <w:autoSpaceDN/>
+        <w:bidi w:val="0"/>
+        <w:adjustRightInd/>
+        <w:snapToGrid/>
+        <w:spacing w:before="120" w:beforeAutospacing="0" w:after="120" w:afterAutospacing="0" w:line="360" w:lineRule="auto"/>
         <w:jc w:val="both"/>
+        <w:textAlignment w:val="auto"/>
         <w:rPr>
           <w:rFonts w:hint="default" w:ascii="Times New Roman" w:hAnsi="Times New Roman" w:cs="Times New Roman"/>
           <w:b/>
@@ -1808,7 +1823,7 @@
       </w:pPr>
       <w:r>
         <w:rPr>
-          <w:rFonts w:hint="default" w:cs="Times New Roman"/>
+          <w:rFonts w:hint="default" w:ascii="Times New Roman" w:hAnsi="Times New Roman" w:cs="Times New Roman"/>
           <w:b/>
           <w:bCs/>
           <w:sz w:val="26"/>
@@ -1848,6 +1863,7 @@
         <w:jc w:val="both"/>
         <w:textAlignment w:val="auto"/>
         <w:rPr>
+          <w:rFonts w:hint="default" w:ascii="Times New Roman" w:hAnsi="Times New Roman" w:cs="Times New Roman"/>
           <w:b w:val="0"/>
           <w:bCs w:val="0"/>
           <w:sz w:val="26"/>
@@ -1856,6 +1872,7 @@
       </w:pPr>
       <w:r>
         <w:rPr>
+          <w:rFonts w:hint="default" w:ascii="Times New Roman" w:hAnsi="Times New Roman" w:cs="Times New Roman"/>
           <w:b w:val="0"/>
           <w:bCs w:val="0"/>
           <w:sz w:val="26"/>
@@ -1894,6 +1911,7 @@
         <w:jc w:val="both"/>
         <w:textAlignment w:val="auto"/>
         <w:rPr>
+          <w:rFonts w:hint="default" w:ascii="Times New Roman" w:hAnsi="Times New Roman" w:cs="Times New Roman"/>
           <w:b w:val="0"/>
           <w:bCs w:val="0"/>
           <w:sz w:val="26"/>
@@ -1902,6 +1920,7 @@
       </w:pPr>
       <w:r>
         <w:rPr>
+          <w:rFonts w:hint="default" w:ascii="Times New Roman" w:hAnsi="Times New Roman" w:cs="Times New Roman"/>
           <w:b w:val="0"/>
           <w:bCs w:val="0"/>
           <w:sz w:val="26"/>
@@ -1940,6 +1959,7 @@
         <w:jc w:val="both"/>
         <w:textAlignment w:val="auto"/>
         <w:rPr>
+          <w:rFonts w:hint="default" w:ascii="Times New Roman" w:hAnsi="Times New Roman" w:cs="Times New Roman"/>
           <w:b w:val="0"/>
           <w:bCs w:val="0"/>
           <w:sz w:val="26"/>
@@ -1948,6 +1968,7 @@
       </w:pPr>
       <w:r>
         <w:rPr>
+          <w:rFonts w:hint="default" w:ascii="Times New Roman" w:hAnsi="Times New Roman" w:cs="Times New Roman"/>
           <w:b w:val="0"/>
           <w:bCs w:val="0"/>
           <w:sz w:val="26"/>
@@ -1986,6 +2007,7 @@
         <w:jc w:val="both"/>
         <w:textAlignment w:val="auto"/>
         <w:rPr>
+          <w:rFonts w:hint="default" w:ascii="Times New Roman" w:hAnsi="Times New Roman" w:cs="Times New Roman"/>
           <w:b w:val="0"/>
           <w:bCs w:val="0"/>
           <w:sz w:val="26"/>
@@ -1994,6 +2016,7 @@
       </w:pPr>
       <w:r>
         <w:rPr>
+          <w:rFonts w:hint="default" w:ascii="Times New Roman" w:hAnsi="Times New Roman" w:cs="Times New Roman"/>
           <w:b w:val="0"/>
           <w:bCs w:val="0"/>
           <w:sz w:val="26"/>
@@ -2032,6 +2055,7 @@
         <w:jc w:val="both"/>
         <w:textAlignment w:val="auto"/>
         <w:rPr>
+          <w:rFonts w:hint="default" w:ascii="Times New Roman" w:hAnsi="Times New Roman" w:cs="Times New Roman"/>
           <w:b w:val="0"/>
           <w:bCs w:val="0"/>
           <w:sz w:val="26"/>
@@ -2040,6 +2064,7 @@
       </w:pPr>
       <w:r>
         <w:rPr>
+          <w:rFonts w:hint="default" w:ascii="Times New Roman" w:hAnsi="Times New Roman" w:cs="Times New Roman"/>
           <w:b w:val="0"/>
           <w:bCs w:val="0"/>
           <w:sz w:val="26"/>
@@ -2050,6 +2075,21 @@
     </w:p>
     <w:p>
       <w:pPr>
+        <w:keepNext w:val="0"/>
+        <w:keepLines w:val="0"/>
+        <w:pageBreakBefore w:val="0"/>
+        <w:widowControl/>
+        <w:kinsoku/>
+        <w:wordWrap/>
+        <w:overflowPunct/>
+        <w:topLinePunct w:val="0"/>
+        <w:autoSpaceDE/>
+        <w:autoSpaceDN/>
+        <w:bidi w:val="0"/>
+        <w:adjustRightInd/>
+        <w:snapToGrid/>
+        <w:spacing w:before="120" w:beforeAutospacing="0" w:after="120" w:afterAutospacing="0" w:line="360" w:lineRule="auto"/>
+        <w:textAlignment w:val="auto"/>
         <w:rPr>
           <w:rFonts w:hint="default" w:ascii="Times New Roman" w:hAnsi="Times New Roman" w:cs="Times New Roman"/>
           <w:b w:val="0"/>
@@ -2107,7 +2147,7 @@
       </w:pPr>
       <w:r>
         <w:rPr>
-          <w:rFonts w:hint="default" w:cs="Times New Roman"/>
+          <w:rFonts w:hint="default" w:ascii="Times New Roman" w:hAnsi="Times New Roman" w:cs="Times New Roman"/>
           <w:b/>
           <w:bCs/>
           <w:sz w:val="26"/>
@@ -2118,7 +2158,7 @@
       </w:r>
       <w:r>
         <w:rPr>
-          <w:rFonts w:hint="default" w:cs="Times New Roman"/>
+          <w:rFonts w:hint="default" w:ascii="Times New Roman" w:hAnsi="Times New Roman" w:cs="Times New Roman"/>
           <w:b/>
           <w:bCs/>
           <w:sz w:val="26"/>
@@ -2129,7 +2169,7 @@
       </w:r>
       <w:r>
         <w:rPr>
-          <w:rFonts w:hint="default" w:cs="Times New Roman"/>
+          <w:rFonts w:hint="default" w:ascii="Times New Roman" w:hAnsi="Times New Roman" w:cs="Times New Roman"/>
           <w:b/>
           <w:bCs/>
           <w:sz w:val="26"/>
@@ -2140,7 +2180,7 @@
       </w:r>
       <w:r>
         <w:rPr>
-          <w:rFonts w:hint="default" w:cs="Times New Roman"/>
+          <w:rFonts w:hint="default" w:ascii="Times New Roman" w:hAnsi="Times New Roman" w:cs="Times New Roman"/>
           <w:b/>
           <w:bCs/>
           <w:sz w:val="26"/>
@@ -2178,6 +2218,7 @@
         <w:ind w:left="597" w:leftChars="201" w:hanging="195" w:hangingChars="75"/>
         <w:textAlignment w:val="auto"/>
         <w:rPr>
+          <w:rFonts w:hint="default" w:ascii="Times New Roman" w:hAnsi="Times New Roman" w:cs="Times New Roman"/>
           <w:b w:val="0"/>
           <w:bCs w:val="0"/>
           <w:sz w:val="26"/>
@@ -2186,6 +2227,7 @@
       </w:pPr>
       <w:r>
         <w:rPr>
+          <w:rFonts w:hint="default" w:ascii="Times New Roman" w:hAnsi="Times New Roman" w:cs="Times New Roman"/>
           <w:b w:val="0"/>
           <w:bCs w:val="0"/>
           <w:sz w:val="26"/>
@@ -2222,6 +2264,7 @@
         <w:ind w:left="597" w:leftChars="201" w:hanging="195" w:hangingChars="75"/>
         <w:textAlignment w:val="auto"/>
         <w:rPr>
+          <w:rFonts w:hint="default" w:ascii="Times New Roman" w:hAnsi="Times New Roman" w:cs="Times New Roman"/>
           <w:b w:val="0"/>
           <w:bCs w:val="0"/>
           <w:sz w:val="26"/>
@@ -2230,6 +2273,7 @@
       </w:pPr>
       <w:r>
         <w:rPr>
+          <w:rFonts w:hint="default" w:ascii="Times New Roman" w:hAnsi="Times New Roman" w:cs="Times New Roman"/>
           <w:b w:val="0"/>
           <w:bCs w:val="0"/>
           <w:sz w:val="26"/>
@@ -2266,6 +2310,7 @@
         <w:ind w:left="597" w:leftChars="201" w:hanging="195" w:hangingChars="75"/>
         <w:textAlignment w:val="auto"/>
         <w:rPr>
+          <w:rFonts w:hint="default" w:ascii="Times New Roman" w:hAnsi="Times New Roman" w:cs="Times New Roman"/>
           <w:b w:val="0"/>
           <w:bCs w:val="0"/>
           <w:sz w:val="26"/>
@@ -2274,6 +2319,7 @@
       </w:pPr>
       <w:r>
         <w:rPr>
+          <w:rFonts w:hint="default" w:ascii="Times New Roman" w:hAnsi="Times New Roman" w:cs="Times New Roman"/>
           <w:b w:val="0"/>
           <w:bCs w:val="0"/>
           <w:sz w:val="26"/>
@@ -2310,6 +2356,7 @@
         <w:ind w:left="597" w:leftChars="201" w:hanging="195" w:hangingChars="75"/>
         <w:textAlignment w:val="auto"/>
         <w:rPr>
+          <w:rFonts w:hint="default" w:ascii="Times New Roman" w:hAnsi="Times New Roman" w:cs="Times New Roman"/>
           <w:b w:val="0"/>
           <w:bCs w:val="0"/>
           <w:sz w:val="26"/>
@@ -2318,6 +2365,7 @@
       </w:pPr>
       <w:r>
         <w:rPr>
+          <w:rFonts w:hint="default" w:ascii="Times New Roman" w:hAnsi="Times New Roman" w:cs="Times New Roman"/>
           <w:b w:val="0"/>
           <w:bCs w:val="0"/>
           <w:sz w:val="26"/>
@@ -2362,7 +2410,7 @@
       </w:pPr>
       <w:r>
         <w:rPr>
-          <w:rFonts w:hint="default" w:cs="Times New Roman"/>
+          <w:rFonts w:hint="default" w:ascii="Times New Roman" w:hAnsi="Times New Roman" w:cs="Times New Roman"/>
           <w:b/>
           <w:bCs/>
           <w:sz w:val="26"/>
@@ -2400,6 +2448,7 @@
         <w:ind w:left="600" w:leftChars="0" w:hanging="200" w:firstLineChars="0"/>
         <w:textAlignment w:val="auto"/>
         <w:rPr>
+          <w:rFonts w:hint="default" w:ascii="Times New Roman" w:hAnsi="Times New Roman" w:cs="Times New Roman"/>
           <w:b w:val="0"/>
           <w:bCs w:val="0"/>
           <w:sz w:val="26"/>
@@ -2408,6 +2457,7 @@
       </w:pPr>
       <w:r>
         <w:rPr>
+          <w:rFonts w:hint="default" w:ascii="Times New Roman" w:hAnsi="Times New Roman" w:cs="Times New Roman"/>
           <w:b w:val="0"/>
           <w:bCs w:val="0"/>
           <w:sz w:val="26"/>
@@ -2418,6 +2468,7 @@
       <w:r>
         <w:rPr>
           <w:rStyle w:val="92"/>
+          <w:rFonts w:hint="default" w:ascii="Times New Roman" w:hAnsi="Times New Roman" w:cs="Times New Roman"/>
           <w:b w:val="0"/>
           <w:bCs w:val="0"/>
           <w:sz w:val="26"/>
@@ -2427,6 +2478,7 @@
       </w:r>
       <w:r>
         <w:rPr>
+          <w:rFonts w:hint="default" w:ascii="Times New Roman" w:hAnsi="Times New Roman" w:cs="Times New Roman"/>
           <w:b w:val="0"/>
           <w:bCs w:val="0"/>
           <w:sz w:val="26"/>
@@ -2463,7 +2515,7 @@
         <w:ind w:left="600" w:leftChars="0" w:hanging="200" w:firstLineChars="0"/>
         <w:textAlignment w:val="auto"/>
         <w:rPr>
-          <w:rFonts w:hint="default"/>
+          <w:rFonts w:hint="default" w:ascii="Times New Roman" w:hAnsi="Times New Roman" w:cs="Times New Roman"/>
           <w:b w:val="0"/>
           <w:bCs w:val="0"/>
           <w:sz w:val="26"/>
@@ -2474,6 +2526,7 @@
       <w:r>
         <w:rPr>
           <w:rStyle w:val="92"/>
+          <w:rFonts w:hint="default" w:ascii="Times New Roman" w:hAnsi="Times New Roman" w:cs="Times New Roman"/>
           <w:b w:val="0"/>
           <w:bCs w:val="0"/>
           <w:sz w:val="26"/>
@@ -2483,6 +2536,7 @@
       </w:r>
       <w:r>
         <w:rPr>
+          <w:rFonts w:hint="default" w:ascii="Times New Roman" w:hAnsi="Times New Roman" w:cs="Times New Roman"/>
           <w:b w:val="0"/>
           <w:bCs w:val="0"/>
           <w:sz w:val="26"/>
@@ -2492,7 +2546,7 @@
       </w:r>
       <w:r>
         <w:rPr>
-          <w:rFonts w:hint="default"/>
+          <w:rFonts w:hint="default" w:ascii="Times New Roman" w:hAnsi="Times New Roman" w:cs="Times New Roman"/>
           <w:b w:val="0"/>
           <w:bCs w:val="0"/>
           <w:sz w:val="26"/>
@@ -2540,6 +2594,7 @@
       </w:pPr>
       <w:r>
         <w:rPr>
+          <w:rFonts w:hint="default" w:ascii="Times New Roman" w:hAnsi="Times New Roman" w:cs="Times New Roman"/>
           <w:b w:val="0"/>
           <w:bCs w:val="0"/>
           <w:sz w:val="26"/>
@@ -2549,7 +2604,7 @@
       </w:r>
       <w:r>
         <w:rPr>
-          <w:rFonts w:hint="default"/>
+          <w:rFonts w:hint="default" w:ascii="Times New Roman" w:hAnsi="Times New Roman" w:cs="Times New Roman"/>
           <w:b w:val="0"/>
           <w:bCs w:val="0"/>
           <w:sz w:val="26"/>
@@ -2594,7 +2649,7 @@
       </w:pPr>
       <w:r>
         <w:rPr>
-          <w:rFonts w:hint="default" w:cs="Times New Roman"/>
+          <w:rFonts w:hint="default" w:ascii="Times New Roman" w:hAnsi="Times New Roman" w:cs="Times New Roman"/>
           <w:b/>
           <w:bCs/>
           <w:sz w:val="26"/>
@@ -2632,6 +2687,7 @@
         <w:ind w:left="600" w:leftChars="0" w:hanging="200" w:firstLineChars="0"/>
         <w:textAlignment w:val="auto"/>
         <w:rPr>
+          <w:rFonts w:hint="default" w:ascii="Times New Roman" w:hAnsi="Times New Roman" w:cs="Times New Roman"/>
           <w:b w:val="0"/>
           <w:bCs w:val="0"/>
           <w:sz w:val="26"/>
@@ -2640,6 +2696,7 @@
       </w:pPr>
       <w:r>
         <w:rPr>
+          <w:rFonts w:hint="default" w:ascii="Times New Roman" w:hAnsi="Times New Roman" w:cs="Times New Roman"/>
           <w:b w:val="0"/>
           <w:bCs w:val="0"/>
           <w:sz w:val="26"/>
@@ -2650,6 +2707,7 @@
       <w:r>
         <w:rPr>
           <w:rStyle w:val="92"/>
+          <w:rFonts w:hint="default" w:ascii="Times New Roman" w:hAnsi="Times New Roman" w:cs="Times New Roman"/>
           <w:b w:val="0"/>
           <w:bCs w:val="0"/>
           <w:sz w:val="26"/>
@@ -2659,6 +2717,7 @@
       </w:r>
       <w:r>
         <w:rPr>
+          <w:rFonts w:hint="default" w:ascii="Times New Roman" w:hAnsi="Times New Roman" w:cs="Times New Roman"/>
           <w:b w:val="0"/>
           <w:bCs w:val="0"/>
           <w:sz w:val="26"/>
@@ -2695,6 +2754,7 @@
         <w:ind w:left="600" w:leftChars="0" w:hanging="200" w:firstLineChars="0"/>
         <w:textAlignment w:val="auto"/>
         <w:rPr>
+          <w:rFonts w:hint="default" w:ascii="Times New Roman" w:hAnsi="Times New Roman" w:cs="Times New Roman"/>
           <w:b w:val="0"/>
           <w:bCs w:val="0"/>
           <w:sz w:val="26"/>
@@ -2703,6 +2763,7 @@
       </w:pPr>
       <w:r>
         <w:rPr>
+          <w:rFonts w:hint="default" w:ascii="Times New Roman" w:hAnsi="Times New Roman" w:cs="Times New Roman"/>
           <w:b w:val="0"/>
           <w:bCs w:val="0"/>
           <w:sz w:val="26"/>
@@ -2713,27 +2774,17 @@
       <w:r>
         <w:rPr>
           <w:rStyle w:val="92"/>
+          <w:rFonts w:hint="default" w:ascii="Times New Roman" w:hAnsi="Times New Roman" w:cs="Times New Roman"/>
           <w:b w:val="0"/>
           <w:bCs w:val="0"/>
           <w:sz w:val="26"/>
           <w:szCs w:val="26"/>
         </w:rPr>
-        <w:t>la</w:t>
-      </w:r>
-      <w:bookmarkStart w:id="0" w:name="_GoBack"/>
-      <w:bookmarkEnd w:id="0"/>
-      <w:r>
-        <w:rPr>
-          <w:rStyle w:val="92"/>
-          <w:b w:val="0"/>
-          <w:bCs w:val="0"/>
-          <w:sz w:val="26"/>
-          <w:szCs w:val="26"/>
-        </w:rPr>
-        <w:t>yout và bố cục hiển thị</w:t>
+        <w:t>layout và bố cục hiển thị</w:t>
       </w:r>
       <w:r>
         <w:rPr>
+          <w:rFonts w:hint="default" w:ascii="Times New Roman" w:hAnsi="Times New Roman" w:cs="Times New Roman"/>
           <w:b w:val="0"/>
           <w:bCs w:val="0"/>
           <w:sz w:val="26"/>
@@ -2770,6 +2821,7 @@
         <w:ind w:left="600" w:leftChars="0" w:hanging="200" w:firstLineChars="0"/>
         <w:textAlignment w:val="auto"/>
         <w:rPr>
+          <w:rFonts w:hint="default" w:ascii="Times New Roman" w:hAnsi="Times New Roman" w:cs="Times New Roman"/>
           <w:b w:val="0"/>
           <w:bCs w:val="0"/>
           <w:sz w:val="26"/>
@@ -2778,6 +2830,7 @@
       </w:pPr>
       <w:r>
         <w:rPr>
+          <w:rFonts w:hint="default" w:ascii="Times New Roman" w:hAnsi="Times New Roman" w:cs="Times New Roman"/>
           <w:b w:val="0"/>
           <w:bCs w:val="0"/>
           <w:sz w:val="26"/>
@@ -2788,6 +2841,7 @@
       <w:r>
         <w:rPr>
           <w:rStyle w:val="92"/>
+          <w:rFonts w:hint="default" w:ascii="Times New Roman" w:hAnsi="Times New Roman" w:cs="Times New Roman"/>
           <w:b w:val="0"/>
           <w:bCs w:val="0"/>
           <w:sz w:val="26"/>
@@ -2797,6 +2851,7 @@
       </w:r>
       <w:r>
         <w:rPr>
+          <w:rFonts w:hint="default" w:ascii="Times New Roman" w:hAnsi="Times New Roman" w:cs="Times New Roman"/>
           <w:b w:val="0"/>
           <w:bCs w:val="0"/>
           <w:sz w:val="26"/>
@@ -2813,7 +2868,8 @@
         <w:pageBreakBefore w:val="0"/>
         <w:widowControl/>
         <w:numPr>
-          <w:numId w:val="0"/>
+          <w:ilvl w:val="0"/>
+          <w:numId w:val="11"/>
         </w:numPr>
         <w:suppressLineNumbers w:val="0"/>
         <w:kinsoku/>
@@ -2826,7 +2882,114 @@
         <w:adjustRightInd/>
         <w:snapToGrid/>
         <w:spacing w:before="120" w:beforeAutospacing="0" w:after="120" w:afterAutospacing="0" w:line="360" w:lineRule="auto"/>
-        <w:ind w:leftChars="0" w:right="0" w:rightChars="0"/>
+        <w:ind w:left="0" w:leftChars="0" w:right="0" w:rightChars="0" w:firstLine="0" w:firstLineChars="0"/>
+        <w:textAlignment w:val="auto"/>
+        <w:rPr>
+          <w:rFonts w:hint="default" w:ascii="Times New Roman" w:hAnsi="Times New Roman" w:cs="Times New Roman"/>
+          <w:b/>
+          <w:bCs/>
+          <w:sz w:val="26"/>
+          <w:szCs w:val="26"/>
+          <w:lang w:val="en-US"/>
+        </w:rPr>
+      </w:pPr>
+      <w:r>
+        <w:rPr>
+          <w:rFonts w:hint="default" w:ascii="Times New Roman" w:hAnsi="Times New Roman" w:cs="Times New Roman"/>
+          <w:b/>
+          <w:bCs/>
+          <w:sz w:val="26"/>
+          <w:szCs w:val="26"/>
+          <w:lang w:val="vi-VN"/>
+        </w:rPr>
+        <w:t>Ngày 8 (14/03/2026)</w:t>
+      </w:r>
+      <w:bookmarkStart w:id="0" w:name="_GoBack"/>
+      <w:bookmarkEnd w:id="0"/>
+    </w:p>
+    <w:p>
+      <w:pPr>
+        <w:pStyle w:val="85"/>
+        <w:keepNext w:val="0"/>
+        <w:keepLines w:val="0"/>
+        <w:pageBreakBefore w:val="0"/>
+        <w:widowControl/>
+        <w:numPr>
+          <w:ilvl w:val="0"/>
+          <w:numId w:val="18"/>
+        </w:numPr>
+        <w:suppressLineNumbers w:val="0"/>
+        <w:tabs>
+          <w:tab w:val="clear" w:pos="420"/>
+        </w:tabs>
+        <w:kinsoku/>
+        <w:wordWrap/>
+        <w:overflowPunct/>
+        <w:topLinePunct w:val="0"/>
+        <w:autoSpaceDE/>
+        <w:autoSpaceDN/>
+        <w:bidi w:val="0"/>
+        <w:adjustRightInd/>
+        <w:snapToGrid/>
+        <w:spacing w:before="120" w:beforeAutospacing="0" w:after="120" w:afterAutospacing="0" w:line="360" w:lineRule="auto"/>
+        <w:ind w:left="600" w:leftChars="0" w:right="0" w:rightChars="0" w:hanging="200" w:firstLineChars="0"/>
+        <w:textAlignment w:val="auto"/>
+        <w:rPr>
+          <w:rFonts w:hint="default" w:ascii="Times New Roman" w:hAnsi="Times New Roman" w:eastAsia="SimSun" w:cs="Times New Roman"/>
+          <w:b w:val="0"/>
+          <w:bCs w:val="0"/>
+          <w:sz w:val="26"/>
+          <w:szCs w:val="26"/>
+        </w:rPr>
+      </w:pPr>
+      <w:r>
+        <w:rPr>
+          <w:rStyle w:val="92"/>
+          <w:rFonts w:hint="default" w:ascii="Times New Roman" w:hAnsi="Times New Roman" w:eastAsia="SimSun" w:cs="Times New Roman"/>
+          <w:b w:val="0"/>
+          <w:bCs w:val="0"/>
+          <w:sz w:val="26"/>
+          <w:szCs w:val="26"/>
+        </w:rPr>
+        <w:t>Triển khai hệ thống điểm danh bằng QR Code</w:t>
+      </w:r>
+      <w:r>
+        <w:rPr>
+          <w:rFonts w:hint="default" w:ascii="Times New Roman" w:hAnsi="Times New Roman" w:eastAsia="SimSun" w:cs="Times New Roman"/>
+          <w:b w:val="0"/>
+          <w:bCs w:val="0"/>
+          <w:sz w:val="26"/>
+          <w:szCs w:val="26"/>
+        </w:rPr>
+        <w:t xml:space="preserve"> và quản lý danh sách tham gia.</w:t>
+      </w:r>
+    </w:p>
+    <w:p>
+      <w:pPr>
+        <w:pStyle w:val="85"/>
+        <w:keepNext w:val="0"/>
+        <w:keepLines w:val="0"/>
+        <w:pageBreakBefore w:val="0"/>
+        <w:widowControl/>
+        <w:numPr>
+          <w:ilvl w:val="0"/>
+          <w:numId w:val="18"/>
+        </w:numPr>
+        <w:suppressLineNumbers w:val="0"/>
+        <w:tabs>
+          <w:tab w:val="clear" w:pos="420"/>
+        </w:tabs>
+        <w:kinsoku/>
+        <w:wordWrap/>
+        <w:overflowPunct/>
+        <w:topLinePunct w:val="0"/>
+        <w:autoSpaceDE/>
+        <w:autoSpaceDN/>
+        <w:bidi w:val="0"/>
+        <w:adjustRightInd/>
+        <w:snapToGrid/>
+        <w:spacing w:before="120" w:beforeAutospacing="0" w:after="120" w:afterAutospacing="0" w:line="360" w:lineRule="auto"/>
+        <w:ind w:left="600" w:leftChars="0" w:hanging="200" w:firstLineChars="0"/>
         <w:textAlignment w:val="auto"/>
         <w:rPr>
           <w:rFonts w:hint="default" w:ascii="Times New Roman" w:hAnsi="Times New Roman" w:cs="Times New Roman"/>
@@ -2834,9 +2997,133 @@
           <w:bCs w:val="0"/>
           <w:sz w:val="26"/>
           <w:szCs w:val="26"/>
+        </w:rPr>
+      </w:pPr>
+      <w:r>
+        <w:rPr>
+          <w:rStyle w:val="92"/>
+          <w:rFonts w:hint="default" w:ascii="Times New Roman" w:hAnsi="Times New Roman" w:cs="Times New Roman"/>
+          <w:b w:val="0"/>
+          <w:bCs w:val="0"/>
+          <w:sz w:val="26"/>
+          <w:szCs w:val="26"/>
+        </w:rPr>
+        <w:t xml:space="preserve">Phát triển </w:t>
+      </w:r>
+      <w:r>
+        <w:rPr>
+          <w:rStyle w:val="92"/>
+          <w:rFonts w:hint="default" w:ascii="Times New Roman" w:hAnsi="Times New Roman" w:cs="Times New Roman"/>
+          <w:b w:val="0"/>
+          <w:bCs w:val="0"/>
+          <w:sz w:val="26"/>
+          <w:szCs w:val="26"/>
+          <w:lang w:val="vi-VN"/>
+        </w:rPr>
+        <w:t xml:space="preserve">lại </w:t>
+      </w:r>
+      <w:r>
+        <w:rPr>
+          <w:rStyle w:val="92"/>
+          <w:rFonts w:hint="default" w:ascii="Times New Roman" w:hAnsi="Times New Roman" w:cs="Times New Roman"/>
+          <w:b w:val="0"/>
+          <w:bCs w:val="0"/>
+          <w:sz w:val="26"/>
+          <w:szCs w:val="26"/>
+        </w:rPr>
+        <w:t>giao diện mobile app cơ bản</w:t>
+      </w:r>
+      <w:r>
+        <w:rPr>
+          <w:rFonts w:hint="default" w:ascii="Times New Roman" w:hAnsi="Times New Roman" w:cs="Times New Roman"/>
+          <w:b w:val="0"/>
+          <w:bCs w:val="0"/>
+          <w:sz w:val="26"/>
+          <w:szCs w:val="26"/>
+        </w:rPr>
+        <w:t>: màn hình login, register và các widget UI ban đầu.</w:t>
+      </w:r>
+    </w:p>
+    <w:p>
+      <w:pPr>
+        <w:pStyle w:val="85"/>
+        <w:keepNext w:val="0"/>
+        <w:keepLines w:val="0"/>
+        <w:pageBreakBefore w:val="0"/>
+        <w:widowControl/>
+        <w:numPr>
+          <w:ilvl w:val="0"/>
+          <w:numId w:val="18"/>
+        </w:numPr>
+        <w:suppressLineNumbers w:val="0"/>
+        <w:tabs>
+          <w:tab w:val="clear" w:pos="420"/>
+        </w:tabs>
+        <w:kinsoku/>
+        <w:wordWrap/>
+        <w:overflowPunct/>
+        <w:topLinePunct w:val="0"/>
+        <w:autoSpaceDE/>
+        <w:autoSpaceDN/>
+        <w:bidi w:val="0"/>
+        <w:adjustRightInd/>
+        <w:snapToGrid/>
+        <w:spacing w:before="120" w:beforeAutospacing="0" w:after="120" w:afterAutospacing="0" w:line="360" w:lineRule="auto"/>
+        <w:ind w:left="600" w:leftChars="0" w:hanging="200" w:firstLineChars="0"/>
+        <w:textAlignment w:val="auto"/>
+        <w:rPr>
+          <w:rFonts w:hint="default" w:ascii="Times New Roman" w:hAnsi="Times New Roman" w:eastAsia="SimSun" w:cs="Times New Roman"/>
+          <w:b/>
+          <w:bCs/>
+          <w:sz w:val="26"/>
+          <w:szCs w:val="26"/>
           <w:lang w:val="en-US"/>
         </w:rPr>
       </w:pPr>
+      <w:r>
+        <w:rPr>
+          <w:rStyle w:val="92"/>
+          <w:rFonts w:hint="default" w:ascii="Times New Roman" w:hAnsi="Times New Roman" w:cs="Times New Roman"/>
+          <w:b w:val="0"/>
+          <w:bCs w:val="0"/>
+          <w:sz w:val="26"/>
+          <w:szCs w:val="26"/>
+        </w:rPr>
+        <w:t xml:space="preserve">Xây dựng </w:t>
+      </w:r>
+      <w:r>
+        <w:rPr>
+          <w:rStyle w:val="92"/>
+          <w:rFonts w:hint="default" w:ascii="Times New Roman" w:hAnsi="Times New Roman" w:cs="Times New Roman"/>
+          <w:b w:val="0"/>
+          <w:bCs w:val="0"/>
+          <w:sz w:val="26"/>
+          <w:szCs w:val="26"/>
+          <w:lang w:val="vi-VN"/>
+        </w:rPr>
+        <w:t xml:space="preserve">lại </w:t>
+      </w:r>
+      <w:r>
+        <w:rPr>
+          <w:rStyle w:val="92"/>
+          <w:rFonts w:hint="default" w:ascii="Times New Roman" w:hAnsi="Times New Roman" w:cs="Times New Roman"/>
+          <w:b w:val="0"/>
+          <w:bCs w:val="0"/>
+          <w:sz w:val="26"/>
+          <w:szCs w:val="26"/>
+        </w:rPr>
+        <w:t>Web Admin Dashboard</w:t>
+      </w:r>
+      <w:r>
+        <w:rPr>
+          <w:rFonts w:hint="default" w:ascii="Times New Roman" w:hAnsi="Times New Roman" w:cs="Times New Roman"/>
+          <w:b w:val="0"/>
+          <w:bCs w:val="0"/>
+          <w:sz w:val="26"/>
+          <w:szCs w:val="26"/>
+        </w:rPr>
+        <w:t>: layout quản trị gồm sidebar, topbar và trang đăng nhập.</w:t>
+      </w:r>
     </w:p>
     <w:sectPr>
       <w:pgSz w:w="11906" w:h="16838"/>
@@ -2863,6 +3150,28 @@
     </w:lvl>
   </w:abstractNum>
   <w:abstractNum w:abstractNumId="1">
+    <w:nsid w:val="A8697E1F"/>
+    <w:multiLevelType w:val="singleLevel"/>
+    <w:tmpl w:val="A8697E1F"/>
+    <w:lvl w:ilvl="0" w:tentative="0">
+      <w:start w:val="1"/>
+      <w:numFmt w:val="bullet"/>
+      <w:lvlText w:val=""/>
+      <w:lvlJc w:val="left"/>
+      <w:pPr>
+        <w:tabs>
+          <w:tab w:val="left" w:pos="420"/>
+        </w:tabs>
+        <w:ind w:left="420" w:leftChars="0" w:hanging="420" w:firstLineChars="0"/>
+      </w:pPr>
+      <w:rPr>
+        <w:rFonts w:hint="default" w:ascii="Wingdings" w:hAnsi="Wingdings"/>
+        <w:sz w:val="16"/>
+        <w:szCs w:val="16"/>
+      </w:rPr>
+    </w:lvl>
+  </w:abstractNum>
+  <w:abstractNum w:abstractNumId="2">
     <w:nsid w:val="BC50E352"/>
     <w:multiLevelType w:val="singleLevel"/>
     <w:tmpl w:val="BC50E352"/>
@@ -2884,7 +3193,7 @@
       </w:rPr>
     </w:lvl>
   </w:abstractNum>
-  <w:abstractNum w:abstractNumId="2">
+  <w:abstractNum w:abstractNumId="3">
     <w:nsid w:val="FFFFFF7C"/>
     <w:multiLevelType w:val="singleLevel"/>
     <w:tmpl w:val="FFFFFF7C"/>
@@ -2902,7 +3211,7 @@
       </w:pPr>
     </w:lvl>
   </w:abstractNum>
-  <w:abstractNum w:abstractNumId="3">
+  <w:abstractNum w:abstractNumId="4">
     <w:nsid w:val="FFFFFF7D"/>
     <w:multiLevelType w:val="singleLevel"/>
     <w:tmpl w:val="FFFFFF7D"/>
@@ -2920,7 +3229,7 @@
       </w:pPr>
     </w:lvl>
   </w:abstractNum>
-  <w:abstractNum w:abstractNumId="4">
+  <w:abstractNum w:abstractNumId="5">
     <w:nsid w:val="FFFFFF7E"/>
     <w:multiLevelType w:val="singleLevel"/>
     <w:tmpl w:val="FFFFFF7E"/>
@@ -2938,7 +3247,7 @@
       </w:pPr>
     </w:lvl>
   </w:abstractNum>
-  <w:abstractNum w:abstractNumId="5">
+  <w:abstractNum w:abstractNumId="6">
     <w:nsid w:val="FFFFFF7F"/>
     <w:multiLevelType w:val="singleLevel"/>
     <w:tmpl w:val="FFFFFF7F"/>
@@ -2956,7 +3265,7 @@
       </w:pPr>
     </w:lvl>
   </w:abstractNum>
-  <w:abstractNum w:abstractNumId="6">
+  <w:abstractNum w:abstractNumId="7">
     <w:nsid w:val="FFFFFF80"/>
     <w:multiLevelType w:val="singleLevel"/>
     <w:tmpl w:val="FFFFFF80"/>
@@ -2977,7 +3286,7 @@
       </w:rPr>
     </w:lvl>
   </w:abstractNum>
-  <w:abstractNum w:abstractNumId="7">
+  <w:abstractNum w:abstractNumId="8">
     <w:nsid w:val="FFFFFF81"/>
     <w:multiLevelType w:val="singleLevel"/>
     <w:tmpl w:val="FFFFFF81"/>
@@ -2998,7 +3307,7 @@
       </w:rPr>
     </w:lvl>
   </w:abstractNum>
-  <w:abstractNum w:abstractNumId="8">
+  <w:abstractNum w:abstractNumId="9">
     <w:nsid w:val="FFFFFF82"/>
     <w:multiLevelType w:val="singleLevel"/>
     <w:tmpl w:val="FFFFFF82"/>
@@ -3019,7 +3328,7 @@
       </w:rPr>
     </w:lvl>
   </w:abstractNum>
-  <w:abstractNum w:abstractNumId="9">
+  <w:abstractNum w:abstractNumId="10">
     <w:nsid w:val="FFFFFF83"/>
     <w:multiLevelType w:val="singleLevel"/>
     <w:tmpl w:val="FFFFFF83"/>
@@ -3040,7 +3349,7 @@
       </w:rPr>
     </w:lvl>
   </w:abstractNum>
-  <w:abstractNum w:abstractNumId="10">
+  <w:abstractNum w:abstractNumId="11">
     <w:nsid w:val="FFFFFF88"/>
     <w:multiLevelType w:val="singleLevel"/>
     <w:tmpl w:val="FFFFFF88"/>
@@ -3058,7 +3367,7 @@
       </w:pPr>
     </w:lvl>
   </w:abstractNum>
-  <w:abstractNum w:abstractNumId="11">
+  <w:abstractNum w:abstractNumId="12">
     <w:nsid w:val="FFFFFF89"/>
     <w:multiLevelType w:val="singleLevel"/>
     <w:tmpl w:val="FFFFFF89"/>
@@ -3079,7 +3388,7 @@
       </w:rPr>
     </w:lvl>
   </w:abstractNum>
-  <w:abstractNum w:abstractNumId="12">
+  <w:abstractNum w:abstractNumId="13">
     <w:nsid w:val="0BD6F2A8"/>
     <w:multiLevelType w:val="singleLevel"/>
     <w:tmpl w:val="0BD6F2A8"/>
@@ -3101,7 +3410,7 @@
       </w:rPr>
     </w:lvl>
   </w:abstractNum>
-  <w:abstractNum w:abstractNumId="13">
+  <w:abstractNum w:abstractNumId="14">
     <w:nsid w:val="36852227"/>
     <w:multiLevelType w:val="singleLevel"/>
     <w:tmpl w:val="36852227"/>
@@ -3123,7 +3432,7 @@
       </w:rPr>
     </w:lvl>
   </w:abstractNum>
-  <w:abstractNum w:abstractNumId="14">
+  <w:abstractNum w:abstractNumId="15">
     <w:nsid w:val="4CD697B2"/>
     <w:multiLevelType w:val="singleLevel"/>
     <w:tmpl w:val="4CD697B2"/>
@@ -3145,7 +3454,7 @@
       </w:rPr>
     </w:lvl>
   </w:abstractNum>
-  <w:abstractNum w:abstractNumId="15">
+  <w:abstractNum w:abstractNumId="16">
     <w:nsid w:val="6027A911"/>
     <w:multiLevelType w:val="singleLevel"/>
     <w:tmpl w:val="6027A911"/>
@@ -3167,7 +3476,7 @@
       </w:rPr>
     </w:lvl>
   </w:abstractNum>
-  <w:abstractNum w:abstractNumId="16">
+  <w:abstractNum w:abstractNumId="17">
     <w:nsid w:val="6D9679EE"/>
     <w:multiLevelType w:val="singleLevel"/>
     <w:tmpl w:val="6D9679EE"/>
@@ -3190,54 +3499,57 @@
     </w:lvl>
   </w:abstractNum>
   <w:num w:numId="1">
+    <w:abstractNumId w:val="12"/>
+  </w:num>
+  <w:num w:numId="2">
+    <w:abstractNumId w:val="10"/>
+  </w:num>
+  <w:num w:numId="3">
+    <w:abstractNumId w:val="9"/>
+  </w:num>
+  <w:num w:numId="4">
+    <w:abstractNumId w:val="8"/>
+  </w:num>
+  <w:num w:numId="5">
+    <w:abstractNumId w:val="7"/>
+  </w:num>
+  <w:num w:numId="6">
     <w:abstractNumId w:val="11"/>
   </w:num>
-  <w:num w:numId="2">
-    <w:abstractNumId w:val="9"/>
-  </w:num>
-  <w:num w:numId="3">
-    <w:abstractNumId w:val="8"/>
-  </w:num>
-  <w:num w:numId="4">
-    <w:abstractNumId w:val="7"/>
-  </w:num>
-  <w:num w:numId="5">
+  <w:num w:numId="7">
     <w:abstractNumId w:val="6"/>
   </w:num>
-  <w:num w:numId="6">
-    <w:abstractNumId w:val="10"/>
-  </w:num>
-  <w:num w:numId="7">
+  <w:num w:numId="8">
     <w:abstractNumId w:val="5"/>
   </w:num>
-  <w:num w:numId="8">
+  <w:num w:numId="9">
     <w:abstractNumId w:val="4"/>
   </w:num>
-  <w:num w:numId="9">
+  <w:num w:numId="10">
     <w:abstractNumId w:val="3"/>
-  </w:num>
-  <w:num w:numId="10">
-    <w:abstractNumId w:val="2"/>
   </w:num>
   <w:num w:numId="11">
     <w:abstractNumId w:val="0"/>
   </w:num>
   <w:num w:numId="12">
+    <w:abstractNumId w:val="15"/>
+  </w:num>
+  <w:num w:numId="13">
+    <w:abstractNumId w:val="16"/>
+  </w:num>
+  <w:num w:numId="14">
     <w:abstractNumId w:val="14"/>
   </w:num>
-  <w:num w:numId="13">
-    <w:abstractNumId w:val="15"/>
+  <w:num w:numId="15">
+    <w:abstractNumId w:val="17"/>
   </w:num>
-  <w:num w:numId="14">
+  <w:num w:numId="16">
     <w:abstractNumId w:val="13"/>
   </w:num>
-  <w:num w:numId="15">
-    <w:abstractNumId w:val="16"/>
+  <w:num w:numId="17">
+    <w:abstractNumId w:val="2"/>
   </w:num>
-  <w:num w:numId="16">
-    <w:abstractNumId w:val="12"/>
-  </w:num>
-  <w:num w:numId="17">
+  <w:num w:numId="18">
     <w:abstractNumId w:val="1"/>
   </w:num>
 </w:numbering>

</xml_diff>